<commit_message>
Perbarui semua dokumen dengan eksperimen latih di data asli
- Laporan UAS: subbab 4.5 baru (tabel, grafik, pembahasan), skenario
  evaluasi, ringkasan data, kesimpulan dan saran
- Proposal UTS: sumber data, skenario evaluasi, hasil awal
- Slide UAS: slide baru "Latih & uji hanya dengan data asli" (22 slide)
- Slide UTS: slide data, skenario evaluasi (4 langkah), hasil awal
- LAPORAN.md, README, dan panduan pengumpulan disesuaikan
</commit_message>
<xml_diff>
--- a/docs/tugas/UAS_Laporan_Akhir_Kelompok6_A11.4502.docx
+++ b/docs/tugas/UAS_Laporan_Akhir_Kelompok6_A11.4502.docx
@@ -1374,7 +1374,7 @@
         <w:t xml:space="preserve">3.7 Rancangan Aplikasi</w:t>
       </w:r>
       <w:r>
-        <w:t xml:space="preserve">	15</w:t>
+        <w:t xml:space="preserve">	16</w:t>
       </w:r>
     </w:p>
     <w:p>
@@ -1488,7 +1488,7 @@
         <w:t xml:space="preserve">4.4 Hasil Tugas B: S-Rank dalam 10 Pull</w:t>
       </w:r>
       <w:r>
-        <w:t xml:space="preserve">	21</w:t>
+        <w:t xml:space="preserve">	22</w:t>
       </w:r>
     </w:p>
     <w:p>
@@ -1504,10 +1504,29 @@
           <w:b w:val="false"/>
           <w:bCs w:val="false"/>
         </w:rPr>
-        <w:t xml:space="preserve">4.5 Pembahasan</w:t>
+        <w:t xml:space="preserve">4.5 Hasil Latih dan Uji dengan Data Asli Saja</w:t>
       </w:r>
       <w:r>
         <w:t xml:space="preserve">	23</w:t>
+      </w:r>
+    </w:p>
+    <w:p>
+      <w:pPr>
+        <w:tabs>
+          <w:tab w:val="right" w:pos="7938" w:leader="dot"/>
+        </w:tabs>
+        <w:spacing w:after="40" w:line="300"/>
+        <w:ind w:left="440"/>
+      </w:pPr>
+      <w:r>
+        <w:rPr>
+          <w:b w:val="false"/>
+          <w:bCs w:val="false"/>
+        </w:rPr>
+        <w:t xml:space="preserve">4.6 Pembahasan</w:t>
+      </w:r>
+      <w:r>
+        <w:t xml:space="preserve">	25</w:t>
       </w:r>
     </w:p>
     <w:p>
@@ -1526,7 +1545,7 @@
         <w:t xml:space="preserve">BAB V PENUTUP</w:t>
       </w:r>
       <w:r>
-        <w:t xml:space="preserve">	25</w:t>
+        <w:t xml:space="preserve">	27</w:t>
       </w:r>
     </w:p>
     <w:p>
@@ -1545,7 +1564,7 @@
         <w:t xml:space="preserve">5.1 Kesimpulan</w:t>
       </w:r>
       <w:r>
-        <w:t xml:space="preserve">	25</w:t>
+        <w:t xml:space="preserve">	27</w:t>
       </w:r>
     </w:p>
     <w:p>
@@ -1564,7 +1583,7 @@
         <w:t xml:space="preserve">5.2 Saran</w:t>
       </w:r>
       <w:r>
-        <w:t xml:space="preserve">	25</w:t>
+        <w:t xml:space="preserve">	27</w:t>
       </w:r>
     </w:p>
     <w:p>
@@ -1583,7 +1602,7 @@
         <w:t xml:space="preserve">DAFTAR PUSTAKA</w:t>
       </w:r>
       <w:r>
-        <w:t xml:space="preserve">	26</w:t>
+        <w:t xml:space="preserve">	28</w:t>
       </w:r>
     </w:p>
     <w:p>
@@ -1602,7 +1621,7 @@
         <w:t xml:space="preserve">LAMPIRAN</w:t>
       </w:r>
       <w:r>
-        <w:t xml:space="preserve">	27</w:t>
+        <w:t xml:space="preserve">	29</w:t>
       </w:r>
     </w:p>
     <w:p>
@@ -4920,7 +4939,7 @@
                 <w:sz w:val="20"/>
                 <w:szCs w:val="20"/>
               </w:rPr>
-              <w:t xml:space="preserve">Data uji tambahan (tidak dipakai melatih)</w:t>
+              <w:t xml:space="preserve">Uji model simulasi, dan eksperimen latih–uji dengan data asli saja</w:t>
             </w:r>
           </w:p>
         </w:tc>
@@ -4935,6 +4954,26 @@
       </w:pPr>
       <w:r>
         <w:t xml:space="preserve">Simulasi dipakai karena riwayat satu akun hanya berisi ratusan pull dengan sedikit S-Rank, sehingga tidak cukup untuk melatih model. Data asli dipakai untuk menguji apakah model yang dilatih dari simulasi tetap berlaku untuk pemain sungguhan.</w:t>
+      </w:r>
+    </w:p>
+    <w:p>
+      <w:pPr>
+        <w:spacing w:after="120" w:line="360"/>
+        <w:ind w:firstLine="709"/>
+        <w:jc w:val="both"/>
+      </w:pPr>
+      <w:r>
+        <w:t xml:space="preserve">Selain itu, sebagai eksperimen kedua, keenam algoritma juga dilatih dan diuji </w:t>
+      </w:r>
+      <w:r>
+        <w:rPr>
+          <w:b/>
+          <w:bCs/>
+        </w:rPr>
+        <w:t xml:space="preserve">hanya dengan data asli</w:t>
+      </w:r>
+      <w:r>
+        <w:t xml:space="preserve"> (1.192 baris setelah pembersihan). Eksperimen ini memastikan bahwa hasil perbandingan tidak bergantung pada data simulasi, dan jumlah barisnya sudah memenuhi ketentuan dataset tabel minimal 500–1.000 baris.</w:t>
       </w:r>
     </w:p>
     <w:p>
@@ -6212,6 +6251,37 @@
       </w:r>
       <w:r>
         <w:t xml:space="preserve"> yang tidak pernah dipakai saat pelatihan.</w:t>
+      </w:r>
+    </w:p>
+    <w:p>
+      <w:pPr>
+        <w:pStyle w:val="ListParagraph"/>
+        <w:numPr>
+          <w:ilvl w:val="0"/>
+          <w:numId w:val="3"/>
+        </w:numPr>
+        <w:spacing w:after="60" w:line="360"/>
+        <w:jc w:val="both"/>
+      </w:pPr>
+      <w:r>
+        <w:rPr>
+          <w:b/>
+          <w:bCs/>
+        </w:rPr>
+        <w:t xml:space="preserve">Eksperimen kedua:</w:t>
+      </w:r>
+      <w:r>
+        <w:t xml:space="preserve"> keenam algoritma dilatih dan diuji hanya dengan data asli (±1.200 baris) memakai GroupKFold 5-fold yang dibagi per </w:t>
+      </w:r>
+      <w:r>
+        <w:rPr>
+          <w:b/>
+          <w:bCs/>
+        </w:rPr>
+        <w:t xml:space="preserve">siklus pity</w:t>
+      </w:r>
+      <w:r>
+        <w:t xml:space="preserve"> (20 siklus). Pembagian per siklus dipakai karena data asli hanya berasal dari 2 akun, dan siklus pity saling bebas karena peluang selalu kembali ke awal setelah mendapat S-Rank.</w:t>
       </w:r>
     </w:p>
     <w:p>
@@ -7060,7 +7130,7 @@
       <w:r>
         <w:drawing>
           <wp:inline distT="0" distB="0" distL="0" distR="0">
-            <wp:extent cx="2895600" cy="6667500"/>
+            <wp:extent cx="2905125" cy="6667500"/>
             <wp:effectExtent t="0" r="0" b="0" l="0"/>
             <wp:docPr id="7" name="app_perb_test.png" descr="Halaman Perbandingan Algoritma" title="Halaman Perbandingan Algoritma"/>
             <wp:cNvGraphicFramePr>
@@ -7085,7 +7155,7 @@
                   <pic:spPr bwMode="auto">
                     <a:xfrm>
                       <a:off x="0" y="0"/>
-                      <a:ext cx="2895600" cy="6667500"/>
+                      <a:ext cx="2905125" cy="6667500"/>
                     </a:xfrm>
                     <a:prstGeom prst="rect">
                       <a:avLst/>
@@ -7831,6 +7901,98 @@
                 <w:szCs w:val="20"/>
               </w:rPr>
               <w:t xml:space="preserve">– / 1.192</w:t>
+            </w:r>
+          </w:p>
+        </w:tc>
+      </w:tr>
+      <w:tr>
+        <w:tc>
+          <w:tcPr>
+            <w:tcW w:type="dxa" w:w="3651"/>
+            <w:tcBorders>
+              <w:top w:val="single" w:color="808080" w:sz="4"/>
+              <w:left w:val="single" w:color="808080" w:sz="4"/>
+              <w:bottom w:val="single" w:color="808080" w:sz="4"/>
+              <w:right w:val="single" w:color="808080" w:sz="4"/>
+            </w:tcBorders>
+            <w:tcMar>
+              <w:top w:type="dxa" w:w="60"/>
+              <w:left w:type="dxa" w:w="100"/>
+              <w:bottom w:type="dxa" w:w="60"/>
+              <w:right w:type="dxa" w:w="100"/>
+            </w:tcMar>
+          </w:tcPr>
+          <w:p>
+            <w:pPr>
+              <w:spacing w:line="276"/>
+              <w:jc w:val="left"/>
+            </w:pPr>
+            <w:r>
+              <w:rPr>
+                <w:sz w:val="20"/>
+                <w:szCs w:val="20"/>
+              </w:rPr>
+              <w:t xml:space="preserve">Eksperimen latih–uji data asli (tugas B)</w:t>
+            </w:r>
+          </w:p>
+        </w:tc>
+        <w:tc>
+          <w:tcPr>
+            <w:tcW w:type="dxa" w:w="2143"/>
+            <w:tcBorders>
+              <w:top w:val="single" w:color="808080" w:sz="4"/>
+              <w:left w:val="single" w:color="808080" w:sz="4"/>
+              <w:bottom w:val="single" w:color="808080" w:sz="4"/>
+              <w:right w:val="single" w:color="808080" w:sz="4"/>
+            </w:tcBorders>
+            <w:tcMar>
+              <w:top w:type="dxa" w:w="60"/>
+              <w:left w:type="dxa" w:w="100"/>
+              <w:bottom w:type="dxa" w:w="60"/>
+              <w:right w:type="dxa" w:w="100"/>
+            </w:tcMar>
+          </w:tcPr>
+          <w:p>
+            <w:pPr>
+              <w:spacing w:line="276"/>
+              <w:jc w:val="center"/>
+            </w:pPr>
+            <w:r>
+              <w:rPr>
+                <w:sz w:val="20"/>
+                <w:szCs w:val="20"/>
+              </w:rPr>
+              <w:t xml:space="preserve">–</w:t>
+            </w:r>
+          </w:p>
+        </w:tc>
+        <w:tc>
+          <w:tcPr>
+            <w:tcW w:type="dxa" w:w="2144"/>
+            <w:tcBorders>
+              <w:top w:val="single" w:color="808080" w:sz="4"/>
+              <w:left w:val="single" w:color="808080" w:sz="4"/>
+              <w:bottom w:val="single" w:color="808080" w:sz="4"/>
+              <w:right w:val="single" w:color="808080" w:sz="4"/>
+            </w:tcBorders>
+            <w:tcMar>
+              <w:top w:type="dxa" w:w="60"/>
+              <w:left w:type="dxa" w:w="100"/>
+              <w:bottom w:type="dxa" w:w="60"/>
+              <w:right w:type="dxa" w:w="100"/>
+            </w:tcMar>
+          </w:tcPr>
+          <w:p>
+            <w:pPr>
+              <w:spacing w:line="276"/>
+              <w:jc w:val="center"/>
+            </w:pPr>
+            <w:r>
+              <w:rPr>
+                <w:sz w:val="20"/>
+                <w:szCs w:val="20"/>
+              </w:rPr>
+              <w:t xml:space="preserve">1.192 baris, 20 siklus, 5-fold</w:t>
             </w:r>
           </w:p>
         </w:tc>
@@ -11495,156 +11657,1738 @@
         <w:spacing w:after="120" w:before="240" w:line="360"/>
       </w:pPr>
       <w:r>
-        <w:t xml:space="preserve">4.5 Pembahasan</w:t>
-      </w:r>
-    </w:p>
-    <w:p>
-      <w:pPr>
-        <w:pStyle w:val="ListParagraph"/>
-        <w:numPr>
-          <w:ilvl w:val="0"/>
-          <w:numId w:val="6"/>
-        </w:numPr>
-        <w:spacing w:after="60" w:line="360"/>
+        <w:t xml:space="preserve">4.5 Hasil Latih dan Uji dengan Data Asli Saja</w:t>
+      </w:r>
+    </w:p>
+    <w:p>
+      <w:pPr>
+        <w:spacing w:after="120" w:line="360"/>
+        <w:ind w:firstLine="709"/>
         <w:jc w:val="both"/>
       </w:pPr>
+      <w:r>
+        <w:t xml:space="preserve">Pada eksperimen kedua, keenam algoritma dilatih dan diuji </w:t>
+      </w:r>
       <w:r>
         <w:rPr>
           <w:b/>
           <w:bCs/>
         </w:rPr>
-        <w:t xml:space="preserve">Jebakan akurasi.</w:t>
-      </w:r>
-      <w:r>
-        <w:t xml:space="preserve"> Pada tugas A, baseline sudah mencapai akurasi 98,28%. Akurasi saja tidak dapat dipakai untuk menilai model pada data yang sangat tidak seimbang, sehingga diperlukan Balanced Accuracy, F1-score, ROC-AUC, dan Log Loss.</w:t>
-      </w:r>
-    </w:p>
-    <w:p>
-      <w:pPr>
-        <w:pStyle w:val="ListParagraph"/>
-        <w:numPr>
-          <w:ilvl w:val="0"/>
-          <w:numId w:val="6"/>
-        </w:numPr>
-        <w:spacing w:after="60" w:line="360"/>
-        <w:jc w:val="both"/>
+        <w:t xml:space="preserve">hanya dengan data asli</w:t>
+      </w:r>
+      <w:r>
+        <w:t xml:space="preserve"> (2 akun, 1.192 baris, 161 kelas positif pada tugas B). Data dibagi per siklus pity menjadi 5 bagian (GroupKFold 5-fold, 20 siklus), sehingga pull dari satu siklus tidak pernah berada di data latih dan data uji sekaligus. Hasilnya ditunjukkan pada Tabel 4.4 dan Gambar 4.8.</w:t>
+      </w:r>
+    </w:p>
+    <w:p>
+      <w:pPr>
+        <w:keepNext/>
+        <w:keepLines/>
+        <w:spacing w:after="60" w:before="120"/>
+        <w:jc w:val="center"/>
       </w:pPr>
       <w:r>
         <w:rPr>
           <w:b/>
           <w:bCs/>
         </w:rPr>
-        <w:t xml:space="preserve">Algoritma terbaik.</w:t>
-      </w:r>
-      <w:r>
-        <w:t xml:space="preserve"> Pada tugas B, Decision Tree, Random Forest, XGBoost, dan KNN mencapai akurasi ±91,1% di simulasi dan ±93,3–93,5% di data asli. Nilai ini setara dengan batas teori Markov Chain, sehingga keempat algoritma tersebut sudah bekerja maksimal.</w:t>
-      </w:r>
-    </w:p>
-    <w:p>
-      <w:pPr>
-        <w:pStyle w:val="ListParagraph"/>
-        <w:numPr>
-          <w:ilvl w:val="0"/>
-          <w:numId w:val="6"/>
-        </w:numPr>
-        <w:spacing w:after="60" w:line="360"/>
-        <w:jc w:val="both"/>
-      </w:pPr>
-      <w:r>
-        <w:rPr>
-          <w:b/>
-          <w:bCs/>
-        </w:rPr>
-        <w:t xml:space="preserve">Model pohon menemukan soft pity sendiri.</w:t>
-      </w:r>
-      <w:r>
-        <w:t xml:space="preserve"> Aturan Decision Tree memisahkan data di sekitar pity_ratio 0,71–0,74, yaitu sekitar 10 pull sebelum soft pity, tepat saat jendela 10 pull ke depan mulai menyentuh soft pity. Model tidak pernah diberi tahu tentang soft pity (Gambar 4.8).</w:t>
-      </w:r>
-    </w:p>
-    <w:p>
-      <w:pPr>
-        <w:pStyle w:val="ListParagraph"/>
-        <w:numPr>
-          <w:ilvl w:val="0"/>
-          <w:numId w:val="6"/>
-        </w:numPr>
-        <w:spacing w:after="60" w:line="360"/>
-        <w:jc w:val="both"/>
-      </w:pPr>
-      <w:r>
-        <w:rPr>
-          <w:b/>
-          <w:bCs/>
-        </w:rPr>
-        <w:t xml:space="preserve">Logistic Regression dan Naive Bayes kalah.</w:t>
-      </w:r>
-      <w:r>
-        <w:t xml:space="preserve"> Logistic Regression hanya dapat membentuk kurva sigmoid yang halus sehingga tidak bisa meniru lonjakan tajam setelah soft pity. Naive Bayes mengasumsikan fitur saling bebas dan berdistribusi normal, padahal pity dan pity_ratio sangat berkaitan; akibatnya Log Loss-nya paling besar.</w:t>
-      </w:r>
-    </w:p>
-    <w:p>
-      <w:pPr>
-        <w:pStyle w:val="ListParagraph"/>
-        <w:numPr>
-          <w:ilvl w:val="0"/>
-          <w:numId w:val="6"/>
-        </w:numPr>
-        <w:spacing w:after="60" w:line="360"/>
-        <w:jc w:val="both"/>
-      </w:pPr>
-      <w:r>
-        <w:rPr>
-          <w:b/>
-          <w:bCs/>
-        </w:rPr>
-        <w:t xml:space="preserve">KNN setara model pohon</w:t>
-      </w:r>
-      <w:r>
-        <w:t xml:space="preserve"> karena fiturnya sedikit dan nilainya berulang, sehingga tetangga terdekat praktis adalah pull dengan pity yang sama. Kelemahannya, KNN menyimpan seluruh data latih dan paling lambat saat prediksi.</w:t>
-      </w:r>
-    </w:p>
-    <w:p>
-      <w:pPr>
-        <w:pStyle w:val="ListParagraph"/>
-        <w:numPr>
-          <w:ilvl w:val="0"/>
-          <w:numId w:val="6"/>
-        </w:numPr>
-        <w:spacing w:after="60" w:line="360"/>
-        <w:jc w:val="both"/>
-      </w:pPr>
-      <w:r>
-        <w:rPr>
-          <w:b/>
-          <w:bCs/>
-        </w:rPr>
-        <w:t xml:space="preserve">Fitur guaranteed hampir tidak berpengaruh</w:t>
-      </w:r>
-      <w:r>
-        <w:t xml:space="preserve"> (Gambar 4.9). Hal ini sesuai aturan permainan: guaranteed hanya menentukan S-Rank mana yang keluar, bukan kapan S-Rank keluar.</w:t>
-      </w:r>
-    </w:p>
-    <w:p>
-      <w:pPr>
-        <w:pStyle w:val="ListParagraph"/>
-        <w:numPr>
-          <w:ilvl w:val="0"/>
-          <w:numId w:val="6"/>
-        </w:numPr>
-        <w:spacing w:after="60" w:line="360"/>
-        <w:jc w:val="both"/>
-      </w:pPr>
-      <w:r>
-        <w:rPr>
-          <w:b/>
-          <w:bCs/>
-        </w:rPr>
-        <w:t xml:space="preserve">Konsisten pada data asli.</w:t>
-      </w:r>
-      <w:r>
-        <w:t xml:space="preserve"> Urutan kinerja algoritma pada data asli sama dengan pada simulasi. Artinya, asumsi soft pity yang dipakai simulasi sesuai dengan perilaku gacha sungguhan.</w:t>
-      </w:r>
-    </w:p>
+        <w:t xml:space="preserve">Tabel 4.4</w:t>
+      </w:r>
+      <w:r>
+        <w:t xml:space="preserve"> Hasil latih–uji dengan data asli saja, tugas B (rata-rata 5-fold)</w:t>
+      </w:r>
+    </w:p>
+    <w:tbl>
+      <w:tblPr>
+        <w:tblW w:type="dxa" w:w="7938"/>
+        <w:tblBorders>
+          <w:top w:val="single" w:color="auto" w:sz="4"/>
+          <w:left w:val="single" w:color="auto" w:sz="4"/>
+          <w:bottom w:val="single" w:color="auto" w:sz="4"/>
+          <w:right w:val="single" w:color="auto" w:sz="4"/>
+          <w:insideH w:val="single" w:color="auto" w:sz="4"/>
+          <w:insideV w:val="single" w:color="auto" w:sz="4"/>
+        </w:tblBorders>
+      </w:tblPr>
+      <w:tblGrid>
+        <w:gridCol w:w="2381"/>
+        <w:gridCol w:w="1588"/>
+        <w:gridCol w:w="953"/>
+        <w:gridCol w:w="953"/>
+        <w:gridCol w:w="1032"/>
+        <w:gridCol w:w="1031"/>
+      </w:tblGrid>
+      <w:tr>
+        <w:trPr>
+          <w:tblHeader/>
+        </w:trPr>
+        <w:tc>
+          <w:tcPr>
+            <w:tcW w:type="dxa" w:w="2381"/>
+            <w:tcBorders>
+              <w:top w:val="single" w:color="808080" w:sz="4"/>
+              <w:left w:val="single" w:color="808080" w:sz="4"/>
+              <w:bottom w:val="single" w:color="808080" w:sz="4"/>
+              <w:right w:val="single" w:color="808080" w:sz="4"/>
+            </w:tcBorders>
+            <w:shd w:fill="D9E2F3" w:color="auto" w:val="clear"/>
+            <w:tcMar>
+              <w:top w:type="dxa" w:w="60"/>
+              <w:left w:type="dxa" w:w="100"/>
+              <w:bottom w:type="dxa" w:w="60"/>
+              <w:right w:type="dxa" w:w="100"/>
+            </w:tcMar>
+          </w:tcPr>
+          <w:p>
+            <w:pPr>
+              <w:spacing w:line="276"/>
+              <w:jc w:val="left"/>
+            </w:pPr>
+            <w:r>
+              <w:rPr>
+                <w:b/>
+                <w:bCs/>
+                <w:sz w:val="19"/>
+                <w:szCs w:val="19"/>
+              </w:rPr>
+              <w:t xml:space="preserve">Model</w:t>
+            </w:r>
+          </w:p>
+        </w:tc>
+        <w:tc>
+          <w:tcPr>
+            <w:tcW w:type="dxa" w:w="1588"/>
+            <w:tcBorders>
+              <w:top w:val="single" w:color="808080" w:sz="4"/>
+              <w:left w:val="single" w:color="808080" w:sz="4"/>
+              <w:bottom w:val="single" w:color="808080" w:sz="4"/>
+              <w:right w:val="single" w:color="808080" w:sz="4"/>
+            </w:tcBorders>
+            <w:shd w:fill="D9E2F3" w:color="auto" w:val="clear"/>
+            <w:tcMar>
+              <w:top w:type="dxa" w:w="60"/>
+              <w:left w:type="dxa" w:w="100"/>
+              <w:bottom w:type="dxa" w:w="60"/>
+              <w:right w:type="dxa" w:w="100"/>
+            </w:tcMar>
+          </w:tcPr>
+          <w:p>
+            <w:pPr>
+              <w:spacing w:line="276"/>
+              <w:jc w:val="center"/>
+            </w:pPr>
+            <w:r>
+              <w:rPr>
+                <w:b/>
+                <w:bCs/>
+                <w:sz w:val="19"/>
+                <w:szCs w:val="19"/>
+              </w:rPr>
+              <w:t xml:space="preserve">Accuracy</w:t>
+            </w:r>
+          </w:p>
+        </w:tc>
+        <w:tc>
+          <w:tcPr>
+            <w:tcW w:type="dxa" w:w="953"/>
+            <w:tcBorders>
+              <w:top w:val="single" w:color="808080" w:sz="4"/>
+              <w:left w:val="single" w:color="808080" w:sz="4"/>
+              <w:bottom w:val="single" w:color="808080" w:sz="4"/>
+              <w:right w:val="single" w:color="808080" w:sz="4"/>
+            </w:tcBorders>
+            <w:shd w:fill="D9E2F3" w:color="auto" w:val="clear"/>
+            <w:tcMar>
+              <w:top w:type="dxa" w:w="60"/>
+              <w:left w:type="dxa" w:w="100"/>
+              <w:bottom w:type="dxa" w:w="60"/>
+              <w:right w:type="dxa" w:w="100"/>
+            </w:tcMar>
+          </w:tcPr>
+          <w:p>
+            <w:pPr>
+              <w:spacing w:line="276"/>
+              <w:jc w:val="center"/>
+            </w:pPr>
+            <w:r>
+              <w:rPr>
+                <w:b/>
+                <w:bCs/>
+                <w:sz w:val="19"/>
+                <w:szCs w:val="19"/>
+              </w:rPr>
+              <w:t xml:space="preserve">Bal. Acc.</w:t>
+            </w:r>
+          </w:p>
+        </w:tc>
+        <w:tc>
+          <w:tcPr>
+            <w:tcW w:type="dxa" w:w="953"/>
+            <w:tcBorders>
+              <w:top w:val="single" w:color="808080" w:sz="4"/>
+              <w:left w:val="single" w:color="808080" w:sz="4"/>
+              <w:bottom w:val="single" w:color="808080" w:sz="4"/>
+              <w:right w:val="single" w:color="808080" w:sz="4"/>
+            </w:tcBorders>
+            <w:shd w:fill="D9E2F3" w:color="auto" w:val="clear"/>
+            <w:tcMar>
+              <w:top w:type="dxa" w:w="60"/>
+              <w:left w:type="dxa" w:w="100"/>
+              <w:bottom w:type="dxa" w:w="60"/>
+              <w:right w:type="dxa" w:w="100"/>
+            </w:tcMar>
+          </w:tcPr>
+          <w:p>
+            <w:pPr>
+              <w:spacing w:line="276"/>
+              <w:jc w:val="center"/>
+            </w:pPr>
+            <w:r>
+              <w:rPr>
+                <w:b/>
+                <w:bCs/>
+                <w:sz w:val="19"/>
+                <w:szCs w:val="19"/>
+              </w:rPr>
+              <w:t xml:space="preserve">F1</w:t>
+            </w:r>
+          </w:p>
+        </w:tc>
+        <w:tc>
+          <w:tcPr>
+            <w:tcW w:type="dxa" w:w="1032"/>
+            <w:tcBorders>
+              <w:top w:val="single" w:color="808080" w:sz="4"/>
+              <w:left w:val="single" w:color="808080" w:sz="4"/>
+              <w:bottom w:val="single" w:color="808080" w:sz="4"/>
+              <w:right w:val="single" w:color="808080" w:sz="4"/>
+            </w:tcBorders>
+            <w:shd w:fill="D9E2F3" w:color="auto" w:val="clear"/>
+            <w:tcMar>
+              <w:top w:type="dxa" w:w="60"/>
+              <w:left w:type="dxa" w:w="100"/>
+              <w:bottom w:type="dxa" w:w="60"/>
+              <w:right w:type="dxa" w:w="100"/>
+            </w:tcMar>
+          </w:tcPr>
+          <w:p>
+            <w:pPr>
+              <w:spacing w:line="276"/>
+              <w:jc w:val="center"/>
+            </w:pPr>
+            <w:r>
+              <w:rPr>
+                <w:b/>
+                <w:bCs/>
+                <w:sz w:val="19"/>
+                <w:szCs w:val="19"/>
+              </w:rPr>
+              <w:t xml:space="preserve">ROC-AUC</w:t>
+            </w:r>
+          </w:p>
+        </w:tc>
+        <w:tc>
+          <w:tcPr>
+            <w:tcW w:type="dxa" w:w="1031"/>
+            <w:tcBorders>
+              <w:top w:val="single" w:color="808080" w:sz="4"/>
+              <w:left w:val="single" w:color="808080" w:sz="4"/>
+              <w:bottom w:val="single" w:color="808080" w:sz="4"/>
+              <w:right w:val="single" w:color="808080" w:sz="4"/>
+            </w:tcBorders>
+            <w:shd w:fill="D9E2F3" w:color="auto" w:val="clear"/>
+            <w:tcMar>
+              <w:top w:type="dxa" w:w="60"/>
+              <w:left w:type="dxa" w:w="100"/>
+              <w:bottom w:type="dxa" w:w="60"/>
+              <w:right w:type="dxa" w:w="100"/>
+            </w:tcMar>
+          </w:tcPr>
+          <w:p>
+            <w:pPr>
+              <w:spacing w:line="276"/>
+              <w:jc w:val="center"/>
+            </w:pPr>
+            <w:r>
+              <w:rPr>
+                <w:b/>
+                <w:bCs/>
+                <w:sz w:val="19"/>
+                <w:szCs w:val="19"/>
+              </w:rPr>
+              <w:t xml:space="preserve">Log Loss</w:t>
+            </w:r>
+          </w:p>
+        </w:tc>
+      </w:tr>
+      <w:tr>
+        <w:tc>
+          <w:tcPr>
+            <w:tcW w:type="dxa" w:w="2381"/>
+            <w:tcBorders>
+              <w:top w:val="single" w:color="808080" w:sz="4"/>
+              <w:left w:val="single" w:color="808080" w:sz="4"/>
+              <w:bottom w:val="single" w:color="808080" w:sz="4"/>
+              <w:right w:val="single" w:color="808080" w:sz="4"/>
+            </w:tcBorders>
+            <w:tcMar>
+              <w:top w:type="dxa" w:w="60"/>
+              <w:left w:type="dxa" w:w="100"/>
+              <w:bottom w:type="dxa" w:w="60"/>
+              <w:right w:type="dxa" w:w="100"/>
+            </w:tcMar>
+          </w:tcPr>
+          <w:p>
+            <w:pPr>
+              <w:spacing w:line="276"/>
+              <w:jc w:val="left"/>
+            </w:pPr>
+            <w:r>
+              <w:rPr>
+                <w:sz w:val="19"/>
+                <w:szCs w:val="19"/>
+              </w:rPr>
+              <w:t xml:space="preserve">Baseline (selalu "tidak S")</w:t>
+            </w:r>
+          </w:p>
+        </w:tc>
+        <w:tc>
+          <w:tcPr>
+            <w:tcW w:type="dxa" w:w="1588"/>
+            <w:tcBorders>
+              <w:top w:val="single" w:color="808080" w:sz="4"/>
+              <w:left w:val="single" w:color="808080" w:sz="4"/>
+              <w:bottom w:val="single" w:color="808080" w:sz="4"/>
+              <w:right w:val="single" w:color="808080" w:sz="4"/>
+            </w:tcBorders>
+            <w:tcMar>
+              <w:top w:type="dxa" w:w="60"/>
+              <w:left w:type="dxa" w:w="100"/>
+              <w:bottom w:type="dxa" w:w="60"/>
+              <w:right w:type="dxa" w:w="100"/>
+            </w:tcMar>
+          </w:tcPr>
+          <w:p>
+            <w:pPr>
+              <w:spacing w:line="276"/>
+              <w:jc w:val="center"/>
+            </w:pPr>
+            <w:r>
+              <w:rPr>
+                <w:sz w:val="19"/>
+                <w:szCs w:val="19"/>
+              </w:rPr>
+              <w:t xml:space="preserve">0,8639 ± 0,0334</w:t>
+            </w:r>
+          </w:p>
+        </w:tc>
+        <w:tc>
+          <w:tcPr>
+            <w:tcW w:type="dxa" w:w="953"/>
+            <w:tcBorders>
+              <w:top w:val="single" w:color="808080" w:sz="4"/>
+              <w:left w:val="single" w:color="808080" w:sz="4"/>
+              <w:bottom w:val="single" w:color="808080" w:sz="4"/>
+              <w:right w:val="single" w:color="808080" w:sz="4"/>
+            </w:tcBorders>
+            <w:tcMar>
+              <w:top w:type="dxa" w:w="60"/>
+              <w:left w:type="dxa" w:w="100"/>
+              <w:bottom w:type="dxa" w:w="60"/>
+              <w:right w:type="dxa" w:w="100"/>
+            </w:tcMar>
+          </w:tcPr>
+          <w:p>
+            <w:pPr>
+              <w:spacing w:line="276"/>
+              <w:jc w:val="center"/>
+            </w:pPr>
+            <w:r>
+              <w:rPr>
+                <w:sz w:val="19"/>
+                <w:szCs w:val="19"/>
+              </w:rPr>
+              <w:t xml:space="preserve">0,5000</w:t>
+            </w:r>
+          </w:p>
+        </w:tc>
+        <w:tc>
+          <w:tcPr>
+            <w:tcW w:type="dxa" w:w="953"/>
+            <w:tcBorders>
+              <w:top w:val="single" w:color="808080" w:sz="4"/>
+              <w:left w:val="single" w:color="808080" w:sz="4"/>
+              <w:bottom w:val="single" w:color="808080" w:sz="4"/>
+              <w:right w:val="single" w:color="808080" w:sz="4"/>
+            </w:tcBorders>
+            <w:tcMar>
+              <w:top w:type="dxa" w:w="60"/>
+              <w:left w:type="dxa" w:w="100"/>
+              <w:bottom w:type="dxa" w:w="60"/>
+              <w:right w:type="dxa" w:w="100"/>
+            </w:tcMar>
+          </w:tcPr>
+          <w:p>
+            <w:pPr>
+              <w:spacing w:line="276"/>
+              <w:jc w:val="center"/>
+            </w:pPr>
+            <w:r>
+              <w:rPr>
+                <w:sz w:val="19"/>
+                <w:szCs w:val="19"/>
+              </w:rPr>
+              <w:t xml:space="preserve">0,0000</w:t>
+            </w:r>
+          </w:p>
+        </w:tc>
+        <w:tc>
+          <w:tcPr>
+            <w:tcW w:type="dxa" w:w="1032"/>
+            <w:tcBorders>
+              <w:top w:val="single" w:color="808080" w:sz="4"/>
+              <w:left w:val="single" w:color="808080" w:sz="4"/>
+              <w:bottom w:val="single" w:color="808080" w:sz="4"/>
+              <w:right w:val="single" w:color="808080" w:sz="4"/>
+            </w:tcBorders>
+            <w:tcMar>
+              <w:top w:type="dxa" w:w="60"/>
+              <w:left w:type="dxa" w:w="100"/>
+              <w:bottom w:type="dxa" w:w="60"/>
+              <w:right w:type="dxa" w:w="100"/>
+            </w:tcMar>
+          </w:tcPr>
+          <w:p>
+            <w:pPr>
+              <w:spacing w:line="276"/>
+              <w:jc w:val="center"/>
+            </w:pPr>
+            <w:r>
+              <w:rPr>
+                <w:sz w:val="19"/>
+                <w:szCs w:val="19"/>
+              </w:rPr>
+              <w:t xml:space="preserve">0,5000</w:t>
+            </w:r>
+          </w:p>
+        </w:tc>
+        <w:tc>
+          <w:tcPr>
+            <w:tcW w:type="dxa" w:w="1031"/>
+            <w:tcBorders>
+              <w:top w:val="single" w:color="808080" w:sz="4"/>
+              <w:left w:val="single" w:color="808080" w:sz="4"/>
+              <w:bottom w:val="single" w:color="808080" w:sz="4"/>
+              <w:right w:val="single" w:color="808080" w:sz="4"/>
+            </w:tcBorders>
+            <w:tcMar>
+              <w:top w:type="dxa" w:w="60"/>
+              <w:left w:type="dxa" w:w="100"/>
+              <w:bottom w:type="dxa" w:w="60"/>
+              <w:right w:type="dxa" w:w="100"/>
+            </w:tcMar>
+          </w:tcPr>
+          <w:p>
+            <w:pPr>
+              <w:spacing w:line="276"/>
+              <w:jc w:val="center"/>
+            </w:pPr>
+            <w:r>
+              <w:rPr>
+                <w:sz w:val="19"/>
+                <w:szCs w:val="19"/>
+              </w:rPr>
+              <w:t xml:space="preserve">2,1940</w:t>
+            </w:r>
+          </w:p>
+        </w:tc>
+      </w:tr>
+      <w:tr>
+        <w:tc>
+          <w:tcPr>
+            <w:tcW w:type="dxa" w:w="2381"/>
+            <w:tcBorders>
+              <w:top w:val="single" w:color="808080" w:sz="4"/>
+              <w:left w:val="single" w:color="808080" w:sz="4"/>
+              <w:bottom w:val="single" w:color="808080" w:sz="4"/>
+              <w:right w:val="single" w:color="808080" w:sz="4"/>
+            </w:tcBorders>
+            <w:tcMar>
+              <w:top w:type="dxa" w:w="60"/>
+              <w:left w:type="dxa" w:w="100"/>
+              <w:bottom w:type="dxa" w:w="60"/>
+              <w:right w:type="dxa" w:w="100"/>
+            </w:tcMar>
+          </w:tcPr>
+          <w:p>
+            <w:pPr>
+              <w:spacing w:line="276"/>
+              <w:jc w:val="left"/>
+            </w:pPr>
+            <w:r>
+              <w:rPr>
+                <w:sz w:val="19"/>
+                <w:szCs w:val="19"/>
+              </w:rPr>
+              <w:t xml:space="preserve">Markov Chain (teori)</w:t>
+            </w:r>
+          </w:p>
+        </w:tc>
+        <w:tc>
+          <w:tcPr>
+            <w:tcW w:type="dxa" w:w="1588"/>
+            <w:tcBorders>
+              <w:top w:val="single" w:color="808080" w:sz="4"/>
+              <w:left w:val="single" w:color="808080" w:sz="4"/>
+              <w:bottom w:val="single" w:color="808080" w:sz="4"/>
+              <w:right w:val="single" w:color="808080" w:sz="4"/>
+            </w:tcBorders>
+            <w:tcMar>
+              <w:top w:type="dxa" w:w="60"/>
+              <w:left w:type="dxa" w:w="100"/>
+              <w:bottom w:type="dxa" w:w="60"/>
+              <w:right w:type="dxa" w:w="100"/>
+            </w:tcMar>
+          </w:tcPr>
+          <w:p>
+            <w:pPr>
+              <w:spacing w:line="276"/>
+              <w:jc w:val="center"/>
+            </w:pPr>
+            <w:r>
+              <w:rPr>
+                <w:sz w:val="19"/>
+                <w:szCs w:val="19"/>
+              </w:rPr>
+              <w:t xml:space="preserve">0,9356 ± 0,0303</w:t>
+            </w:r>
+          </w:p>
+        </w:tc>
+        <w:tc>
+          <w:tcPr>
+            <w:tcW w:type="dxa" w:w="953"/>
+            <w:tcBorders>
+              <w:top w:val="single" w:color="808080" w:sz="4"/>
+              <w:left w:val="single" w:color="808080" w:sz="4"/>
+              <w:bottom w:val="single" w:color="808080" w:sz="4"/>
+              <w:right w:val="single" w:color="808080" w:sz="4"/>
+            </w:tcBorders>
+            <w:tcMar>
+              <w:top w:type="dxa" w:w="60"/>
+              <w:left w:type="dxa" w:w="100"/>
+              <w:bottom w:type="dxa" w:w="60"/>
+              <w:right w:type="dxa" w:w="100"/>
+            </w:tcMar>
+          </w:tcPr>
+          <w:p>
+            <w:pPr>
+              <w:spacing w:line="276"/>
+              <w:jc w:val="center"/>
+            </w:pPr>
+            <w:r>
+              <w:rPr>
+                <w:sz w:val="19"/>
+                <w:szCs w:val="19"/>
+              </w:rPr>
+              <w:t xml:space="preserve">0,7873</w:t>
+            </w:r>
+          </w:p>
+        </w:tc>
+        <w:tc>
+          <w:tcPr>
+            <w:tcW w:type="dxa" w:w="953"/>
+            <w:tcBorders>
+              <w:top w:val="single" w:color="808080" w:sz="4"/>
+              <w:left w:val="single" w:color="808080" w:sz="4"/>
+              <w:bottom w:val="single" w:color="808080" w:sz="4"/>
+              <w:right w:val="single" w:color="808080" w:sz="4"/>
+            </w:tcBorders>
+            <w:tcMar>
+              <w:top w:type="dxa" w:w="60"/>
+              <w:left w:type="dxa" w:w="100"/>
+              <w:bottom w:type="dxa" w:w="60"/>
+              <w:right w:type="dxa" w:w="100"/>
+            </w:tcMar>
+          </w:tcPr>
+          <w:p>
+            <w:pPr>
+              <w:spacing w:line="276"/>
+              <w:jc w:val="center"/>
+            </w:pPr>
+            <w:r>
+              <w:rPr>
+                <w:sz w:val="19"/>
+                <w:szCs w:val="19"/>
+              </w:rPr>
+              <w:t xml:space="preserve">0,6952</w:t>
+            </w:r>
+          </w:p>
+        </w:tc>
+        <w:tc>
+          <w:tcPr>
+            <w:tcW w:type="dxa" w:w="1032"/>
+            <w:tcBorders>
+              <w:top w:val="single" w:color="808080" w:sz="4"/>
+              <w:left w:val="single" w:color="808080" w:sz="4"/>
+              <w:bottom w:val="single" w:color="808080" w:sz="4"/>
+              <w:right w:val="single" w:color="808080" w:sz="4"/>
+            </w:tcBorders>
+            <w:tcMar>
+              <w:top w:type="dxa" w:w="60"/>
+              <w:left w:type="dxa" w:w="100"/>
+              <w:bottom w:type="dxa" w:w="60"/>
+              <w:right w:type="dxa" w:w="100"/>
+            </w:tcMar>
+          </w:tcPr>
+          <w:p>
+            <w:pPr>
+              <w:spacing w:line="276"/>
+              <w:jc w:val="center"/>
+            </w:pPr>
+            <w:r>
+              <w:rPr>
+                <w:sz w:val="19"/>
+                <w:szCs w:val="19"/>
+              </w:rPr>
+              <w:t xml:space="preserve">0,8160</w:t>
+            </w:r>
+          </w:p>
+        </w:tc>
+        <w:tc>
+          <w:tcPr>
+            <w:tcW w:type="dxa" w:w="1031"/>
+            <w:tcBorders>
+              <w:top w:val="single" w:color="808080" w:sz="4"/>
+              <w:left w:val="single" w:color="808080" w:sz="4"/>
+              <w:bottom w:val="single" w:color="808080" w:sz="4"/>
+              <w:right w:val="single" w:color="808080" w:sz="4"/>
+            </w:tcBorders>
+            <w:tcMar>
+              <w:top w:type="dxa" w:w="60"/>
+              <w:left w:type="dxa" w:w="100"/>
+              <w:bottom w:type="dxa" w:w="60"/>
+              <w:right w:type="dxa" w:w="100"/>
+            </w:tcMar>
+          </w:tcPr>
+          <w:p>
+            <w:pPr>
+              <w:spacing w:line="276"/>
+              <w:jc w:val="center"/>
+            </w:pPr>
+            <w:r>
+              <w:rPr>
+                <w:sz w:val="19"/>
+                <w:szCs w:val="19"/>
+              </w:rPr>
+              <w:t xml:space="preserve">0,2318</w:t>
+            </w:r>
+          </w:p>
+        </w:tc>
+      </w:tr>
+      <w:tr>
+        <w:tc>
+          <w:tcPr>
+            <w:tcW w:type="dxa" w:w="2381"/>
+            <w:tcBorders>
+              <w:top w:val="single" w:color="808080" w:sz="4"/>
+              <w:left w:val="single" w:color="808080" w:sz="4"/>
+              <w:bottom w:val="single" w:color="808080" w:sz="4"/>
+              <w:right w:val="single" w:color="808080" w:sz="4"/>
+            </w:tcBorders>
+            <w:tcMar>
+              <w:top w:type="dxa" w:w="60"/>
+              <w:left w:type="dxa" w:w="100"/>
+              <w:bottom w:type="dxa" w:w="60"/>
+              <w:right w:type="dxa" w:w="100"/>
+            </w:tcMar>
+          </w:tcPr>
+          <w:p>
+            <w:pPr>
+              <w:spacing w:line="276"/>
+              <w:jc w:val="left"/>
+            </w:pPr>
+            <w:r>
+              <w:rPr>
+                <w:sz w:val="19"/>
+                <w:szCs w:val="19"/>
+              </w:rPr>
+              <w:t xml:space="preserve">Naive Bayes</w:t>
+            </w:r>
+          </w:p>
+        </w:tc>
+        <w:tc>
+          <w:tcPr>
+            <w:tcW w:type="dxa" w:w="1588"/>
+            <w:tcBorders>
+              <w:top w:val="single" w:color="808080" w:sz="4"/>
+              <w:left w:val="single" w:color="808080" w:sz="4"/>
+              <w:bottom w:val="single" w:color="808080" w:sz="4"/>
+              <w:right w:val="single" w:color="808080" w:sz="4"/>
+            </w:tcBorders>
+            <w:tcMar>
+              <w:top w:type="dxa" w:w="60"/>
+              <w:left w:type="dxa" w:w="100"/>
+              <w:bottom w:type="dxa" w:w="60"/>
+              <w:right w:type="dxa" w:w="100"/>
+            </w:tcMar>
+          </w:tcPr>
+          <w:p>
+            <w:pPr>
+              <w:spacing w:line="276"/>
+              <w:jc w:val="center"/>
+            </w:pPr>
+            <w:r>
+              <w:rPr>
+                <w:sz w:val="19"/>
+                <w:szCs w:val="19"/>
+              </w:rPr>
+              <w:t xml:space="preserve">0,8798 ± 0,0296</w:t>
+            </w:r>
+          </w:p>
+        </w:tc>
+        <w:tc>
+          <w:tcPr>
+            <w:tcW w:type="dxa" w:w="953"/>
+            <w:tcBorders>
+              <w:top w:val="single" w:color="808080" w:sz="4"/>
+              <w:left w:val="single" w:color="808080" w:sz="4"/>
+              <w:bottom w:val="single" w:color="808080" w:sz="4"/>
+              <w:right w:val="single" w:color="808080" w:sz="4"/>
+            </w:tcBorders>
+            <w:tcMar>
+              <w:top w:type="dxa" w:w="60"/>
+              <w:left w:type="dxa" w:w="100"/>
+              <w:bottom w:type="dxa" w:w="60"/>
+              <w:right w:type="dxa" w:w="100"/>
+            </w:tcMar>
+          </w:tcPr>
+          <w:p>
+            <w:pPr>
+              <w:spacing w:line="276"/>
+              <w:jc w:val="center"/>
+            </w:pPr>
+            <w:r>
+              <w:rPr>
+                <w:b/>
+                <w:bCs/>
+                <w:sz w:val="19"/>
+                <w:szCs w:val="19"/>
+              </w:rPr>
+              <w:t xml:space="preserve">0,8368</w:t>
+            </w:r>
+          </w:p>
+        </w:tc>
+        <w:tc>
+          <w:tcPr>
+            <w:tcW w:type="dxa" w:w="953"/>
+            <w:tcBorders>
+              <w:top w:val="single" w:color="808080" w:sz="4"/>
+              <w:left w:val="single" w:color="808080" w:sz="4"/>
+              <w:bottom w:val="single" w:color="808080" w:sz="4"/>
+              <w:right w:val="single" w:color="808080" w:sz="4"/>
+            </w:tcBorders>
+            <w:tcMar>
+              <w:top w:type="dxa" w:w="60"/>
+              <w:left w:type="dxa" w:w="100"/>
+              <w:bottom w:type="dxa" w:w="60"/>
+              <w:right w:type="dxa" w:w="100"/>
+            </w:tcMar>
+          </w:tcPr>
+          <w:p>
+            <w:pPr>
+              <w:spacing w:line="276"/>
+              <w:jc w:val="center"/>
+            </w:pPr>
+            <w:r>
+              <w:rPr>
+                <w:sz w:val="19"/>
+                <w:szCs w:val="19"/>
+              </w:rPr>
+              <w:t xml:space="preserve">0,6257</w:t>
+            </w:r>
+          </w:p>
+        </w:tc>
+        <w:tc>
+          <w:tcPr>
+            <w:tcW w:type="dxa" w:w="1032"/>
+            <w:tcBorders>
+              <w:top w:val="single" w:color="808080" w:sz="4"/>
+              <w:left w:val="single" w:color="808080" w:sz="4"/>
+              <w:bottom w:val="single" w:color="808080" w:sz="4"/>
+              <w:right w:val="single" w:color="808080" w:sz="4"/>
+            </w:tcBorders>
+            <w:tcMar>
+              <w:top w:type="dxa" w:w="60"/>
+              <w:left w:type="dxa" w:w="100"/>
+              <w:bottom w:type="dxa" w:w="60"/>
+              <w:right w:type="dxa" w:w="100"/>
+            </w:tcMar>
+          </w:tcPr>
+          <w:p>
+            <w:pPr>
+              <w:spacing w:line="276"/>
+              <w:jc w:val="center"/>
+            </w:pPr>
+            <w:r>
+              <w:rPr>
+                <w:sz w:val="19"/>
+                <w:szCs w:val="19"/>
+              </w:rPr>
+              <w:t xml:space="preserve">0,9049</w:t>
+            </w:r>
+          </w:p>
+        </w:tc>
+        <w:tc>
+          <w:tcPr>
+            <w:tcW w:type="dxa" w:w="1031"/>
+            <w:tcBorders>
+              <w:top w:val="single" w:color="808080" w:sz="4"/>
+              <w:left w:val="single" w:color="808080" w:sz="4"/>
+              <w:bottom w:val="single" w:color="808080" w:sz="4"/>
+              <w:right w:val="single" w:color="808080" w:sz="4"/>
+            </w:tcBorders>
+            <w:tcMar>
+              <w:top w:type="dxa" w:w="60"/>
+              <w:left w:type="dxa" w:w="100"/>
+              <w:bottom w:type="dxa" w:w="60"/>
+              <w:right w:type="dxa" w:w="100"/>
+            </w:tcMar>
+          </w:tcPr>
+          <w:p>
+            <w:pPr>
+              <w:spacing w:line="276"/>
+              <w:jc w:val="center"/>
+            </w:pPr>
+            <w:r>
+              <w:rPr>
+                <w:sz w:val="19"/>
+                <w:szCs w:val="19"/>
+              </w:rPr>
+              <w:t xml:space="preserve">0,3673</w:t>
+            </w:r>
+          </w:p>
+        </w:tc>
+      </w:tr>
+      <w:tr>
+        <w:tc>
+          <w:tcPr>
+            <w:tcW w:type="dxa" w:w="2381"/>
+            <w:tcBorders>
+              <w:top w:val="single" w:color="808080" w:sz="4"/>
+              <w:left w:val="single" w:color="808080" w:sz="4"/>
+              <w:bottom w:val="single" w:color="808080" w:sz="4"/>
+              <w:right w:val="single" w:color="808080" w:sz="4"/>
+            </w:tcBorders>
+            <w:tcMar>
+              <w:top w:type="dxa" w:w="60"/>
+              <w:left w:type="dxa" w:w="100"/>
+              <w:bottom w:type="dxa" w:w="60"/>
+              <w:right w:type="dxa" w:w="100"/>
+            </w:tcMar>
+          </w:tcPr>
+          <w:p>
+            <w:pPr>
+              <w:spacing w:line="276"/>
+              <w:jc w:val="left"/>
+            </w:pPr>
+            <w:r>
+              <w:rPr>
+                <w:sz w:val="19"/>
+                <w:szCs w:val="19"/>
+              </w:rPr>
+              <w:t xml:space="preserve">KNN</w:t>
+            </w:r>
+          </w:p>
+        </w:tc>
+        <w:tc>
+          <w:tcPr>
+            <w:tcW w:type="dxa" w:w="1588"/>
+            <w:tcBorders>
+              <w:top w:val="single" w:color="808080" w:sz="4"/>
+              <w:left w:val="single" w:color="808080" w:sz="4"/>
+              <w:bottom w:val="single" w:color="808080" w:sz="4"/>
+              <w:right w:val="single" w:color="808080" w:sz="4"/>
+            </w:tcBorders>
+            <w:tcMar>
+              <w:top w:type="dxa" w:w="60"/>
+              <w:left w:type="dxa" w:w="100"/>
+              <w:bottom w:type="dxa" w:w="60"/>
+              <w:right w:type="dxa" w:w="100"/>
+            </w:tcMar>
+          </w:tcPr>
+          <w:p>
+            <w:pPr>
+              <w:spacing w:line="276"/>
+              <w:jc w:val="center"/>
+            </w:pPr>
+            <w:r>
+              <w:rPr>
+                <w:sz w:val="19"/>
+                <w:szCs w:val="19"/>
+              </w:rPr>
+              <w:t xml:space="preserve">0,8741 ± 0,0287</w:t>
+            </w:r>
+          </w:p>
+        </w:tc>
+        <w:tc>
+          <w:tcPr>
+            <w:tcW w:type="dxa" w:w="953"/>
+            <w:tcBorders>
+              <w:top w:val="single" w:color="808080" w:sz="4"/>
+              <w:left w:val="single" w:color="808080" w:sz="4"/>
+              <w:bottom w:val="single" w:color="808080" w:sz="4"/>
+              <w:right w:val="single" w:color="808080" w:sz="4"/>
+            </w:tcBorders>
+            <w:tcMar>
+              <w:top w:type="dxa" w:w="60"/>
+              <w:left w:type="dxa" w:w="100"/>
+              <w:bottom w:type="dxa" w:w="60"/>
+              <w:right w:type="dxa" w:w="100"/>
+            </w:tcMar>
+          </w:tcPr>
+          <w:p>
+            <w:pPr>
+              <w:spacing w:line="276"/>
+              <w:jc w:val="center"/>
+            </w:pPr>
+            <w:r>
+              <w:rPr>
+                <w:sz w:val="19"/>
+                <w:szCs w:val="19"/>
+              </w:rPr>
+              <w:t xml:space="preserve">0,5300</w:t>
+            </w:r>
+          </w:p>
+        </w:tc>
+        <w:tc>
+          <w:tcPr>
+            <w:tcW w:type="dxa" w:w="953"/>
+            <w:tcBorders>
+              <w:top w:val="single" w:color="808080" w:sz="4"/>
+              <w:left w:val="single" w:color="808080" w:sz="4"/>
+              <w:bottom w:val="single" w:color="808080" w:sz="4"/>
+              <w:right w:val="single" w:color="808080" w:sz="4"/>
+            </w:tcBorders>
+            <w:tcMar>
+              <w:top w:type="dxa" w:w="60"/>
+              <w:left w:type="dxa" w:w="100"/>
+              <w:bottom w:type="dxa" w:w="60"/>
+              <w:right w:type="dxa" w:w="100"/>
+            </w:tcMar>
+          </w:tcPr>
+          <w:p>
+            <w:pPr>
+              <w:spacing w:line="276"/>
+              <w:jc w:val="center"/>
+            </w:pPr>
+            <w:r>
+              <w:rPr>
+                <w:sz w:val="19"/>
+                <w:szCs w:val="19"/>
+              </w:rPr>
+              <w:t xml:space="preserve">0,0923</w:t>
+            </w:r>
+          </w:p>
+        </w:tc>
+        <w:tc>
+          <w:tcPr>
+            <w:tcW w:type="dxa" w:w="1032"/>
+            <w:tcBorders>
+              <w:top w:val="single" w:color="808080" w:sz="4"/>
+              <w:left w:val="single" w:color="808080" w:sz="4"/>
+              <w:bottom w:val="single" w:color="808080" w:sz="4"/>
+              <w:right w:val="single" w:color="808080" w:sz="4"/>
+            </w:tcBorders>
+            <w:tcMar>
+              <w:top w:type="dxa" w:w="60"/>
+              <w:left w:type="dxa" w:w="100"/>
+              <w:bottom w:type="dxa" w:w="60"/>
+              <w:right w:type="dxa" w:w="100"/>
+            </w:tcMar>
+          </w:tcPr>
+          <w:p>
+            <w:pPr>
+              <w:spacing w:line="276"/>
+              <w:jc w:val="center"/>
+            </w:pPr>
+            <w:r>
+              <w:rPr>
+                <w:sz w:val="19"/>
+                <w:szCs w:val="19"/>
+              </w:rPr>
+              <w:t xml:space="preserve">0,8762</w:t>
+            </w:r>
+          </w:p>
+        </w:tc>
+        <w:tc>
+          <w:tcPr>
+            <w:tcW w:type="dxa" w:w="1031"/>
+            <w:tcBorders>
+              <w:top w:val="single" w:color="808080" w:sz="4"/>
+              <w:left w:val="single" w:color="808080" w:sz="4"/>
+              <w:bottom w:val="single" w:color="808080" w:sz="4"/>
+              <w:right w:val="single" w:color="808080" w:sz="4"/>
+            </w:tcBorders>
+            <w:tcMar>
+              <w:top w:type="dxa" w:w="60"/>
+              <w:left w:type="dxa" w:w="100"/>
+              <w:bottom w:type="dxa" w:w="60"/>
+              <w:right w:type="dxa" w:w="100"/>
+            </w:tcMar>
+          </w:tcPr>
+          <w:p>
+            <w:pPr>
+              <w:spacing w:line="276"/>
+              <w:jc w:val="center"/>
+            </w:pPr>
+            <w:r>
+              <w:rPr>
+                <w:sz w:val="19"/>
+                <w:szCs w:val="19"/>
+              </w:rPr>
+              <w:t xml:space="preserve">0,4909</w:t>
+            </w:r>
+          </w:p>
+        </w:tc>
+      </w:tr>
+      <w:tr>
+        <w:tc>
+          <w:tcPr>
+            <w:tcW w:type="dxa" w:w="2381"/>
+            <w:tcBorders>
+              <w:top w:val="single" w:color="808080" w:sz="4"/>
+              <w:left w:val="single" w:color="808080" w:sz="4"/>
+              <w:bottom w:val="single" w:color="808080" w:sz="4"/>
+              <w:right w:val="single" w:color="808080" w:sz="4"/>
+            </w:tcBorders>
+            <w:tcMar>
+              <w:top w:type="dxa" w:w="60"/>
+              <w:left w:type="dxa" w:w="100"/>
+              <w:bottom w:type="dxa" w:w="60"/>
+              <w:right w:type="dxa" w:w="100"/>
+            </w:tcMar>
+          </w:tcPr>
+          <w:p>
+            <w:pPr>
+              <w:spacing w:line="276"/>
+              <w:jc w:val="left"/>
+            </w:pPr>
+            <w:r>
+              <w:rPr>
+                <w:sz w:val="19"/>
+                <w:szCs w:val="19"/>
+              </w:rPr>
+              <w:t xml:space="preserve">Logistic Regression</w:t>
+            </w:r>
+          </w:p>
+        </w:tc>
+        <w:tc>
+          <w:tcPr>
+            <w:tcW w:type="dxa" w:w="1588"/>
+            <w:tcBorders>
+              <w:top w:val="single" w:color="808080" w:sz="4"/>
+              <w:left w:val="single" w:color="808080" w:sz="4"/>
+              <w:bottom w:val="single" w:color="808080" w:sz="4"/>
+              <w:right w:val="single" w:color="808080" w:sz="4"/>
+            </w:tcBorders>
+            <w:tcMar>
+              <w:top w:type="dxa" w:w="60"/>
+              <w:left w:type="dxa" w:w="100"/>
+              <w:bottom w:type="dxa" w:w="60"/>
+              <w:right w:type="dxa" w:w="100"/>
+            </w:tcMar>
+          </w:tcPr>
+          <w:p>
+            <w:pPr>
+              <w:spacing w:line="276"/>
+              <w:jc w:val="center"/>
+            </w:pPr>
+            <w:r>
+              <w:rPr>
+                <w:sz w:val="19"/>
+                <w:szCs w:val="19"/>
+              </w:rPr>
+              <w:t xml:space="preserve">0,9101 ± 0,0447</w:t>
+            </w:r>
+          </w:p>
+        </w:tc>
+        <w:tc>
+          <w:tcPr>
+            <w:tcW w:type="dxa" w:w="953"/>
+            <w:tcBorders>
+              <w:top w:val="single" w:color="808080" w:sz="4"/>
+              <w:left w:val="single" w:color="808080" w:sz="4"/>
+              <w:bottom w:val="single" w:color="808080" w:sz="4"/>
+              <w:right w:val="single" w:color="808080" w:sz="4"/>
+            </w:tcBorders>
+            <w:tcMar>
+              <w:top w:type="dxa" w:w="60"/>
+              <w:left w:type="dxa" w:w="100"/>
+              <w:bottom w:type="dxa" w:w="60"/>
+              <w:right w:type="dxa" w:w="100"/>
+            </w:tcMar>
+          </w:tcPr>
+          <w:p>
+            <w:pPr>
+              <w:spacing w:line="276"/>
+              <w:jc w:val="center"/>
+            </w:pPr>
+            <w:r>
+              <w:rPr>
+                <w:sz w:val="19"/>
+                <w:szCs w:val="19"/>
+              </w:rPr>
+              <w:t xml:space="preserve">0,7554</w:t>
+            </w:r>
+          </w:p>
+        </w:tc>
+        <w:tc>
+          <w:tcPr>
+            <w:tcW w:type="dxa" w:w="953"/>
+            <w:tcBorders>
+              <w:top w:val="single" w:color="808080" w:sz="4"/>
+              <w:left w:val="single" w:color="808080" w:sz="4"/>
+              <w:bottom w:val="single" w:color="808080" w:sz="4"/>
+              <w:right w:val="single" w:color="808080" w:sz="4"/>
+            </w:tcBorders>
+            <w:tcMar>
+              <w:top w:type="dxa" w:w="60"/>
+              <w:left w:type="dxa" w:w="100"/>
+              <w:bottom w:type="dxa" w:w="60"/>
+              <w:right w:type="dxa" w:w="100"/>
+            </w:tcMar>
+          </w:tcPr>
+          <w:p>
+            <w:pPr>
+              <w:spacing w:line="276"/>
+              <w:jc w:val="center"/>
+            </w:pPr>
+            <w:r>
+              <w:rPr>
+                <w:sz w:val="19"/>
+                <w:szCs w:val="19"/>
+              </w:rPr>
+              <w:t xml:space="preserve">0,5606</w:t>
+            </w:r>
+          </w:p>
+        </w:tc>
+        <w:tc>
+          <w:tcPr>
+            <w:tcW w:type="dxa" w:w="1032"/>
+            <w:tcBorders>
+              <w:top w:val="single" w:color="808080" w:sz="4"/>
+              <w:left w:val="single" w:color="808080" w:sz="4"/>
+              <w:bottom w:val="single" w:color="808080" w:sz="4"/>
+              <w:right w:val="single" w:color="808080" w:sz="4"/>
+            </w:tcBorders>
+            <w:tcMar>
+              <w:top w:type="dxa" w:w="60"/>
+              <w:left w:type="dxa" w:w="100"/>
+              <w:bottom w:type="dxa" w:w="60"/>
+              <w:right w:type="dxa" w:w="100"/>
+            </w:tcMar>
+          </w:tcPr>
+          <w:p>
+            <w:pPr>
+              <w:spacing w:line="276"/>
+              <w:jc w:val="center"/>
+            </w:pPr>
+            <w:r>
+              <w:rPr>
+                <w:sz w:val="19"/>
+                <w:szCs w:val="19"/>
+              </w:rPr>
+              <w:t xml:space="preserve">0,9087</w:t>
+            </w:r>
+          </w:p>
+        </w:tc>
+        <w:tc>
+          <w:tcPr>
+            <w:tcW w:type="dxa" w:w="1031"/>
+            <w:tcBorders>
+              <w:top w:val="single" w:color="808080" w:sz="4"/>
+              <w:left w:val="single" w:color="808080" w:sz="4"/>
+              <w:bottom w:val="single" w:color="808080" w:sz="4"/>
+              <w:right w:val="single" w:color="808080" w:sz="4"/>
+            </w:tcBorders>
+            <w:tcMar>
+              <w:top w:type="dxa" w:w="60"/>
+              <w:left w:type="dxa" w:w="100"/>
+              <w:bottom w:type="dxa" w:w="60"/>
+              <w:right w:type="dxa" w:w="100"/>
+            </w:tcMar>
+          </w:tcPr>
+          <w:p>
+            <w:pPr>
+              <w:spacing w:line="276"/>
+              <w:jc w:val="center"/>
+            </w:pPr>
+            <w:r>
+              <w:rPr>
+                <w:sz w:val="19"/>
+                <w:szCs w:val="19"/>
+              </w:rPr>
+              <w:t xml:space="preserve">0,2889</w:t>
+            </w:r>
+          </w:p>
+        </w:tc>
+      </w:tr>
+      <w:tr>
+        <w:tc>
+          <w:tcPr>
+            <w:tcW w:type="dxa" w:w="2381"/>
+            <w:tcBorders>
+              <w:top w:val="single" w:color="808080" w:sz="4"/>
+              <w:left w:val="single" w:color="808080" w:sz="4"/>
+              <w:bottom w:val="single" w:color="808080" w:sz="4"/>
+              <w:right w:val="single" w:color="808080" w:sz="4"/>
+            </w:tcBorders>
+            <w:tcMar>
+              <w:top w:type="dxa" w:w="60"/>
+              <w:left w:type="dxa" w:w="100"/>
+              <w:bottom w:type="dxa" w:w="60"/>
+              <w:right w:type="dxa" w:w="100"/>
+            </w:tcMar>
+          </w:tcPr>
+          <w:p>
+            <w:pPr>
+              <w:spacing w:line="276"/>
+              <w:jc w:val="left"/>
+            </w:pPr>
+            <w:r>
+              <w:rPr>
+                <w:sz w:val="19"/>
+                <w:szCs w:val="19"/>
+              </w:rPr>
+              <w:t xml:space="preserve">Decision Tree</w:t>
+            </w:r>
+          </w:p>
+        </w:tc>
+        <w:tc>
+          <w:tcPr>
+            <w:tcW w:type="dxa" w:w="1588"/>
+            <w:tcBorders>
+              <w:top w:val="single" w:color="808080" w:sz="4"/>
+              <w:left w:val="single" w:color="808080" w:sz="4"/>
+              <w:bottom w:val="single" w:color="808080" w:sz="4"/>
+              <w:right w:val="single" w:color="808080" w:sz="4"/>
+            </w:tcBorders>
+            <w:tcMar>
+              <w:top w:type="dxa" w:w="60"/>
+              <w:left w:type="dxa" w:w="100"/>
+              <w:bottom w:type="dxa" w:w="60"/>
+              <w:right w:type="dxa" w:w="100"/>
+            </w:tcMar>
+          </w:tcPr>
+          <w:p>
+            <w:pPr>
+              <w:spacing w:line="276"/>
+              <w:jc w:val="center"/>
+            </w:pPr>
+            <w:r>
+              <w:rPr>
+                <w:b/>
+                <w:bCs/>
+                <w:sz w:val="19"/>
+                <w:szCs w:val="19"/>
+              </w:rPr>
+              <w:t xml:space="preserve">0,9298 ± 0,0253</w:t>
+            </w:r>
+          </w:p>
+        </w:tc>
+        <w:tc>
+          <w:tcPr>
+            <w:tcW w:type="dxa" w:w="953"/>
+            <w:tcBorders>
+              <w:top w:val="single" w:color="808080" w:sz="4"/>
+              <w:left w:val="single" w:color="808080" w:sz="4"/>
+              <w:bottom w:val="single" w:color="808080" w:sz="4"/>
+              <w:right w:val="single" w:color="808080" w:sz="4"/>
+            </w:tcBorders>
+            <w:tcMar>
+              <w:top w:type="dxa" w:w="60"/>
+              <w:left w:type="dxa" w:w="100"/>
+              <w:bottom w:type="dxa" w:w="60"/>
+              <w:right w:type="dxa" w:w="100"/>
+            </w:tcMar>
+          </w:tcPr>
+          <w:p>
+            <w:pPr>
+              <w:spacing w:line="276"/>
+              <w:jc w:val="center"/>
+            </w:pPr>
+            <w:r>
+              <w:rPr>
+                <w:sz w:val="19"/>
+                <w:szCs w:val="19"/>
+              </w:rPr>
+              <w:t xml:space="preserve">0,7838</w:t>
+            </w:r>
+          </w:p>
+        </w:tc>
+        <w:tc>
+          <w:tcPr>
+            <w:tcW w:type="dxa" w:w="953"/>
+            <w:tcBorders>
+              <w:top w:val="single" w:color="808080" w:sz="4"/>
+              <w:left w:val="single" w:color="808080" w:sz="4"/>
+              <w:bottom w:val="single" w:color="808080" w:sz="4"/>
+              <w:right w:val="single" w:color="808080" w:sz="4"/>
+            </w:tcBorders>
+            <w:tcMar>
+              <w:top w:type="dxa" w:w="60"/>
+              <w:left w:type="dxa" w:w="100"/>
+              <w:bottom w:type="dxa" w:w="60"/>
+              <w:right w:type="dxa" w:w="100"/>
+            </w:tcMar>
+          </w:tcPr>
+          <w:p>
+            <w:pPr>
+              <w:spacing w:line="276"/>
+              <w:jc w:val="center"/>
+            </w:pPr>
+            <w:r>
+              <w:rPr>
+                <w:b/>
+                <w:bCs/>
+                <w:sz w:val="19"/>
+                <w:szCs w:val="19"/>
+              </w:rPr>
+              <w:t xml:space="preserve">0,6799</w:t>
+            </w:r>
+          </w:p>
+        </w:tc>
+        <w:tc>
+          <w:tcPr>
+            <w:tcW w:type="dxa" w:w="1032"/>
+            <w:tcBorders>
+              <w:top w:val="single" w:color="808080" w:sz="4"/>
+              <w:left w:val="single" w:color="808080" w:sz="4"/>
+              <w:bottom w:val="single" w:color="808080" w:sz="4"/>
+              <w:right w:val="single" w:color="808080" w:sz="4"/>
+            </w:tcBorders>
+            <w:tcMar>
+              <w:top w:type="dxa" w:w="60"/>
+              <w:left w:type="dxa" w:w="100"/>
+              <w:bottom w:type="dxa" w:w="60"/>
+              <w:right w:type="dxa" w:w="100"/>
+            </w:tcMar>
+          </w:tcPr>
+          <w:p>
+            <w:pPr>
+              <w:spacing w:line="276"/>
+              <w:jc w:val="center"/>
+            </w:pPr>
+            <w:r>
+              <w:rPr>
+                <w:sz w:val="19"/>
+                <w:szCs w:val="19"/>
+              </w:rPr>
+              <w:t xml:space="preserve">0,9079</w:t>
+            </w:r>
+          </w:p>
+        </w:tc>
+        <w:tc>
+          <w:tcPr>
+            <w:tcW w:type="dxa" w:w="1031"/>
+            <w:tcBorders>
+              <w:top w:val="single" w:color="808080" w:sz="4"/>
+              <w:left w:val="single" w:color="808080" w:sz="4"/>
+              <w:bottom w:val="single" w:color="808080" w:sz="4"/>
+              <w:right w:val="single" w:color="808080" w:sz="4"/>
+            </w:tcBorders>
+            <w:tcMar>
+              <w:top w:type="dxa" w:w="60"/>
+              <w:left w:type="dxa" w:w="100"/>
+              <w:bottom w:type="dxa" w:w="60"/>
+              <w:right w:type="dxa" w:w="100"/>
+            </w:tcMar>
+          </w:tcPr>
+          <w:p>
+            <w:pPr>
+              <w:spacing w:line="276"/>
+              <w:jc w:val="center"/>
+            </w:pPr>
+            <w:r>
+              <w:rPr>
+                <w:sz w:val="19"/>
+                <w:szCs w:val="19"/>
+              </w:rPr>
+              <w:t xml:space="preserve">0,3490</w:t>
+            </w:r>
+          </w:p>
+        </w:tc>
+      </w:tr>
+      <w:tr>
+        <w:tc>
+          <w:tcPr>
+            <w:tcW w:type="dxa" w:w="2381"/>
+            <w:tcBorders>
+              <w:top w:val="single" w:color="808080" w:sz="4"/>
+              <w:left w:val="single" w:color="808080" w:sz="4"/>
+              <w:bottom w:val="single" w:color="808080" w:sz="4"/>
+              <w:right w:val="single" w:color="808080" w:sz="4"/>
+            </w:tcBorders>
+            <w:tcMar>
+              <w:top w:type="dxa" w:w="60"/>
+              <w:left w:type="dxa" w:w="100"/>
+              <w:bottom w:type="dxa" w:w="60"/>
+              <w:right w:type="dxa" w:w="100"/>
+            </w:tcMar>
+          </w:tcPr>
+          <w:p>
+            <w:pPr>
+              <w:spacing w:line="276"/>
+              <w:jc w:val="left"/>
+            </w:pPr>
+            <w:r>
+              <w:rPr>
+                <w:sz w:val="19"/>
+                <w:szCs w:val="19"/>
+              </w:rPr>
+              <w:t xml:space="preserve">Random Forest</w:t>
+            </w:r>
+          </w:p>
+        </w:tc>
+        <w:tc>
+          <w:tcPr>
+            <w:tcW w:type="dxa" w:w="1588"/>
+            <w:tcBorders>
+              <w:top w:val="single" w:color="808080" w:sz="4"/>
+              <w:left w:val="single" w:color="808080" w:sz="4"/>
+              <w:bottom w:val="single" w:color="808080" w:sz="4"/>
+              <w:right w:val="single" w:color="808080" w:sz="4"/>
+            </w:tcBorders>
+            <w:tcMar>
+              <w:top w:type="dxa" w:w="60"/>
+              <w:left w:type="dxa" w:w="100"/>
+              <w:bottom w:type="dxa" w:w="60"/>
+              <w:right w:type="dxa" w:w="100"/>
+            </w:tcMar>
+          </w:tcPr>
+          <w:p>
+            <w:pPr>
+              <w:spacing w:line="276"/>
+              <w:jc w:val="center"/>
+            </w:pPr>
+            <w:r>
+              <w:rPr>
+                <w:sz w:val="19"/>
+                <w:szCs w:val="19"/>
+              </w:rPr>
+              <w:t xml:space="preserve">0,9287 ± 0,0221</w:t>
+            </w:r>
+          </w:p>
+        </w:tc>
+        <w:tc>
+          <w:tcPr>
+            <w:tcW w:type="dxa" w:w="953"/>
+            <w:tcBorders>
+              <w:top w:val="single" w:color="808080" w:sz="4"/>
+              <w:left w:val="single" w:color="808080" w:sz="4"/>
+              <w:bottom w:val="single" w:color="808080" w:sz="4"/>
+              <w:right w:val="single" w:color="808080" w:sz="4"/>
+            </w:tcBorders>
+            <w:tcMar>
+              <w:top w:type="dxa" w:w="60"/>
+              <w:left w:type="dxa" w:w="100"/>
+              <w:bottom w:type="dxa" w:w="60"/>
+              <w:right w:type="dxa" w:w="100"/>
+            </w:tcMar>
+          </w:tcPr>
+          <w:p>
+            <w:pPr>
+              <w:spacing w:line="276"/>
+              <w:jc w:val="center"/>
+            </w:pPr>
+            <w:r>
+              <w:rPr>
+                <w:sz w:val="19"/>
+                <w:szCs w:val="19"/>
+              </w:rPr>
+              <w:t xml:space="preserve">0,7726</w:t>
+            </w:r>
+          </w:p>
+        </w:tc>
+        <w:tc>
+          <w:tcPr>
+            <w:tcW w:type="dxa" w:w="953"/>
+            <w:tcBorders>
+              <w:top w:val="single" w:color="808080" w:sz="4"/>
+              <w:left w:val="single" w:color="808080" w:sz="4"/>
+              <w:bottom w:val="single" w:color="808080" w:sz="4"/>
+              <w:right w:val="single" w:color="808080" w:sz="4"/>
+            </w:tcBorders>
+            <w:tcMar>
+              <w:top w:type="dxa" w:w="60"/>
+              <w:left w:type="dxa" w:w="100"/>
+              <w:bottom w:type="dxa" w:w="60"/>
+              <w:right w:type="dxa" w:w="100"/>
+            </w:tcMar>
+          </w:tcPr>
+          <w:p>
+            <w:pPr>
+              <w:spacing w:line="276"/>
+              <w:jc w:val="center"/>
+            </w:pPr>
+            <w:r>
+              <w:rPr>
+                <w:sz w:val="19"/>
+                <w:szCs w:val="19"/>
+              </w:rPr>
+              <w:t xml:space="preserve">0,6721</w:t>
+            </w:r>
+          </w:p>
+        </w:tc>
+        <w:tc>
+          <w:tcPr>
+            <w:tcW w:type="dxa" w:w="1032"/>
+            <w:tcBorders>
+              <w:top w:val="single" w:color="808080" w:sz="4"/>
+              <w:left w:val="single" w:color="808080" w:sz="4"/>
+              <w:bottom w:val="single" w:color="808080" w:sz="4"/>
+              <w:right w:val="single" w:color="808080" w:sz="4"/>
+            </w:tcBorders>
+            <w:tcMar>
+              <w:top w:type="dxa" w:w="60"/>
+              <w:left w:type="dxa" w:w="100"/>
+              <w:bottom w:type="dxa" w:w="60"/>
+              <w:right w:type="dxa" w:w="100"/>
+            </w:tcMar>
+          </w:tcPr>
+          <w:p>
+            <w:pPr>
+              <w:spacing w:line="276"/>
+              <w:jc w:val="center"/>
+            </w:pPr>
+            <w:r>
+              <w:rPr>
+                <w:b/>
+                <w:bCs/>
+                <w:sz w:val="19"/>
+                <w:szCs w:val="19"/>
+              </w:rPr>
+              <w:t xml:space="preserve">0,9293</w:t>
+            </w:r>
+          </w:p>
+        </w:tc>
+        <w:tc>
+          <w:tcPr>
+            <w:tcW w:type="dxa" w:w="1031"/>
+            <w:tcBorders>
+              <w:top w:val="single" w:color="808080" w:sz="4"/>
+              <w:left w:val="single" w:color="808080" w:sz="4"/>
+              <w:bottom w:val="single" w:color="808080" w:sz="4"/>
+              <w:right w:val="single" w:color="808080" w:sz="4"/>
+            </w:tcBorders>
+            <w:tcMar>
+              <w:top w:type="dxa" w:w="60"/>
+              <w:left w:type="dxa" w:w="100"/>
+              <w:bottom w:type="dxa" w:w="60"/>
+              <w:right w:type="dxa" w:w="100"/>
+            </w:tcMar>
+          </w:tcPr>
+          <w:p>
+            <w:pPr>
+              <w:spacing w:line="276"/>
+              <w:jc w:val="center"/>
+            </w:pPr>
+            <w:r>
+              <w:rPr>
+                <w:b/>
+                <w:bCs/>
+                <w:sz w:val="19"/>
+                <w:szCs w:val="19"/>
+              </w:rPr>
+              <w:t xml:space="preserve">0,2409</w:t>
+            </w:r>
+          </w:p>
+        </w:tc>
+      </w:tr>
+      <w:tr>
+        <w:tc>
+          <w:tcPr>
+            <w:tcW w:type="dxa" w:w="2381"/>
+            <w:tcBorders>
+              <w:top w:val="single" w:color="808080" w:sz="4"/>
+              <w:left w:val="single" w:color="808080" w:sz="4"/>
+              <w:bottom w:val="single" w:color="808080" w:sz="4"/>
+              <w:right w:val="single" w:color="808080" w:sz="4"/>
+            </w:tcBorders>
+            <w:tcMar>
+              <w:top w:type="dxa" w:w="60"/>
+              <w:left w:type="dxa" w:w="100"/>
+              <w:bottom w:type="dxa" w:w="60"/>
+              <w:right w:type="dxa" w:w="100"/>
+            </w:tcMar>
+          </w:tcPr>
+          <w:p>
+            <w:pPr>
+              <w:spacing w:line="276"/>
+              <w:jc w:val="left"/>
+            </w:pPr>
+            <w:r>
+              <w:rPr>
+                <w:sz w:val="19"/>
+                <w:szCs w:val="19"/>
+              </w:rPr>
+              <w:t xml:space="preserve">XGBoost</w:t>
+            </w:r>
+          </w:p>
+        </w:tc>
+        <w:tc>
+          <w:tcPr>
+            <w:tcW w:type="dxa" w:w="1588"/>
+            <w:tcBorders>
+              <w:top w:val="single" w:color="808080" w:sz="4"/>
+              <w:left w:val="single" w:color="808080" w:sz="4"/>
+              <w:bottom w:val="single" w:color="808080" w:sz="4"/>
+              <w:right w:val="single" w:color="808080" w:sz="4"/>
+            </w:tcBorders>
+            <w:tcMar>
+              <w:top w:type="dxa" w:w="60"/>
+              <w:left w:type="dxa" w:w="100"/>
+              <w:bottom w:type="dxa" w:w="60"/>
+              <w:right w:type="dxa" w:w="100"/>
+            </w:tcMar>
+          </w:tcPr>
+          <w:p>
+            <w:pPr>
+              <w:spacing w:line="276"/>
+              <w:jc w:val="center"/>
+            </w:pPr>
+            <w:r>
+              <w:rPr>
+                <w:sz w:val="19"/>
+                <w:szCs w:val="19"/>
+              </w:rPr>
+              <w:t xml:space="preserve">0,9261 ± 0,0334</w:t>
+            </w:r>
+          </w:p>
+        </w:tc>
+        <w:tc>
+          <w:tcPr>
+            <w:tcW w:type="dxa" w:w="953"/>
+            <w:tcBorders>
+              <w:top w:val="single" w:color="808080" w:sz="4"/>
+              <w:left w:val="single" w:color="808080" w:sz="4"/>
+              <w:bottom w:val="single" w:color="808080" w:sz="4"/>
+              <w:right w:val="single" w:color="808080" w:sz="4"/>
+            </w:tcBorders>
+            <w:tcMar>
+              <w:top w:type="dxa" w:w="60"/>
+              <w:left w:type="dxa" w:w="100"/>
+              <w:bottom w:type="dxa" w:w="60"/>
+              <w:right w:type="dxa" w:w="100"/>
+            </w:tcMar>
+          </w:tcPr>
+          <w:p>
+            <w:pPr>
+              <w:spacing w:line="276"/>
+              <w:jc w:val="center"/>
+            </w:pPr>
+            <w:r>
+              <w:rPr>
+                <w:sz w:val="19"/>
+                <w:szCs w:val="19"/>
+              </w:rPr>
+              <w:t xml:space="preserve">0,7771</w:t>
+            </w:r>
+          </w:p>
+        </w:tc>
+        <w:tc>
+          <w:tcPr>
+            <w:tcW w:type="dxa" w:w="953"/>
+            <w:tcBorders>
+              <w:top w:val="single" w:color="808080" w:sz="4"/>
+              <w:left w:val="single" w:color="808080" w:sz="4"/>
+              <w:bottom w:val="single" w:color="808080" w:sz="4"/>
+              <w:right w:val="single" w:color="808080" w:sz="4"/>
+            </w:tcBorders>
+            <w:tcMar>
+              <w:top w:type="dxa" w:w="60"/>
+              <w:left w:type="dxa" w:w="100"/>
+              <w:bottom w:type="dxa" w:w="60"/>
+              <w:right w:type="dxa" w:w="100"/>
+            </w:tcMar>
+          </w:tcPr>
+          <w:p>
+            <w:pPr>
+              <w:spacing w:line="276"/>
+              <w:jc w:val="center"/>
+            </w:pPr>
+            <w:r>
+              <w:rPr>
+                <w:sz w:val="19"/>
+                <w:szCs w:val="19"/>
+              </w:rPr>
+              <w:t xml:space="preserve">0,6508</w:t>
+            </w:r>
+          </w:p>
+        </w:tc>
+        <w:tc>
+          <w:tcPr>
+            <w:tcW w:type="dxa" w:w="1032"/>
+            <w:tcBorders>
+              <w:top w:val="single" w:color="808080" w:sz="4"/>
+              <w:left w:val="single" w:color="808080" w:sz="4"/>
+              <w:bottom w:val="single" w:color="808080" w:sz="4"/>
+              <w:right w:val="single" w:color="808080" w:sz="4"/>
+            </w:tcBorders>
+            <w:tcMar>
+              <w:top w:type="dxa" w:w="60"/>
+              <w:left w:type="dxa" w:w="100"/>
+              <w:bottom w:type="dxa" w:w="60"/>
+              <w:right w:type="dxa" w:w="100"/>
+            </w:tcMar>
+          </w:tcPr>
+          <w:p>
+            <w:pPr>
+              <w:spacing w:line="276"/>
+              <w:jc w:val="center"/>
+            </w:pPr>
+            <w:r>
+              <w:rPr>
+                <w:sz w:val="19"/>
+                <w:szCs w:val="19"/>
+              </w:rPr>
+              <w:t xml:space="preserve">0,9279</w:t>
+            </w:r>
+          </w:p>
+        </w:tc>
+        <w:tc>
+          <w:tcPr>
+            <w:tcW w:type="dxa" w:w="1031"/>
+            <w:tcBorders>
+              <w:top w:val="single" w:color="808080" w:sz="4"/>
+              <w:left w:val="single" w:color="808080" w:sz="4"/>
+              <w:bottom w:val="single" w:color="808080" w:sz="4"/>
+              <w:right w:val="single" w:color="808080" w:sz="4"/>
+            </w:tcBorders>
+            <w:tcMar>
+              <w:top w:type="dxa" w:w="60"/>
+              <w:left w:type="dxa" w:w="100"/>
+              <w:bottom w:type="dxa" w:w="60"/>
+              <w:right w:type="dxa" w:w="100"/>
+            </w:tcMar>
+          </w:tcPr>
+          <w:p>
+            <w:pPr>
+              <w:spacing w:line="276"/>
+              <w:jc w:val="center"/>
+            </w:pPr>
+            <w:r>
+              <w:rPr>
+                <w:sz w:val="19"/>
+                <w:szCs w:val="19"/>
+              </w:rPr>
+              <w:t xml:space="preserve">0,2470</w:t>
+            </w:r>
+          </w:p>
+        </w:tc>
+      </w:tr>
+    </w:tbl>
+    <w:p/>
     <w:p>
       <w:pPr>
         <w:keepNext/>
@@ -11654,9 +13398,9 @@
       <w:r>
         <w:drawing>
           <wp:inline distT="0" distB="0" distL="0" distR="0">
-            <wp:extent cx="5334000" cy="2133600"/>
+            <wp:extent cx="5334000" cy="2609850"/>
             <wp:effectExtent t="0" r="0" b="0" l="0"/>
-            <wp:docPr id="11" name="fig_kurva.png" descr="Kurva peluang mendapat S-Rank dalam 10 pull menurut setiap model" title="Kurva peluang mendapat S-Rank dalam 10 pull menurut setiap model"/>
+            <wp:docPr id="11" name="fig_real_cv.png" descr="Akurasi enam algoritma yang dilatih dan diuji dengan data asli saja" title="Akurasi enam algoritma yang dilatih dan diuji dengan data asli saja"/>
             <wp:cNvGraphicFramePr>
               <a:graphicFrameLocks xmlns:a="http://schemas.openxmlformats.org/drawingml/2006/main" noChangeAspect="1"/>
             </wp:cNvGraphicFramePr>
@@ -11679,7 +13423,7 @@
                   <pic:spPr bwMode="auto">
                     <a:xfrm>
                       <a:off x="0" y="0"/>
-                      <a:ext cx="5334000" cy="2133600"/>
+                      <a:ext cx="5334000" cy="2609850"/>
                     </a:xfrm>
                     <a:prstGeom prst="rect">
                       <a:avLst/>
@@ -11705,7 +13449,303 @@
         <w:t xml:space="preserve">Gambar 4.8</w:t>
       </w:r>
       <w:r>
-        <w:t xml:space="preserve"> Kurva peluang mendapat S-Rank dalam 10 pull menurut setiap model</w:t>
+        <w:t xml:space="preserve"> Akurasi enam algoritma yang dilatih dan diuji dengan data asli saja</w:t>
+      </w:r>
+    </w:p>
+    <w:p>
+      <w:pPr>
+        <w:pStyle w:val="ListParagraph"/>
+        <w:numPr>
+          <w:ilvl w:val="0"/>
+          <w:numId w:val="3"/>
+        </w:numPr>
+        <w:spacing w:after="60" w:line="360"/>
+        <w:jc w:val="both"/>
+      </w:pPr>
+      <w:r>
+        <w:rPr>
+          <w:b/>
+          <w:bCs/>
+        </w:rPr>
+        <w:t xml:space="preserve">Decision Tree</w:t>
+      </w:r>
+      <w:r>
+        <w:t xml:space="preserve"> mencapai akurasi tertinggi (92,98%), diikuti Random Forest (92,87%) dan XGBoost (92,61%). Urutan ini sama dengan hasil pada data simulasi, dan selisihnya dengan batas teori Markov Chain (93,56%) kurang dari 1%.</w:t>
+      </w:r>
+    </w:p>
+    <w:p>
+      <w:pPr>
+        <w:pStyle w:val="ListParagraph"/>
+        <w:numPr>
+          <w:ilvl w:val="0"/>
+          <w:numId w:val="3"/>
+        </w:numPr>
+        <w:spacing w:after="60" w:line="360"/>
+        <w:jc w:val="both"/>
+      </w:pPr>
+      <w:r>
+        <w:rPr>
+          <w:b/>
+          <w:bCs/>
+        </w:rPr>
+        <w:t xml:space="preserve">Logistic Regression</w:t>
+      </w:r>
+      <w:r>
+        <w:t xml:space="preserve"> mencapai 91,01%, tetap di bawah model berbasis pohon.</w:t>
+      </w:r>
+    </w:p>
+    <w:p>
+      <w:pPr>
+        <w:pStyle w:val="ListParagraph"/>
+        <w:numPr>
+          <w:ilvl w:val="0"/>
+          <w:numId w:val="3"/>
+        </w:numPr>
+        <w:spacing w:after="60" w:line="360"/>
+        <w:jc w:val="both"/>
+      </w:pPr>
+      <w:r>
+        <w:rPr>
+          <w:b/>
+          <w:bCs/>
+        </w:rPr>
+        <w:t xml:space="preserve">Naive Bayes</w:t>
+      </w:r>
+      <w:r>
+        <w:t xml:space="preserve"> hanya 87,98%, tetapi Balanced Accuracy-nya tertinggi (0,8368) karena lebih sering menebak "dapat S-Rank" (recall ±0,77). Ini menunjukkan </w:t>
+      </w:r>
+      <w:r>
+        <w:rPr>
+          <w:i/>
+          <w:iCs/>
+        </w:rPr>
+        <w:t xml:space="preserve">trade-off</w:t>
+      </w:r>
+      <w:r>
+        <w:t xml:space="preserve"> antara akurasi dan kemampuan menangkap kelas minoritas.</w:t>
+      </w:r>
+    </w:p>
+    <w:p>
+      <w:pPr>
+        <w:pStyle w:val="ListParagraph"/>
+        <w:numPr>
+          <w:ilvl w:val="0"/>
+          <w:numId w:val="3"/>
+        </w:numPr>
+        <w:spacing w:after="60" w:line="360"/>
+        <w:jc w:val="both"/>
+      </w:pPr>
+      <w:r>
+        <w:rPr>
+          <w:b/>
+          <w:bCs/>
+        </w:rPr>
+        <w:t xml:space="preserve">KNN</w:t>
+      </w:r>
+      <w:r>
+        <w:t xml:space="preserve"> turun menjadi 87,41%, hampir sama dengan baseline. Nilai k = 101 tetangga terlalu besar untuk data latih ±950 baris yang hanya memuat ±130 kelas positif, sehingga tetangga terdekat hampir selalu didominasi kelas mayoritas. Hal ini menunjukkan bahwa </w:t>
+      </w:r>
+      <w:r>
+        <w:rPr>
+          <w:i/>
+          <w:iCs/>
+        </w:rPr>
+        <w:t xml:space="preserve">hyperparameter</w:t>
+      </w:r>
+      <w:r>
+        <w:t xml:space="preserve"> perlu disesuaikan dengan ukuran data.</w:t>
+      </w:r>
+    </w:p>
+    <w:p>
+      <w:pPr>
+        <w:pStyle w:val="ListParagraph"/>
+        <w:numPr>
+          <w:ilvl w:val="0"/>
+          <w:numId w:val="3"/>
+        </w:numPr>
+        <w:spacing w:after="60" w:line="360"/>
+        <w:jc w:val="both"/>
+      </w:pPr>
+      <w:r>
+        <w:t xml:space="preserve">Simpangan baku (±2–4%) lebih besar daripada pada data simulasi (±0,2%) karena jumlah data asli jauh lebih sedikit.</w:t>
+      </w:r>
+    </w:p>
+    <w:p>
+      <w:pPr>
+        <w:pStyle w:val="Heading2"/>
+        <w:keepNext/>
+        <w:spacing w:after="120" w:before="240" w:line="360"/>
+      </w:pPr>
+      <w:r>
+        <w:t xml:space="preserve">4.6 Pembahasan</w:t>
+      </w:r>
+    </w:p>
+    <w:p>
+      <w:pPr>
+        <w:pStyle w:val="ListParagraph"/>
+        <w:numPr>
+          <w:ilvl w:val="0"/>
+          <w:numId w:val="6"/>
+        </w:numPr>
+        <w:spacing w:after="60" w:line="360"/>
+        <w:jc w:val="both"/>
+      </w:pPr>
+      <w:r>
+        <w:rPr>
+          <w:b/>
+          <w:bCs/>
+        </w:rPr>
+        <w:t xml:space="preserve">Jebakan akurasi.</w:t>
+      </w:r>
+      <w:r>
+        <w:t xml:space="preserve"> Pada tugas A, baseline sudah mencapai akurasi 98,28%. Akurasi saja tidak dapat dipakai untuk menilai model pada data yang sangat tidak seimbang, sehingga diperlukan Balanced Accuracy, F1-score, ROC-AUC, dan Log Loss.</w:t>
+      </w:r>
+    </w:p>
+    <w:p>
+      <w:pPr>
+        <w:pStyle w:val="ListParagraph"/>
+        <w:numPr>
+          <w:ilvl w:val="0"/>
+          <w:numId w:val="6"/>
+        </w:numPr>
+        <w:spacing w:after="60" w:line="360"/>
+        <w:jc w:val="both"/>
+      </w:pPr>
+      <w:r>
+        <w:rPr>
+          <w:b/>
+          <w:bCs/>
+        </w:rPr>
+        <w:t xml:space="preserve">Algoritma terbaik.</w:t>
+      </w:r>
+      <w:r>
+        <w:t xml:space="preserve"> Pada tugas B, Decision Tree, Random Forest, XGBoost, dan KNN mencapai akurasi ±91,1% di simulasi dan ±93,3–93,5% di data asli. Nilai ini setara dengan batas teori Markov Chain, sehingga keempat algoritma tersebut sudah bekerja maksimal.</w:t>
+      </w:r>
+    </w:p>
+    <w:p>
+      <w:pPr>
+        <w:pStyle w:val="ListParagraph"/>
+        <w:numPr>
+          <w:ilvl w:val="0"/>
+          <w:numId w:val="6"/>
+        </w:numPr>
+        <w:spacing w:after="60" w:line="360"/>
+        <w:jc w:val="both"/>
+      </w:pPr>
+      <w:r>
+        <w:rPr>
+          <w:b/>
+          <w:bCs/>
+        </w:rPr>
+        <w:t xml:space="preserve">Model pohon menemukan soft pity sendiri.</w:t>
+      </w:r>
+      <w:r>
+        <w:t xml:space="preserve"> Aturan Decision Tree memisahkan data di sekitar pity_ratio 0,71–0,74, yaitu sekitar 10 pull sebelum soft pity, tepat saat jendela 10 pull ke depan mulai menyentuh soft pity. Model tidak pernah diberi tahu tentang soft pity (Gambar 4.9).</w:t>
+      </w:r>
+    </w:p>
+    <w:p>
+      <w:pPr>
+        <w:pStyle w:val="ListParagraph"/>
+        <w:numPr>
+          <w:ilvl w:val="0"/>
+          <w:numId w:val="6"/>
+        </w:numPr>
+        <w:spacing w:after="60" w:line="360"/>
+        <w:jc w:val="both"/>
+      </w:pPr>
+      <w:r>
+        <w:rPr>
+          <w:b/>
+          <w:bCs/>
+        </w:rPr>
+        <w:t xml:space="preserve">Logistic Regression dan Naive Bayes kalah.</w:t>
+      </w:r>
+      <w:r>
+        <w:t xml:space="preserve"> Logistic Regression hanya dapat membentuk kurva sigmoid yang halus sehingga tidak bisa meniru lonjakan tajam setelah soft pity. Naive Bayes mengasumsikan fitur saling bebas dan berdistribusi normal, padahal pity dan pity_ratio sangat berkaitan; akibatnya Log Loss-nya paling besar.</w:t>
+      </w:r>
+    </w:p>
+    <w:p>
+      <w:pPr>
+        <w:pStyle w:val="ListParagraph"/>
+        <w:numPr>
+          <w:ilvl w:val="0"/>
+          <w:numId w:val="6"/>
+        </w:numPr>
+        <w:spacing w:after="60" w:line="360"/>
+        <w:jc w:val="both"/>
+      </w:pPr>
+      <w:r>
+        <w:rPr>
+          <w:b/>
+          <w:bCs/>
+        </w:rPr>
+        <w:t xml:space="preserve">KNN setara model pohon</w:t>
+      </w:r>
+      <w:r>
+        <w:t xml:space="preserve"> karena fiturnya sedikit dan nilainya berulang, sehingga tetangga terdekat praktis adalah pull dengan pity yang sama. Kelemahannya, KNN menyimpan seluruh data latih dan paling lambat saat prediksi.</w:t>
+      </w:r>
+    </w:p>
+    <w:p>
+      <w:pPr>
+        <w:pStyle w:val="ListParagraph"/>
+        <w:numPr>
+          <w:ilvl w:val="0"/>
+          <w:numId w:val="6"/>
+        </w:numPr>
+        <w:spacing w:after="60" w:line="360"/>
+        <w:jc w:val="both"/>
+      </w:pPr>
+      <w:r>
+        <w:rPr>
+          <w:b/>
+          <w:bCs/>
+        </w:rPr>
+        <w:t xml:space="preserve">Fitur guaranteed hampir tidak berpengaruh</w:t>
+      </w:r>
+      <w:r>
+        <w:t xml:space="preserve"> (Gambar 4.10). Hal ini sesuai aturan permainan: guaranteed hanya menentukan S-Rank mana yang keluar, bukan kapan S-Rank keluar.</w:t>
+      </w:r>
+    </w:p>
+    <w:p>
+      <w:pPr>
+        <w:pStyle w:val="ListParagraph"/>
+        <w:numPr>
+          <w:ilvl w:val="0"/>
+          <w:numId w:val="6"/>
+        </w:numPr>
+        <w:spacing w:after="60" w:line="360"/>
+        <w:jc w:val="both"/>
+      </w:pPr>
+      <w:r>
+        <w:rPr>
+          <w:b/>
+          <w:bCs/>
+        </w:rPr>
+        <w:t xml:space="preserve">Konsisten pada data asli.</w:t>
+      </w:r>
+      <w:r>
+        <w:t xml:space="preserve"> Urutan kinerja algoritma pada data asli sama dengan pada simulasi. Artinya, asumsi soft pity yang dipakai simulasi sesuai dengan perilaku gacha sungguhan.</w:t>
+      </w:r>
+    </w:p>
+    <w:p>
+      <w:pPr>
+        <w:pStyle w:val="ListParagraph"/>
+        <w:numPr>
+          <w:ilvl w:val="0"/>
+          <w:numId w:val="6"/>
+        </w:numPr>
+        <w:spacing w:after="60" w:line="360"/>
+        <w:jc w:val="both"/>
+      </w:pPr>
+      <w:r>
+        <w:rPr>
+          <w:b/>
+          <w:bCs/>
+        </w:rPr>
+        <w:t xml:space="preserve">Tidak bergantung pada simulasi.</w:t>
+      </w:r>
+      <w:r>
+        <w:t xml:space="preserve"> Ketika dilatih dan diuji dengan data asli saja (1.192 baris), model berbasis pohon tetap terbaik (±92,6–93,0%). Kesimpulan penelitian tidak berubah walaupun data simulasi tidak dipakai sama sekali.</w:t>
       </w:r>
     </w:p>
     <w:p>
@@ -11717,9 +13757,9 @@
       <w:r>
         <w:drawing>
           <wp:inline distT="0" distB="0" distL="0" distR="0">
-            <wp:extent cx="4762500" cy="2028825"/>
+            <wp:extent cx="5334000" cy="2133600"/>
             <wp:effectExtent t="0" r="0" b="0" l="0"/>
-            <wp:docPr id="12" name="fig_importance.png" descr="Feature importance model berbasis pohon (tugas B)" title="Feature importance model berbasis pohon (tugas B)"/>
+            <wp:docPr id="12" name="fig_kurva.png" descr="Kurva peluang mendapat S-Rank dalam 10 pull menurut setiap model" title="Kurva peluang mendapat S-Rank dalam 10 pull menurut setiap model"/>
             <wp:cNvGraphicFramePr>
               <a:graphicFrameLocks xmlns:a="http://schemas.openxmlformats.org/drawingml/2006/main" noChangeAspect="1"/>
             </wp:cNvGraphicFramePr>
@@ -11742,6 +13782,69 @@
                   <pic:spPr bwMode="auto">
                     <a:xfrm>
                       <a:off x="0" y="0"/>
+                      <a:ext cx="5334000" cy="2133600"/>
+                    </a:xfrm>
+                    <a:prstGeom prst="rect">
+                      <a:avLst/>
+                    </a:prstGeom>
+                  </pic:spPr>
+                </pic:pic>
+              </a:graphicData>
+            </a:graphic>
+          </wp:inline>
+        </w:drawing>
+      </w:r>
+    </w:p>
+    <w:p>
+      <w:pPr>
+        <w:spacing w:after="200"/>
+        <w:jc w:val="center"/>
+      </w:pPr>
+      <w:r>
+        <w:rPr>
+          <w:b/>
+          <w:bCs/>
+        </w:rPr>
+        <w:t xml:space="preserve">Gambar 4.9</w:t>
+      </w:r>
+      <w:r>
+        <w:t xml:space="preserve"> Kurva peluang mendapat S-Rank dalam 10 pull menurut setiap model</w:t>
+      </w:r>
+    </w:p>
+    <w:p>
+      <w:pPr>
+        <w:keepNext/>
+        <w:spacing w:before="120"/>
+        <w:jc w:val="center"/>
+      </w:pPr>
+      <w:r>
+        <w:drawing>
+          <wp:inline distT="0" distB="0" distL="0" distR="0">
+            <wp:extent cx="4762500" cy="2028825"/>
+            <wp:effectExtent t="0" r="0" b="0" l="0"/>
+            <wp:docPr id="13" name="fig_importance.png" descr="Feature importance model berbasis pohon (tugas B)" title="Feature importance model berbasis pohon (tugas B)"/>
+            <wp:cNvGraphicFramePr>
+              <a:graphicFrameLocks xmlns:a="http://schemas.openxmlformats.org/drawingml/2006/main" noChangeAspect="1"/>
+            </wp:cNvGraphicFramePr>
+            <a:graphic xmlns:a="http://schemas.openxmlformats.org/drawingml/2006/main">
+              <a:graphicData uri="http://schemas.openxmlformats.org/drawingml/2006/picture">
+                <pic:pic xmlns:pic="http://schemas.openxmlformats.org/drawingml/2006/picture">
+                  <pic:nvPicPr>
+                    <pic:cNvPr id="0" name="" descr=""/>
+                    <pic:cNvPicPr>
+                      <a:picLocks noChangeAspect="1" noChangeArrowheads="1"/>
+                    </pic:cNvPicPr>
+                  </pic:nvPicPr>
+                  <pic:blipFill>
+                    <a:blip r:embed="rId20" cstate="none"/>
+                    <a:srcRect/>
+                    <a:stretch>
+                      <a:fillRect/>
+                    </a:stretch>
+                  </pic:blipFill>
+                  <pic:spPr bwMode="auto">
+                    <a:xfrm>
+                      <a:off x="0" y="0"/>
                       <a:ext cx="4762500" cy="2028825"/>
                     </a:xfrm>
                     <a:prstGeom prst="rect">
@@ -11765,7 +13868,7 @@
           <w:b/>
           <w:bCs/>
         </w:rPr>
-        <w:t xml:space="preserve">Gambar 4.9</w:t>
+        <w:t xml:space="preserve">Gambar 4.10</w:t>
       </w:r>
       <w:r>
         <w:t xml:space="preserve"> Feature importance model berbasis pohon (tugas B)</w:t>
@@ -11821,7 +13924,7 @@
         <w:jc w:val="both"/>
       </w:pPr>
       <w:r>
-        <w:t xml:space="preserve">Untuk memprediksi S-Rank dalam 10 pull berikutnya, Decision Tree, Random Forest, XGBoost, dan KNN memberikan akurasi tertinggi (±91,1% pada simulasi, ±93,3–93,5% pada data asli), hampir menyamai batas teori. Logistic Regression (±88,9%) dan Naive Bayes (±85,7%) lebih rendah.</w:t>
+        <w:t xml:space="preserve">Untuk memprediksi S-Rank dalam 10 pull berikutnya, Decision Tree, Random Forest, XGBoost, dan KNN memberikan akurasi tertinggi (±91,1% pada simulasi, ±93,3–93,5% pada data asli), hampir menyamai batas teori. Logistic Regression (±88,9%) dan Naive Bayes (±85,7%) lebih rendah. Saat dilatih dan diuji hanya dengan data asli (1.192 baris), Decision Tree tetap tertinggi (92,98%), diikuti Random Forest dan XGBoost.</w:t>
       </w:r>
     </w:p>
     <w:p>
@@ -11873,7 +13976,41 @@
         <w:jc w:val="both"/>
       </w:pPr>
       <w:r>
-        <w:t xml:space="preserve">Menambah jumlah akun data asli agar hasil uji lebih kuat dan agar model dapat dilatih langsung dari data asli.</w:t>
+        <w:t xml:space="preserve">Menambah jumlah akun data asli agar eksperimen latih–uji dengan data asli lebih stabil (simpangan baku saat ini masih ±2–4%).</w:t>
+      </w:r>
+    </w:p>
+    <w:p>
+      <w:pPr>
+        <w:pStyle w:val="ListParagraph"/>
+        <w:numPr>
+          <w:ilvl w:val="0"/>
+          <w:numId w:val="3"/>
+        </w:numPr>
+        <w:spacing w:after="60" w:line="360"/>
+        <w:jc w:val="both"/>
+      </w:pPr>
+      <w:r>
+        <w:t xml:space="preserve">Menyesuaikan </w:t>
+      </w:r>
+      <w:r>
+        <w:rPr>
+          <w:i/>
+          <w:iCs/>
+        </w:rPr>
+        <w:t xml:space="preserve">hyperparameter</w:t>
+      </w:r>
+      <w:r>
+        <w:t xml:space="preserve"> (misalnya nilai k pada KNN) dengan ukuran data menggunakan </w:t>
+      </w:r>
+      <w:r>
+        <w:rPr>
+          <w:i/>
+          <w:iCs/>
+        </w:rPr>
+        <w:t xml:space="preserve">grid search</w:t>
+      </w:r>
+      <w:r>
+        <w:t xml:space="preserve">.</w:t>
       </w:r>
     </w:p>
     <w:p>

</xml_diff>

<commit_message>
Perbarui data asli akun01 (+17 pull) dan semua hasilnya
Data akun01 bertambah 17 pull W-Engine (S rate-up di pity 67); akun02
tetap. Total data asli kini 1.441 pull dan 22 S-Rank. Data divalidasi:
pity berurutan, reset setelah S, dan status guaranteed konsisten.

- Latih ulang: hasil simulasi tidak berubah (selisih < 1e-15), jadi
  models.joblib tetap; report.json memuat hasil data asli terbaru.
- Latih-uji data asli saja (tugas B, 1.209 baris): Decision Tree tetap
  tertinggi (93,10%), lalu Random Forest (92,99%) dan XGBoost (92,22%).
- Aplikasi: perkiraan ukuran data latih KNN dihitung dari report.
- README, LAPORAN.md, panduan pengumpulan, proposal, laporan, dan kedua
  slide memakai angka terbaru; grafik dibuat ulang lewat figs.py dan
  tangkapan layar halaman Perbandingan diambil ulang.

Co-Authored-By: Claude Opus 5.5 <noreply@anthropic.com>
Claude-Session: https://claude.ai/code/session_01EfDzNu9t2ibrydK84RyJqZ
</commit_message>
<xml_diff>
--- a/docs/tugas/UAS_Laporan_Akhir_Kelompok6_A11.4502.docx
+++ b/docs/tugas/UAS_Laporan_Akhir_Kelompok6_A11.4502.docx
@@ -5565,7 +5565,7 @@
                 <w:sz w:val="20"/>
                 <w:szCs w:val="20"/>
               </w:rPr>
-              <w:t xml:space="preserve">2 akun (anggota kelompok dan teman), 1.424 pull, 21 S-Rank; anonim tanpa UID, nama item, dan waktu</w:t>
+              <w:t xml:space="preserve">2 akun (anggota kelompok dan teman), 1.441 pull, 22 S-Rank; anonim tanpa UID, nama item, dan waktu</w:t>
             </w:r>
           </w:p>
         </w:tc>
@@ -5631,7 +5631,7 @@
         <w:t xml:space="preserve">hanya dengan data asli</w:t>
       </w:r>
       <w:r>
-        <w:t xml:space="preserve"> (1.192 baris setelah pembersihan). Eksperimen ini memastikan bahwa hasil perbandingan tidak bergantung pada data simulasi, dan jumlah barisnya sudah memenuhi ketentuan dataset tabel minimal 500–1.000 baris.</w:t>
+        <w:t xml:space="preserve"> (1.209 baris setelah pembersihan). Eksperimen ini memastikan bahwa hasil perbandingan tidak bergantung pada data simulasi, dan jumlah barisnya sudah memenuhi ketentuan dataset tabel minimal 500–1.000 baris.</w:t>
       </w:r>
     </w:p>
     <w:p>
@@ -8000,7 +8000,7 @@
         <w:jc w:val="both"/>
       </w:pPr>
       <w:r>
-        <w:t xml:space="preserve">Riwayat dua akun asli diambil melalui skrip PowerShell dari permainan versi Steam. Pity yang dihitung aplikasi untuk akun pertama, yaitu 70/90 pada banner Agent dan 46/80 dengan status guaranteed pada banner W-Engine, </w:t>
+        <w:t xml:space="preserve">Riwayat dua akun asli diambil melalui skrip PowerShell dari permainan versi Steam. Pada saat pengecekan, pity yang dihitung aplikasi untuk akun pertama, yaitu 70/90 pada banner Agent dan 46/80 dengan status guaranteed pada banner W-Engine, </w:t>
       </w:r>
       <w:r>
         <w:rPr>
@@ -8356,7 +8356,7 @@
                 <w:sz w:val="20"/>
                 <w:szCs w:val="20"/>
               </w:rPr>
-              <w:t xml:space="preserve">1.228</w:t>
+              <w:t xml:space="preserve">1.245</w:t>
             </w:r>
           </w:p>
         </w:tc>
@@ -8457,7 +8457,7 @@
                 <w:sz w:val="20"/>
                 <w:szCs w:val="20"/>
               </w:rPr>
-              <w:t xml:space="preserve">1.192</w:t>
+              <w:t xml:space="preserve">1.209</w:t>
             </w:r>
           </w:p>
         </w:tc>
@@ -8659,7 +8659,7 @@
                 <w:sz w:val="20"/>
                 <w:szCs w:val="20"/>
               </w:rPr>
-              <w:t xml:space="preserve">13,5%</w:t>
+              <w:t xml:space="preserve">13,4%</w:t>
             </w:r>
           </w:p>
         </w:tc>
@@ -8760,7 +8760,7 @@
                 <w:sz w:val="20"/>
                 <w:szCs w:val="20"/>
               </w:rPr>
-              <w:t xml:space="preserve">– / 1.192</w:t>
+              <w:t xml:space="preserve">– / 1.209</w:t>
             </w:r>
           </w:p>
         </w:tc>
@@ -8861,7 +8861,7 @@
                 <w:sz w:val="20"/>
                 <w:szCs w:val="20"/>
               </w:rPr>
-              <w:t xml:space="preserve">1.192 baris, 20 siklus, 5-fold</w:t>
+              <w:t xml:space="preserve">1.209 baris, 20 siklus, 5-fold</w:t>
             </w:r>
           </w:p>
         </w:tc>
@@ -11164,7 +11164,7 @@
                 <w:sz w:val="19"/>
                 <w:szCs w:val="19"/>
               </w:rPr>
-              <w:t xml:space="preserve">0,8649</w:t>
+              <w:t xml:space="preserve">0,8660</w:t>
             </w:r>
           </w:p>
         </w:tc>
@@ -11361,7 +11361,7 @@
                 <w:sz w:val="19"/>
                 <w:szCs w:val="19"/>
               </w:rPr>
-              <w:t xml:space="preserve">0,9354</w:t>
+              <w:t xml:space="preserve">0,9355</w:t>
             </w:r>
           </w:p>
         </w:tc>
@@ -11393,7 +11393,7 @@
                 <w:sz w:val="19"/>
                 <w:szCs w:val="19"/>
               </w:rPr>
-              <w:t xml:space="preserve">0,7050</w:t>
+              <w:t xml:space="preserve">0,7023</w:t>
             </w:r>
           </w:p>
         </w:tc>
@@ -11558,7 +11558,7 @@
                 <w:sz w:val="19"/>
                 <w:szCs w:val="19"/>
               </w:rPr>
-              <w:t xml:space="preserve">0,8767</w:t>
+              <w:t xml:space="preserve">0,8751</w:t>
             </w:r>
           </w:p>
         </w:tc>
@@ -11590,7 +11590,7 @@
                 <w:sz w:val="19"/>
                 <w:szCs w:val="19"/>
               </w:rPr>
-              <w:t xml:space="preserve">0,5950</w:t>
+              <w:t xml:space="preserve">0,5908</w:t>
             </w:r>
           </w:p>
         </w:tc>
@@ -11757,7 +11757,7 @@
                 <w:sz w:val="19"/>
                 <w:szCs w:val="19"/>
               </w:rPr>
-              <w:t xml:space="preserve">0,9346</w:t>
+              <w:t xml:space="preserve">0,9347</w:t>
             </w:r>
           </w:p>
         </w:tc>
@@ -11791,7 +11791,7 @@
                 <w:sz w:val="19"/>
                 <w:szCs w:val="19"/>
               </w:rPr>
-              <w:t xml:space="preserve">0,7000</w:t>
+              <w:t xml:space="preserve">0,6973</w:t>
             </w:r>
           </w:p>
         </w:tc>
@@ -11956,7 +11956,7 @@
                 <w:sz w:val="19"/>
                 <w:szCs w:val="19"/>
               </w:rPr>
-              <w:t xml:space="preserve">0,9111</w:t>
+              <w:t xml:space="preserve">0,9115</w:t>
             </w:r>
           </w:p>
         </w:tc>
@@ -11988,7 +11988,7 @@
                 <w:sz w:val="19"/>
                 <w:szCs w:val="19"/>
               </w:rPr>
-              <w:t xml:space="preserve">0,5138</w:t>
+              <w:t xml:space="preserve">0,5114</w:t>
             </w:r>
           </w:p>
         </w:tc>
@@ -12159,7 +12159,7 @@
                 <w:sz w:val="19"/>
                 <w:szCs w:val="19"/>
               </w:rPr>
-              <w:t xml:space="preserve">0,9329</w:t>
+              <w:t xml:space="preserve">0,9330</w:t>
             </w:r>
           </w:p>
         </w:tc>
@@ -12191,7 +12191,7 @@
                 <w:sz w:val="19"/>
                 <w:szCs w:val="19"/>
               </w:rPr>
-              <w:t xml:space="preserve">0,6899</w:t>
+              <w:t xml:space="preserve">0,6873</w:t>
             </w:r>
           </w:p>
         </w:tc>
@@ -12358,7 +12358,7 @@
                 <w:sz w:val="19"/>
                 <w:szCs w:val="19"/>
               </w:rPr>
-              <w:t xml:space="preserve">0,9329</w:t>
+              <w:t xml:space="preserve">0,9330</w:t>
             </w:r>
           </w:p>
         </w:tc>
@@ -12390,7 +12390,7 @@
                 <w:sz w:val="19"/>
                 <w:szCs w:val="19"/>
               </w:rPr>
-              <w:t xml:space="preserve">0,6923</w:t>
+              <w:t xml:space="preserve">0,6897</w:t>
             </w:r>
           </w:p>
         </w:tc>
@@ -12557,7 +12557,7 @@
                 <w:sz w:val="19"/>
                 <w:szCs w:val="19"/>
               </w:rPr>
-              <w:t xml:space="preserve">0,9337</w:t>
+              <w:t xml:space="preserve">0,9338</w:t>
             </w:r>
           </w:p>
         </w:tc>
@@ -12589,7 +12589,7 @@
                 <w:sz w:val="19"/>
                 <w:szCs w:val="19"/>
               </w:rPr>
-              <w:t xml:space="preserve">0,6950</w:t>
+              <w:t xml:space="preserve">0,6923</w:t>
             </w:r>
           </w:p>
         </w:tc>
@@ -12812,7 +12812,7 @@
         <w:t xml:space="preserve">hanya dengan data asli</w:t>
       </w:r>
       <w:r>
-        <w:t xml:space="preserve"> (2 akun, 1.192 baris, 161 kelas positif pada tugas B). Data dibagi per siklus pity menjadi 5 bagian (GroupKFold 5-fold, 20 siklus), sehingga pull dari satu siklus tidak pernah berada di data latih dan data uji sekaligus. Hasilnya ditunjukkan pada Tabel 4.4 dan Gambar 4.8.</w:t>
+        <w:t xml:space="preserve"> (2 akun, 1.209 baris, 162 kelas positif pada tugas B). Data dibagi per siklus pity menjadi 5 bagian (GroupKFold 5-fold, 20 siklus), sehingga pull dari satu siklus tidak pernah berada di data latih dan data uji sekaligus. Hasilnya ditunjukkan pada Tabel 4.4 dan Gambar 4.8.</w:t>
       </w:r>
     </w:p>
     <w:p>
@@ -13133,7 +13133,7 @@
                 <w:sz w:val="19"/>
                 <w:szCs w:val="19"/>
               </w:rPr>
-              <w:t xml:space="preserve">0,8639 ± 0,0334</w:t>
+              <w:t xml:space="preserve">0,8657 ± 0,0289</w:t>
             </w:r>
           </w:p>
         </w:tc>
@@ -13261,7 +13261,7 @@
                 <w:sz w:val="19"/>
                 <w:szCs w:val="19"/>
               </w:rPr>
-              <w:t xml:space="preserve">2,1940</w:t>
+              <w:t xml:space="preserve">2,1651</w:t>
             </w:r>
           </w:p>
         </w:tc>
@@ -13330,7 +13330,7 @@
                 <w:sz w:val="19"/>
                 <w:szCs w:val="19"/>
               </w:rPr>
-              <w:t xml:space="preserve">0,9356 ± 0,0303</w:t>
+              <w:t xml:space="preserve">0,9368 ± 0,0318</w:t>
             </w:r>
           </w:p>
         </w:tc>
@@ -13362,7 +13362,7 @@
                 <w:sz w:val="19"/>
                 <w:szCs w:val="19"/>
               </w:rPr>
-              <w:t xml:space="preserve">0,7873</w:t>
+              <w:t xml:space="preserve">0,7854</w:t>
             </w:r>
           </w:p>
         </w:tc>
@@ -13394,7 +13394,7 @@
                 <w:sz w:val="19"/>
                 <w:szCs w:val="19"/>
               </w:rPr>
-              <w:t xml:space="preserve">0,6952</w:t>
+              <w:t xml:space="preserve">0,6964</w:t>
             </w:r>
           </w:p>
         </w:tc>
@@ -13426,7 +13426,7 @@
                 <w:sz w:val="19"/>
                 <w:szCs w:val="19"/>
               </w:rPr>
-              <w:t xml:space="preserve">0,8160</w:t>
+              <w:t xml:space="preserve">0,8205</w:t>
             </w:r>
           </w:p>
         </w:tc>
@@ -13458,7 +13458,7 @@
                 <w:sz w:val="19"/>
                 <w:szCs w:val="19"/>
               </w:rPr>
-              <w:t xml:space="preserve">0,2318</w:t>
+              <w:t xml:space="preserve">0,2281</w:t>
             </w:r>
           </w:p>
         </w:tc>
@@ -13527,7 +13527,7 @@
                 <w:sz w:val="19"/>
                 <w:szCs w:val="19"/>
               </w:rPr>
-              <w:t xml:space="preserve">0,8798 ± 0,0296</w:t>
+              <w:t xml:space="preserve">0,8788 ± 0,0299</w:t>
             </w:r>
           </w:p>
         </w:tc>
@@ -13561,7 +13561,7 @@
                 <w:sz w:val="19"/>
                 <w:szCs w:val="19"/>
               </w:rPr>
-              <w:t xml:space="preserve">0,8368</w:t>
+              <w:t xml:space="preserve">0,8317</w:t>
             </w:r>
           </w:p>
         </w:tc>
@@ -13593,7 +13593,7 @@
                 <w:sz w:val="19"/>
                 <w:szCs w:val="19"/>
               </w:rPr>
-              <w:t xml:space="preserve">0,6257</w:t>
+              <w:t xml:space="preserve">0,6178</w:t>
             </w:r>
           </w:p>
         </w:tc>
@@ -13625,7 +13625,7 @@
                 <w:sz w:val="19"/>
                 <w:szCs w:val="19"/>
               </w:rPr>
-              <w:t xml:space="preserve">0,9049</w:t>
+              <w:t xml:space="preserve">0,8964</w:t>
             </w:r>
           </w:p>
         </w:tc>
@@ -13657,7 +13657,7 @@
                 <w:sz w:val="19"/>
                 <w:szCs w:val="19"/>
               </w:rPr>
-              <w:t xml:space="preserve">0,3673</w:t>
+              <w:t xml:space="preserve">0,3690</w:t>
             </w:r>
           </w:p>
         </w:tc>
@@ -13726,7 +13726,7 @@
                 <w:sz w:val="19"/>
                 <w:szCs w:val="19"/>
               </w:rPr>
-              <w:t xml:space="preserve">0,8741 ± 0,0287</w:t>
+              <w:t xml:space="preserve">0,8742 ± 0,0224</w:t>
             </w:r>
           </w:p>
         </w:tc>
@@ -13758,7 +13758,7 @@
                 <w:sz w:val="19"/>
                 <w:szCs w:val="19"/>
               </w:rPr>
-              <w:t xml:space="preserve">0,5300</w:t>
+              <w:t xml:space="preserve">0,5250</w:t>
             </w:r>
           </w:p>
         </w:tc>
@@ -13790,7 +13790,7 @@
                 <w:sz w:val="19"/>
                 <w:szCs w:val="19"/>
               </w:rPr>
-              <w:t xml:space="preserve">0,0923</w:t>
+              <w:t xml:space="preserve">0,0800</w:t>
             </w:r>
           </w:p>
         </w:tc>
@@ -13822,7 +13822,7 @@
                 <w:sz w:val="19"/>
                 <w:szCs w:val="19"/>
               </w:rPr>
-              <w:t xml:space="preserve">0,8762</w:t>
+              <w:t xml:space="preserve">0,8609</w:t>
             </w:r>
           </w:p>
         </w:tc>
@@ -13854,7 +13854,7 @@
                 <w:sz w:val="19"/>
                 <w:szCs w:val="19"/>
               </w:rPr>
-              <w:t xml:space="preserve">0,4909</w:t>
+              <w:t xml:space="preserve">0,4975</w:t>
             </w:r>
           </w:p>
         </w:tc>
@@ -13923,7 +13923,7 @@
                 <w:sz w:val="19"/>
                 <w:szCs w:val="19"/>
               </w:rPr>
-              <w:t xml:space="preserve">0,9101 ± 0,0447</w:t>
+              <w:t xml:space="preserve">0,9069 ± 0,0429</w:t>
             </w:r>
           </w:p>
         </w:tc>
@@ -13955,7 +13955,7 @@
                 <w:sz w:val="19"/>
                 <w:szCs w:val="19"/>
               </w:rPr>
-              <w:t xml:space="preserve">0,7554</w:t>
+              <w:t xml:space="preserve">0,7348</w:t>
             </w:r>
           </w:p>
         </w:tc>
@@ -13987,7 +13987,7 @@
                 <w:sz w:val="19"/>
                 <w:szCs w:val="19"/>
               </w:rPr>
-              <w:t xml:space="preserve">0,5606</w:t>
+              <w:t xml:space="preserve">0,5335</w:t>
             </w:r>
           </w:p>
         </w:tc>
@@ -14019,7 +14019,7 @@
                 <w:sz w:val="19"/>
                 <w:szCs w:val="19"/>
               </w:rPr>
-              <w:t xml:space="preserve">0,9087</w:t>
+              <w:t xml:space="preserve">0,8998</w:t>
             </w:r>
           </w:p>
         </w:tc>
@@ -14051,7 +14051,7 @@
                 <w:sz w:val="19"/>
                 <w:szCs w:val="19"/>
               </w:rPr>
-              <w:t xml:space="preserve">0,2889</w:t>
+              <w:t xml:space="preserve">0,2879</w:t>
             </w:r>
           </w:p>
         </w:tc>
@@ -14122,7 +14122,7 @@
                 <w:sz w:val="19"/>
                 <w:szCs w:val="19"/>
               </w:rPr>
-              <w:t xml:space="preserve">0,9298 ± 0,0253</w:t>
+              <w:t xml:space="preserve">0,9310 ± 0,0291</w:t>
             </w:r>
           </w:p>
         </w:tc>
@@ -14154,7 +14154,7 @@
                 <w:sz w:val="19"/>
                 <w:szCs w:val="19"/>
               </w:rPr>
-              <w:t xml:space="preserve">0,7838</w:t>
+              <w:t xml:space="preserve">0,7835</w:t>
             </w:r>
           </w:p>
         </w:tc>
@@ -14188,7 +14188,7 @@
                 <w:sz w:val="19"/>
                 <w:szCs w:val="19"/>
               </w:rPr>
-              <w:t xml:space="preserve">0,6799</w:t>
+              <w:t xml:space="preserve">0,6819</w:t>
             </w:r>
           </w:p>
         </w:tc>
@@ -14220,7 +14220,7 @@
                 <w:sz w:val="19"/>
                 <w:szCs w:val="19"/>
               </w:rPr>
-              <w:t xml:space="preserve">0,9079</w:t>
+              <w:t xml:space="preserve">0,9021</w:t>
             </w:r>
           </w:p>
         </w:tc>
@@ -14252,7 +14252,7 @@
                 <w:sz w:val="19"/>
                 <w:szCs w:val="19"/>
               </w:rPr>
-              <w:t xml:space="preserve">0,3490</w:t>
+              <w:t xml:space="preserve">0,3521</w:t>
             </w:r>
           </w:p>
         </w:tc>
@@ -14321,7 +14321,7 @@
                 <w:sz w:val="19"/>
                 <w:szCs w:val="19"/>
               </w:rPr>
-              <w:t xml:space="preserve">0,9287 ± 0,0221</w:t>
+              <w:t xml:space="preserve">0,9299 ± 0,0264</w:t>
             </w:r>
           </w:p>
         </w:tc>
@@ -14353,7 +14353,7 @@
                 <w:sz w:val="19"/>
                 <w:szCs w:val="19"/>
               </w:rPr>
-              <w:t xml:space="preserve">0,7726</w:t>
+              <w:t xml:space="preserve">0,7696</w:t>
             </w:r>
           </w:p>
         </w:tc>
@@ -14385,7 +14385,7 @@
                 <w:sz w:val="19"/>
                 <w:szCs w:val="19"/>
               </w:rPr>
-              <w:t xml:space="preserve">0,6721</w:t>
+              <w:t xml:space="preserve">0,6720</w:t>
             </w:r>
           </w:p>
         </w:tc>
@@ -14419,7 +14419,7 @@
                 <w:sz w:val="19"/>
                 <w:szCs w:val="19"/>
               </w:rPr>
-              <w:t xml:space="preserve">0,9293</w:t>
+              <w:t xml:space="preserve">0,9258</w:t>
             </w:r>
           </w:p>
         </w:tc>
@@ -14453,7 +14453,7 @@
                 <w:sz w:val="19"/>
                 <w:szCs w:val="19"/>
               </w:rPr>
-              <w:t xml:space="preserve">0,2409</w:t>
+              <w:t xml:space="preserve">0,2321</w:t>
             </w:r>
           </w:p>
         </w:tc>
@@ -14522,7 +14522,7 @@
                 <w:sz w:val="19"/>
                 <w:szCs w:val="19"/>
               </w:rPr>
-              <w:t xml:space="preserve">0,9261 ± 0,0334</w:t>
+              <w:t xml:space="preserve">0,9222 ± 0,0348</w:t>
             </w:r>
           </w:p>
         </w:tc>
@@ -14554,7 +14554,7 @@
                 <w:sz w:val="19"/>
                 <w:szCs w:val="19"/>
               </w:rPr>
-              <w:t xml:space="preserve">0,7771</w:t>
+              <w:t xml:space="preserve">0,7678</w:t>
             </w:r>
           </w:p>
         </w:tc>
@@ -14586,7 +14586,7 @@
                 <w:sz w:val="19"/>
                 <w:szCs w:val="19"/>
               </w:rPr>
-              <w:t xml:space="preserve">0,6508</w:t>
+              <w:t xml:space="preserve">0,6370</w:t>
             </w:r>
           </w:p>
         </w:tc>
@@ -14618,7 +14618,7 @@
                 <w:sz w:val="19"/>
                 <w:szCs w:val="19"/>
               </w:rPr>
-              <w:t xml:space="preserve">0,9279</w:t>
+              <w:t xml:space="preserve">0,9257</w:t>
             </w:r>
           </w:p>
         </w:tc>
@@ -14650,7 +14650,7 @@
                 <w:sz w:val="19"/>
                 <w:szCs w:val="19"/>
               </w:rPr>
-              <w:t xml:space="preserve">0,2470</w:t>
+              <w:t xml:space="preserve">0,2495</w:t>
             </w:r>
           </w:p>
         </w:tc>
@@ -14738,7 +14738,7 @@
         <w:t xml:space="preserve">Decision Tree</w:t>
       </w:r>
       <w:r>
-        <w:t xml:space="preserve"> mencapai akurasi tertinggi (92,98%), diikuti Random Forest (92,87%) dan XGBoost (92,61%). Urutan ini sama dengan hasil pada data simulasi, dan selisihnya dengan batas teori Markov Chain (93,56%) kurang dari 1%.</w:t>
+        <w:t xml:space="preserve"> mencapai akurasi tertinggi (93,10%), diikuti Random Forest (92,99%) dan XGBoost (92,22%). Urutan ini sama dengan hasil pada data simulasi, dan selisih Decision Tree dengan batas teori Markov Chain (93,68%) kurang dari 1%.</w:t>
       </w:r>
     </w:p>
     <w:p>
@@ -14759,7 +14759,7 @@
         <w:t xml:space="preserve">Logistic Regression</w:t>
       </w:r>
       <w:r>
-        <w:t xml:space="preserve"> mencapai 91,01%, tetap di bawah model berbasis pohon.</w:t>
+        <w:t xml:space="preserve"> mencapai 90,69%, tetap di bawah model berbasis pohon.</w:t>
       </w:r>
     </w:p>
     <w:p>
@@ -14780,7 +14780,7 @@
         <w:t xml:space="preserve">Naive Bayes</w:t>
       </w:r>
       <w:r>
-        <w:t xml:space="preserve"> hanya 87,98%, tetapi Balanced Accuracy-nya tertinggi (0,8368) karena lebih sering menebak "dapat S-Rank" (recall ±0,77). Ini menunjukkan </w:t>
+        <w:t xml:space="preserve"> hanya 87,88%, tetapi Balanced Accuracy-nya tertinggi (0,8317) karena lebih sering menebak "dapat S-Rank" (recall ±0,76). Ini menunjukkan </w:t>
       </w:r>
       <w:r>
         <w:rPr>
@@ -14811,7 +14811,7 @@
         <w:t xml:space="preserve">KNN</w:t>
       </w:r>
       <w:r>
-        <w:t xml:space="preserve"> turun menjadi 87,41%, hampir sama dengan baseline. Nilai k = 101 tetangga terlalu besar untuk data latih ±950 baris yang hanya memuat ±130 kelas positif, sehingga tetangga terdekat hampir selalu didominasi kelas mayoritas. Hal ini menunjukkan bahwa </w:t>
+        <w:t xml:space="preserve"> turun menjadi 87,42%, hampir sama dengan baseline. Nilai k = 101 tetangga terlalu besar untuk data latih ±970 baris yang hanya memuat ±130 kelas positif, sehingga tetangga terdekat hampir selalu didominasi kelas mayoritas. Hal ini menunjukkan bahwa </w:t>
       </w:r>
       <w:r>
         <w:rPr>
@@ -15013,7 +15013,7 @@
         <w:t xml:space="preserve">Tidak bergantung pada simulasi.</w:t>
       </w:r>
       <w:r>
-        <w:t xml:space="preserve"> Ketika dilatih dan diuji dengan data asli saja (1.192 baris), model berbasis pohon tetap terbaik (±92,6–93,0%). Kesimpulan penelitian tidak berubah walaupun data simulasi tidak dipakai sama sekali.</w:t>
+        <w:t xml:space="preserve"> Ketika dilatih dan diuji dengan data asli saja (1.209 baris), model berbasis pohon tetap terbaik (±92,2–93,1%). Kesimpulan penelitian tidak berubah walaupun data simulasi tidak dipakai sama sekali.</w:t>
       </w:r>
     </w:p>
     <w:p>
@@ -15192,7 +15192,7 @@
         <w:jc w:val="both"/>
       </w:pPr>
       <w:r>
-        <w:t xml:space="preserve">Untuk memprediksi S-Rank dalam 10 pull berikutnya, Decision Tree, Random Forest, XGBoost, dan KNN memberikan akurasi tertinggi (±91,1% pada simulasi, ±93,3–93,5% pada data asli), hampir menyamai batas teori. Logistic Regression (±88,9%) dan Naive Bayes (±85,7%) lebih rendah. Saat dilatih dan diuji hanya dengan data asli (1.192 baris), Decision Tree tetap tertinggi (92,98%), diikuti Random Forest dan XGBoost.</w:t>
+        <w:t xml:space="preserve">Untuk memprediksi S-Rank dalam 10 pull berikutnya, Decision Tree, Random Forest, XGBoost, dan KNN memberikan akurasi tertinggi (±91,1% pada simulasi, ±93,3–93,5% pada data asli), hampir menyamai batas teori. Logistic Regression (±88,9%) dan Naive Bayes (±85,7%) lebih rendah. Saat dilatih dan diuji hanya dengan data asli (1.209 baris), Decision Tree tetap tertinggi (93,10%), diikuti Random Forest dan XGBoost.</w:t>
       </w:r>
     </w:p>
     <w:p>

</xml_diff>

<commit_message>
Latih ulang dengan 3 akun asli dan perbarui dokumen
- Model dan report dilatih ulang dengan 3 akun asli (1.751 pull, 28 S-Rank;
  eksperimen data asli 1.425 baris, 25 siklus pity).
- Hasil data asli: Random Forest dan Decision Tree teratas (±92,3%), selisih
  antaralgoritma belum signifikan; hanya baseline yang nyata lebih rendah.
- Temuan baru: KNN dan XGBoost tidak stabil di satu fold karena data latihnya
  hanya punya satu siklus Agent guaranteed, sehingga keduanya mempelajari pola
  keliru dari fitur guaranteed. Dijelaskan di laporan, slide, dan PANDUAN.
- Grafik, tangkapan layar, LAPORAN.md, README, dan tanya jawab diperbarui;
  caption KNN di aplikasi diganti penjelasan umum tentang nested grid search.
</commit_message>
<xml_diff>
--- a/docs/tugas/UAS_Laporan_Akhir_Kelompok6_A11.4502.docx
+++ b/docs/tugas/UAS_Laporan_Akhir_Kelompok6_A11.4502.docx
@@ -2313,7 +2313,7 @@
         <w:t xml:space="preserve">Gambar 4.10 Kurva peluang mendapat S-Rank dalam 10 pull menurut setiap model</w:t>
       </w:r>
       <w:r>
-        <w:t xml:space="preserve">	30</w:t>
+        <w:t xml:space="preserve">	31</w:t>
       </w:r>
     </w:p>
     <w:p>
@@ -6557,7 +6557,7 @@
                 <w:sz w:val="20"/>
                 <w:szCs w:val="20"/>
               </w:rPr>
-              <w:t xml:space="preserve">2 akun (anggota kelompok dan teman), 1.441 pull, 22 S-Rank; anonim tanpa UID, nama item, dan waktu</w:t>
+              <w:t xml:space="preserve">3 akun (anggota kelompok dan teman), 1.751 pull, 28 S-Rank; anonim tanpa UID, nama item, dan waktu</w:t>
             </w:r>
           </w:p>
         </w:tc>
@@ -6623,7 +6623,7 @@
         <w:t xml:space="preserve">hanya dengan data asli</w:t>
       </w:r>
       <w:r>
-        <w:t xml:space="preserve"> (1.209 baris setelah pembersihan). Eksperimen ini memastikan bahwa hasil perbandingan tidak bergantung pada data simulasi, dan jumlah barisnya sudah memenuhi ketentuan dataset tabel minimal 500–1.000 baris.</w:t>
+        <w:t xml:space="preserve"> (1.425 baris setelah pembersihan). Eksperimen ini memastikan bahwa hasil perbandingan tidak bergantung pada data simulasi, dan jumlah barisnya sudah memenuhi ketentuan dataset tabel minimal 500–1.000 baris.</w:t>
       </w:r>
     </w:p>
     <w:p>
@@ -8355,7 +8355,7 @@
           <w:b/>
           <w:bCs/>
         </w:rPr>
-        <w:t xml:space="preserve">data asli 2 akun</w:t>
+        <w:t xml:space="preserve">data asli 3 akun</w:t>
       </w:r>
       <w:r>
         <w:t xml:space="preserve"> yang tidak pernah dipakai saat pelatihan.</w:t>
@@ -8379,7 +8379,7 @@
         <w:t xml:space="preserve">Eksperimen kedua:</w:t>
       </w:r>
       <w:r>
-        <w:t xml:space="preserve"> keenam algoritma dilatih dan diuji hanya dengan data asli (±1.200 baris) memakai GroupKFold 5-fold yang dibagi per </w:t>
+        <w:t xml:space="preserve"> keenam algoritma dilatih dan diuji hanya dengan data asli (1.425 baris) memakai GroupKFold 5-fold yang dibagi per </w:t>
       </w:r>
       <w:r>
         <w:rPr>
@@ -8389,7 +8389,7 @@
         <w:t xml:space="preserve">siklus pity</w:t>
       </w:r>
       <w:r>
-        <w:t xml:space="preserve"> (20 siklus). Pembagian per siklus dipakai karena data asli hanya berasal dari 2 akun, dan siklus pity saling bebas karena peluang selalu kembali ke awal setelah mendapat S-Rank. Hyperparameter pada eksperimen ini dipilih dengan </w:t>
+        <w:t xml:space="preserve"> (25 siklus). Pembagian per siklus dipakai karena data asli hanya berasal dari 3 akun, dan siklus pity saling bebas karena peluang selalu kembali ke awal setelah mendapat S-Rank. Hyperparameter pada eksperimen ini dipilih dengan </w:t>
       </w:r>
       <w:r>
         <w:rPr>
@@ -9411,7 +9411,7 @@
         <w:jc w:val="both"/>
       </w:pPr>
       <w:r>
-        <w:t xml:space="preserve">Riwayat dua akun asli diambil melalui skrip PowerShell dari permainan versi Steam. Pada saat pengecekan, pity yang dihitung aplikasi untuk akun pertama, yaitu 70/90 pada banner Agent dan 46/80 dengan status guaranteed pada banner W-Engine, </w:t>
+        <w:t xml:space="preserve">Riwayat tiga akun asli diambil melalui skrip PowerShell. Pada saat pengecekan, pity yang dihitung aplikasi untuk akun pertama (permainan versi Steam), yaitu 70/90 pada banner Agent dan 46/80 dengan status guaranteed pada banner W-Engine, </w:t>
       </w:r>
       <w:r>
         <w:rPr>
@@ -9666,7 +9666,7 @@
                 <w:sz w:val="20"/>
                 <w:szCs w:val="20"/>
               </w:rPr>
-              <w:t xml:space="preserve">2</w:t>
+              <w:t xml:space="preserve">3</w:t>
             </w:r>
           </w:p>
         </w:tc>
@@ -9767,7 +9767,7 @@
                 <w:sz w:val="20"/>
                 <w:szCs w:val="20"/>
               </w:rPr>
-              <w:t xml:space="preserve">1.245</w:t>
+              <w:t xml:space="preserve">1.479</w:t>
             </w:r>
           </w:p>
         </w:tc>
@@ -9868,7 +9868,7 @@
                 <w:sz w:val="20"/>
                 <w:szCs w:val="20"/>
               </w:rPr>
-              <w:t xml:space="preserve">1.209</w:t>
+              <w:t xml:space="preserve">1.425</w:t>
             </w:r>
           </w:p>
         </w:tc>
@@ -9969,7 +9969,7 @@
                 <w:sz w:val="20"/>
                 <w:szCs w:val="20"/>
               </w:rPr>
-              <w:t xml:space="preserve">1,4%</w:t>
+              <w:t xml:space="preserve">1,5%</w:t>
             </w:r>
           </w:p>
         </w:tc>
@@ -10070,7 +10070,7 @@
                 <w:sz w:val="20"/>
                 <w:szCs w:val="20"/>
               </w:rPr>
-              <w:t xml:space="preserve">13,4%</w:t>
+              <w:t xml:space="preserve">13,5%</w:t>
             </w:r>
           </w:p>
         </w:tc>
@@ -10171,7 +10171,7 @@
                 <w:sz w:val="20"/>
                 <w:szCs w:val="20"/>
               </w:rPr>
-              <w:t xml:space="preserve">– / 1.209</w:t>
+              <w:t xml:space="preserve">– / 1.425</w:t>
             </w:r>
           </w:p>
         </w:tc>
@@ -10373,7 +10373,7 @@
                 <w:sz w:val="20"/>
                 <w:szCs w:val="20"/>
               </w:rPr>
-              <w:t xml:space="preserve">1.209 baris, 20 siklus, 5-fold</w:t>
+              <w:t xml:space="preserve">1.425 baris, 25 siklus, 5-fold</w:t>
             </w:r>
           </w:p>
         </w:tc>
@@ -13757,7 +13757,7 @@
                 <w:sz w:val="19"/>
                 <w:szCs w:val="19"/>
               </w:rPr>
-              <w:t xml:space="preserve">0,8660</w:t>
+              <w:t xml:space="preserve">0,8646</w:t>
             </w:r>
           </w:p>
         </w:tc>
@@ -13954,7 +13954,7 @@
                 <w:sz w:val="19"/>
                 <w:szCs w:val="19"/>
               </w:rPr>
-              <w:t xml:space="preserve">0,9355</w:t>
+              <w:t xml:space="preserve">0,9263</w:t>
             </w:r>
           </w:p>
         </w:tc>
@@ -13986,7 +13986,7 @@
                 <w:sz w:val="19"/>
                 <w:szCs w:val="19"/>
               </w:rPr>
-              <w:t xml:space="preserve">0,7023</w:t>
+              <w:t xml:space="preserve">0,6465</w:t>
             </w:r>
           </w:p>
         </w:tc>
@@ -14151,7 +14151,7 @@
                 <w:sz w:val="19"/>
                 <w:szCs w:val="19"/>
               </w:rPr>
-              <w:t xml:space="preserve">0,9107</w:t>
+              <w:t xml:space="preserve">0,9074</w:t>
             </w:r>
           </w:p>
         </w:tc>
@@ -14183,7 +14183,7 @@
                 <w:sz w:val="19"/>
                 <w:szCs w:val="19"/>
               </w:rPr>
-              <w:t xml:space="preserve">0,6000</w:t>
+              <w:t xml:space="preserve">0,5714</w:t>
             </w:r>
           </w:p>
         </w:tc>
@@ -14350,7 +14350,7 @@
                 <w:sz w:val="19"/>
                 <w:szCs w:val="19"/>
               </w:rPr>
-              <w:t xml:space="preserve">0,9313</w:t>
+              <w:t xml:space="preserve">0,9228</w:t>
             </w:r>
           </w:p>
         </w:tc>
@@ -14382,7 +14382,7 @@
                 <w:sz w:val="19"/>
                 <w:szCs w:val="19"/>
               </w:rPr>
-              <w:t xml:space="preserve">0,6770</w:t>
+              <w:t xml:space="preserve">0,6233</w:t>
             </w:r>
           </w:p>
         </w:tc>
@@ -14547,7 +14547,7 @@
                 <w:sz w:val="19"/>
                 <w:szCs w:val="19"/>
               </w:rPr>
-              <w:t xml:space="preserve">0,9115</w:t>
+              <w:t xml:space="preserve">0,9032</w:t>
             </w:r>
           </w:p>
         </w:tc>
@@ -14579,7 +14579,7 @@
                 <w:sz w:val="19"/>
                 <w:szCs w:val="19"/>
               </w:rPr>
-              <w:t xml:space="preserve">0,5114</w:t>
+              <w:t xml:space="preserve">0,4480</w:t>
             </w:r>
           </w:p>
         </w:tc>
@@ -14748,7 +14748,7 @@
                 <w:sz w:val="19"/>
                 <w:szCs w:val="19"/>
               </w:rPr>
-              <w:t xml:space="preserve">0,9330</w:t>
+              <w:t xml:space="preserve">0,9242</w:t>
             </w:r>
           </w:p>
         </w:tc>
@@ -14780,7 +14780,7 @@
                 <w:sz w:val="19"/>
                 <w:szCs w:val="19"/>
               </w:rPr>
-              <w:t xml:space="preserve">0,6873</w:t>
+              <w:t xml:space="preserve">0,6327</w:t>
             </w:r>
           </w:p>
         </w:tc>
@@ -14947,7 +14947,7 @@
                 <w:sz w:val="19"/>
                 <w:szCs w:val="19"/>
               </w:rPr>
-              <w:t xml:space="preserve">0,9330</w:t>
+              <w:t xml:space="preserve">0,9242</w:t>
             </w:r>
           </w:p>
         </w:tc>
@@ -14979,7 +14979,7 @@
                 <w:sz w:val="19"/>
                 <w:szCs w:val="19"/>
               </w:rPr>
-              <w:t xml:space="preserve">0,6897</w:t>
+              <w:t xml:space="preserve">0,6351</w:t>
             </w:r>
           </w:p>
         </w:tc>
@@ -15148,7 +15148,7 @@
                 <w:sz w:val="19"/>
                 <w:szCs w:val="19"/>
               </w:rPr>
-              <w:t xml:space="preserve">0,9338</w:t>
+              <w:t xml:space="preserve">0,9249</w:t>
             </w:r>
           </w:p>
         </w:tc>
@@ -15182,7 +15182,7 @@
                 <w:sz w:val="19"/>
                 <w:szCs w:val="19"/>
               </w:rPr>
-              <w:t xml:space="preserve">0,6923</w:t>
+              <w:t xml:space="preserve">0,6373</w:t>
             </w:r>
           </w:p>
         </w:tc>
@@ -15196,7 +15196,7 @@
         <w:jc w:val="both"/>
       </w:pPr>
       <w:r>
-        <w:t xml:space="preserve">Angka tebal adalah nilai terbaik di antara keenam algoritma. Pada data simulasi, Decision Tree, Random Forest, dan XGBoost memperoleh akurasi 0,9108, diikuti KNN (0,9105). Menurut uji signifikansi (Subbab 4.7), keempatnya tidak berbeda nyata, sedangkan Naive Bayes (0,8920) dan Logistic Regression (0,8888) nyata lebih rendah. Akurasi pada data asli terlihat lebih tinggi (±93%) karena proporsi kelas positifnya lebih kecil (13,4% dibanding 16,6%), sehingga baseline pun naik dari 83,4% menjadi 86,6%. Dibandingkan dengan baseline masing-masing, keunggulan model terbaik sama-sama sekitar 7 poin.</w:t>
+        <w:t xml:space="preserve">Angka tebal adalah nilai terbaik di antara keenam algoritma. Pada data simulasi, Decision Tree, Random Forest, dan XGBoost memperoleh akurasi 0,9108, diikuti KNN (0,9105). Menurut uji signifikansi (Subbab 4.7), keempatnya tidak berbeda nyata, sedangkan Naive Bayes (0,8920) dan Logistic Regression (0,8888) nyata lebih rendah. Akurasi pada data asli terlihat lebih tinggi (±92%) karena proporsi kelas positifnya lebih kecil (13,5% dibanding 16,6%), sehingga baseline pun naik dari 83,4% menjadi 86,5%. Dibandingkan dengan baseline masing-masing, keunggulan model terbaik adalah 7,7 poin di simulasi dan 6,0 poin di data asli.</w:t>
       </w:r>
     </w:p>
     <w:p>
@@ -15415,7 +15415,7 @@
         <w:t xml:space="preserve">hanya dengan data asli</w:t>
       </w:r>
       <w:r>
-        <w:t xml:space="preserve"> (2 akun, 1.209 baris, 162 kelas positif pada tugas B). Data dibagi per siklus pity menjadi 5 bagian (GroupKFold 5-fold, 20 siklus), sehingga pull dari satu siklus tidak pernah berada di data latih dan data uji sekaligus. Hyperparameter dipilih ulang dengan grid search di dalam data latih setiap fold (</w:t>
+        <w:t xml:space="preserve"> (3 akun, 1.425 baris, 193 kelas positif pada tugas B). Data dibagi per siklus pity menjadi 5 bagian (GroupKFold 5-fold, 25 siklus), sehingga pull dari satu siklus tidak pernah berada di data latih dan data uji sekaligus. Hyperparameter dipilih ulang dengan grid search di dalam data latih setiap fold (</w:t>
       </w:r>
       <w:r>
         <w:rPr>
@@ -15746,7 +15746,7 @@
                 <w:sz w:val="19"/>
                 <w:szCs w:val="19"/>
               </w:rPr>
-              <w:t xml:space="preserve">0,8657 ± 0,0289</w:t>
+              <w:t xml:space="preserve">0,8645 ± 0,0119</w:t>
             </w:r>
           </w:p>
         </w:tc>
@@ -15874,7 +15874,7 @@
                 <w:sz w:val="19"/>
                 <w:szCs w:val="19"/>
               </w:rPr>
-              <w:t xml:space="preserve">2,1651</w:t>
+              <w:t xml:space="preserve">2,1835</w:t>
             </w:r>
           </w:p>
         </w:tc>
@@ -15943,7 +15943,7 @@
                 <w:sz w:val="19"/>
                 <w:szCs w:val="19"/>
               </w:rPr>
-              <w:t xml:space="preserve">0,9368 ± 0,0318</w:t>
+              <w:t xml:space="preserve">0,9264 ± 0,0149</w:t>
             </w:r>
           </w:p>
         </w:tc>
@@ -15975,7 +15975,7 @@
                 <w:sz w:val="19"/>
                 <w:szCs w:val="19"/>
               </w:rPr>
-              <w:t xml:space="preserve">0,7854</w:t>
+              <w:t xml:space="preserve">0,7470</w:t>
             </w:r>
           </w:p>
         </w:tc>
@@ -16007,7 +16007,7 @@
                 <w:sz w:val="19"/>
                 <w:szCs w:val="19"/>
               </w:rPr>
-              <w:t xml:space="preserve">0,6964</w:t>
+              <w:t xml:space="preserve">0,6389</w:t>
             </w:r>
           </w:p>
         </w:tc>
@@ -16039,7 +16039,7 @@
                 <w:sz w:val="19"/>
                 <w:szCs w:val="19"/>
               </w:rPr>
-              <w:t xml:space="preserve">0,8205</w:t>
+              <w:t xml:space="preserve">0,7825</w:t>
             </w:r>
           </w:p>
         </w:tc>
@@ -16071,7 +16071,7 @@
                 <w:sz w:val="19"/>
                 <w:szCs w:val="19"/>
               </w:rPr>
-              <w:t xml:space="preserve">0,2281</w:t>
+              <w:t xml:space="preserve">0,2527</w:t>
             </w:r>
           </w:p>
         </w:tc>
@@ -16140,7 +16140,7 @@
                 <w:sz w:val="19"/>
                 <w:szCs w:val="19"/>
               </w:rPr>
-              <w:t xml:space="preserve">0,9147 ± 0,0291</w:t>
+              <w:t xml:space="preserve">0,9073 ± 0,0101</w:t>
             </w:r>
           </w:p>
         </w:tc>
@@ -16172,7 +16172,7 @@
                 <w:sz w:val="19"/>
                 <w:szCs w:val="19"/>
               </w:rPr>
-              <w:t xml:space="preserve">0,7081</w:t>
+              <w:t xml:space="preserve">0,6765</w:t>
             </w:r>
           </w:p>
         </w:tc>
@@ -16204,7 +16204,7 @@
                 <w:sz w:val="19"/>
                 <w:szCs w:val="19"/>
               </w:rPr>
-              <w:t xml:space="preserve">0,5613</w:t>
+              <w:t xml:space="preserve">0,5108</w:t>
             </w:r>
           </w:p>
         </w:tc>
@@ -16236,7 +16236,7 @@
                 <w:sz w:val="19"/>
                 <w:szCs w:val="19"/>
               </w:rPr>
-              <w:t xml:space="preserve">0,8863</w:t>
+              <w:t xml:space="preserve">0,8455</w:t>
             </w:r>
           </w:p>
         </w:tc>
@@ -16265,10 +16265,12 @@
             </w:pPr>
             <w:r>
               <w:rPr>
+                <w:b/>
+                <w:bCs/>
                 <w:sz w:val="19"/>
                 <w:szCs w:val="19"/>
               </w:rPr>
-              <w:t xml:space="preserve">0,2845</w:t>
+              <w:t xml:space="preserve">0,2847</w:t>
             </w:r>
           </w:p>
         </w:tc>
@@ -16337,7 +16339,7 @@
                 <w:sz w:val="19"/>
                 <w:szCs w:val="19"/>
               </w:rPr>
-              <w:t xml:space="preserve">0,9095 ± 0,0316</w:t>
+              <w:t xml:space="preserve">0,8529 ± 0,1024</w:t>
             </w:r>
           </w:p>
         </w:tc>
@@ -16369,7 +16371,7 @@
                 <w:sz w:val="19"/>
                 <w:szCs w:val="19"/>
               </w:rPr>
-              <w:t xml:space="preserve">0,7008</w:t>
+              <w:t xml:space="preserve">0,6476</w:t>
             </w:r>
           </w:p>
         </w:tc>
@@ -16401,7 +16403,7 @@
                 <w:sz w:val="19"/>
                 <w:szCs w:val="19"/>
               </w:rPr>
-              <w:t xml:space="preserve">0,5515</w:t>
+              <w:t xml:space="preserve">0,4412</w:t>
             </w:r>
           </w:p>
         </w:tc>
@@ -16433,7 +16435,7 @@
                 <w:sz w:val="19"/>
                 <w:szCs w:val="19"/>
               </w:rPr>
-              <w:t xml:space="preserve">0,8515</w:t>
+              <w:t xml:space="preserve">0,7757</w:t>
             </w:r>
           </w:p>
         </w:tc>
@@ -16465,7 +16467,7 @@
                 <w:sz w:val="19"/>
                 <w:szCs w:val="19"/>
               </w:rPr>
-              <w:t xml:space="preserve">0,4947</w:t>
+              <w:t xml:space="preserve">0,7433</w:t>
             </w:r>
           </w:p>
         </w:tc>
@@ -16534,7 +16536,7 @@
                 <w:sz w:val="19"/>
                 <w:szCs w:val="19"/>
               </w:rPr>
-              <w:t xml:space="preserve">0,9134 ± 0,0462</w:t>
+              <w:t xml:space="preserve">0,9138 ± 0,0154</w:t>
             </w:r>
           </w:p>
         </w:tc>
@@ -16566,7 +16568,7 @@
                 <w:sz w:val="19"/>
                 <w:szCs w:val="19"/>
               </w:rPr>
-              <w:t xml:space="preserve">0,7336</w:t>
+              <w:t xml:space="preserve">0,7105</w:t>
             </w:r>
           </w:p>
         </w:tc>
@@ -16598,7 +16600,7 @@
                 <w:sz w:val="19"/>
                 <w:szCs w:val="19"/>
               </w:rPr>
-              <w:t xml:space="preserve">0,5503</w:t>
+              <w:t xml:space="preserve">0,5591</w:t>
             </w:r>
           </w:p>
         </w:tc>
@@ -16630,7 +16632,7 @@
                 <w:sz w:val="19"/>
                 <w:szCs w:val="19"/>
               </w:rPr>
-              <w:t xml:space="preserve">0,8939</w:t>
+              <w:t xml:space="preserve">0,8391</w:t>
             </w:r>
           </w:p>
         </w:tc>
@@ -16662,7 +16664,7 @@
                 <w:sz w:val="19"/>
                 <w:szCs w:val="19"/>
               </w:rPr>
-              <w:t xml:space="preserve">0,2886</w:t>
+              <w:t xml:space="preserve">0,2966</w:t>
             </w:r>
           </w:p>
         </w:tc>
@@ -16728,12 +16730,44 @@
             </w:pPr>
             <w:r>
               <w:rPr>
+                <w:sz w:val="19"/>
+                <w:szCs w:val="19"/>
+              </w:rPr>
+              <w:t xml:space="preserve">0,9229 ± 0,0110</w:t>
+            </w:r>
+          </w:p>
+        </w:tc>
+        <w:tc>
+          <w:tcPr>
+            <w:tcW w:type="dxa" w:w="953"/>
+            <w:tcBorders>
+              <w:top w:val="single" w:color="808080" w:sz="4"/>
+              <w:left w:val="single" w:color="808080" w:sz="4"/>
+              <w:bottom w:val="single" w:color="808080" w:sz="4"/>
+              <w:right w:val="single" w:color="808080" w:sz="4"/>
+            </w:tcBorders>
+            <w:tcMar>
+              <w:top w:type="dxa" w:w="60"/>
+              <w:left w:type="dxa" w:w="100"/>
+              <w:bottom w:type="dxa" w:w="60"/>
+              <w:right w:type="dxa" w:w="100"/>
+            </w:tcMar>
+          </w:tcPr>
+          <w:p>
+            <w:pPr>
+              <w:keepNext/>
+              <w:keepLines/>
+              <w:spacing w:line="276"/>
+              <w:jc w:val="center"/>
+            </w:pPr>
+            <w:r>
+              <w:rPr>
                 <w:b/>
                 <w:bCs/>
                 <w:sz w:val="19"/>
                 <w:szCs w:val="19"/>
               </w:rPr>
-              <w:t xml:space="preserve">0,9310 ± 0,0291</w:t>
+              <w:t xml:space="preserve">0,7559</w:t>
             </w:r>
           </w:p>
         </w:tc>
@@ -16767,13 +16801,13 @@
                 <w:sz w:val="19"/>
                 <w:szCs w:val="19"/>
               </w:rPr>
-              <w:t xml:space="preserve">0,7835</w:t>
-            </w:r>
-          </w:p>
-        </w:tc>
-        <w:tc>
-          <w:tcPr>
-            <w:tcW w:type="dxa" w:w="953"/>
+              <w:t xml:space="preserve">0,6440</w:t>
+            </w:r>
+          </w:p>
+        </w:tc>
+        <w:tc>
+          <w:tcPr>
+            <w:tcW w:type="dxa" w:w="1032"/>
             <w:tcBorders>
               <w:top w:val="single" w:color="808080" w:sz="4"/>
               <w:left w:val="single" w:color="808080" w:sz="4"/>
@@ -16801,13 +16835,13 @@
                 <w:sz w:val="19"/>
                 <w:szCs w:val="19"/>
               </w:rPr>
-              <w:t xml:space="preserve">0,6819</w:t>
-            </w:r>
-          </w:p>
-        </w:tc>
-        <w:tc>
-          <w:tcPr>
-            <w:tcW w:type="dxa" w:w="1032"/>
+              <w:t xml:space="preserve">0,8505</w:t>
+            </w:r>
+          </w:p>
+        </w:tc>
+        <w:tc>
+          <w:tcPr>
+            <w:tcW w:type="dxa" w:w="1031"/>
             <w:tcBorders>
               <w:top w:val="single" w:color="808080" w:sz="4"/>
               <w:left w:val="single" w:color="808080" w:sz="4"/>
@@ -16833,39 +16867,7 @@
                 <w:sz w:val="19"/>
                 <w:szCs w:val="19"/>
               </w:rPr>
-              <w:t xml:space="preserve">0,9021</w:t>
-            </w:r>
-          </w:p>
-        </w:tc>
-        <w:tc>
-          <w:tcPr>
-            <w:tcW w:type="dxa" w:w="1031"/>
-            <w:tcBorders>
-              <w:top w:val="single" w:color="808080" w:sz="4"/>
-              <w:left w:val="single" w:color="808080" w:sz="4"/>
-              <w:bottom w:val="single" w:color="808080" w:sz="4"/>
-              <w:right w:val="single" w:color="808080" w:sz="4"/>
-            </w:tcBorders>
-            <w:tcMar>
-              <w:top w:type="dxa" w:w="60"/>
-              <w:left w:type="dxa" w:w="100"/>
-              <w:bottom w:type="dxa" w:w="60"/>
-              <w:right w:type="dxa" w:w="100"/>
-            </w:tcMar>
-          </w:tcPr>
-          <w:p>
-            <w:pPr>
-              <w:keepNext/>
-              <w:keepLines/>
-              <w:spacing w:line="276"/>
-              <w:jc w:val="center"/>
-            </w:pPr>
-            <w:r>
-              <w:rPr>
-                <w:sz w:val="19"/>
-                <w:szCs w:val="19"/>
-              </w:rPr>
-              <w:t xml:space="preserve">0,3521</w:t>
+              <w:t xml:space="preserve">0,4477</w:t>
             </w:r>
           </w:p>
         </w:tc>
@@ -16931,142 +16933,140 @@
             </w:pPr>
             <w:r>
               <w:rPr>
-                <w:sz w:val="19"/>
-                <w:szCs w:val="19"/>
-              </w:rPr>
-              <w:t xml:space="preserve">0,9290 ± 0,0272</w:t>
-            </w:r>
-          </w:p>
-        </w:tc>
-        <w:tc>
-          <w:tcPr>
-            <w:tcW w:type="dxa" w:w="953"/>
-            <w:tcBorders>
-              <w:top w:val="single" w:color="808080" w:sz="4"/>
-              <w:left w:val="single" w:color="808080" w:sz="4"/>
-              <w:bottom w:val="single" w:color="808080" w:sz="4"/>
-              <w:right w:val="single" w:color="808080" w:sz="4"/>
-            </w:tcBorders>
-            <w:tcMar>
-              <w:top w:type="dxa" w:w="60"/>
-              <w:left w:type="dxa" w:w="100"/>
-              <w:bottom w:type="dxa" w:w="60"/>
-              <w:right w:type="dxa" w:w="100"/>
-            </w:tcMar>
-          </w:tcPr>
-          <w:p>
-            <w:pPr>
-              <w:keepNext/>
-              <w:keepLines/>
-              <w:spacing w:line="276"/>
-              <w:jc w:val="center"/>
-            </w:pPr>
-            <w:r>
-              <w:rPr>
-                <w:sz w:val="19"/>
-                <w:szCs w:val="19"/>
-              </w:rPr>
-              <w:t xml:space="preserve">0,7671</w:t>
-            </w:r>
-          </w:p>
-        </w:tc>
-        <w:tc>
-          <w:tcPr>
-            <w:tcW w:type="dxa" w:w="953"/>
-            <w:tcBorders>
-              <w:top w:val="single" w:color="808080" w:sz="4"/>
-              <w:left w:val="single" w:color="808080" w:sz="4"/>
-              <w:bottom w:val="single" w:color="808080" w:sz="4"/>
-              <w:right w:val="single" w:color="808080" w:sz="4"/>
-            </w:tcBorders>
-            <w:tcMar>
-              <w:top w:type="dxa" w:w="60"/>
-              <w:left w:type="dxa" w:w="100"/>
-              <w:bottom w:type="dxa" w:w="60"/>
-              <w:right w:type="dxa" w:w="100"/>
-            </w:tcMar>
-          </w:tcPr>
-          <w:p>
-            <w:pPr>
-              <w:keepNext/>
-              <w:keepLines/>
-              <w:spacing w:line="276"/>
-              <w:jc w:val="center"/>
-            </w:pPr>
-            <w:r>
-              <w:rPr>
-                <w:sz w:val="19"/>
-                <w:szCs w:val="19"/>
-              </w:rPr>
-              <w:t xml:space="preserve">0,6667</w:t>
-            </w:r>
-          </w:p>
-        </w:tc>
-        <w:tc>
-          <w:tcPr>
-            <w:tcW w:type="dxa" w:w="1032"/>
-            <w:tcBorders>
-              <w:top w:val="single" w:color="808080" w:sz="4"/>
-              <w:left w:val="single" w:color="808080" w:sz="4"/>
-              <w:bottom w:val="single" w:color="808080" w:sz="4"/>
-              <w:right w:val="single" w:color="808080" w:sz="4"/>
-            </w:tcBorders>
-            <w:tcMar>
-              <w:top w:type="dxa" w:w="60"/>
-              <w:left w:type="dxa" w:w="100"/>
-              <w:bottom w:type="dxa" w:w="60"/>
-              <w:right w:type="dxa" w:w="100"/>
-            </w:tcMar>
-          </w:tcPr>
-          <w:p>
-            <w:pPr>
-              <w:keepNext/>
-              <w:keepLines/>
-              <w:spacing w:line="276"/>
-              <w:jc w:val="center"/>
-            </w:pPr>
-            <w:r>
-              <w:rPr>
                 <w:b/>
                 <w:bCs/>
                 <w:sz w:val="19"/>
                 <w:szCs w:val="19"/>
               </w:rPr>
-              <w:t xml:space="preserve">0,9279</w:t>
-            </w:r>
-          </w:p>
-        </w:tc>
-        <w:tc>
-          <w:tcPr>
-            <w:tcW w:type="dxa" w:w="1031"/>
-            <w:tcBorders>
-              <w:top w:val="single" w:color="808080" w:sz="4"/>
-              <w:left w:val="single" w:color="808080" w:sz="4"/>
-              <w:bottom w:val="single" w:color="808080" w:sz="4"/>
-              <w:right w:val="single" w:color="808080" w:sz="4"/>
-            </w:tcBorders>
-            <w:tcMar>
-              <w:top w:type="dxa" w:w="60"/>
-              <w:left w:type="dxa" w:w="100"/>
-              <w:bottom w:type="dxa" w:w="60"/>
-              <w:right w:type="dxa" w:w="100"/>
-            </w:tcMar>
-          </w:tcPr>
-          <w:p>
-            <w:pPr>
-              <w:keepNext/>
-              <w:keepLines/>
-              <w:spacing w:line="276"/>
-              <w:jc w:val="center"/>
-            </w:pPr>
-            <w:r>
-              <w:rPr>
-                <w:b/>
-                <w:bCs/>
+              <w:t xml:space="preserve">0,9235 ± 0,0109</w:t>
+            </w:r>
+          </w:p>
+        </w:tc>
+        <w:tc>
+          <w:tcPr>
+            <w:tcW w:type="dxa" w:w="953"/>
+            <w:tcBorders>
+              <w:top w:val="single" w:color="808080" w:sz="4"/>
+              <w:left w:val="single" w:color="808080" w:sz="4"/>
+              <w:bottom w:val="single" w:color="808080" w:sz="4"/>
+              <w:right w:val="single" w:color="808080" w:sz="4"/>
+            </w:tcBorders>
+            <w:tcMar>
+              <w:top w:type="dxa" w:w="60"/>
+              <w:left w:type="dxa" w:w="100"/>
+              <w:bottom w:type="dxa" w:w="60"/>
+              <w:right w:type="dxa" w:w="100"/>
+            </w:tcMar>
+          </w:tcPr>
+          <w:p>
+            <w:pPr>
+              <w:keepNext/>
+              <w:keepLines/>
+              <w:spacing w:line="276"/>
+              <w:jc w:val="center"/>
+            </w:pPr>
+            <w:r>
+              <w:rPr>
                 <w:sz w:val="19"/>
                 <w:szCs w:val="19"/>
               </w:rPr>
-              <w:t xml:space="preserve">0,2353</w:t>
+              <w:t xml:space="preserve">0,7438</w:t>
+            </w:r>
+          </w:p>
+        </w:tc>
+        <w:tc>
+          <w:tcPr>
+            <w:tcW w:type="dxa" w:w="953"/>
+            <w:tcBorders>
+              <w:top w:val="single" w:color="808080" w:sz="4"/>
+              <w:left w:val="single" w:color="808080" w:sz="4"/>
+              <w:bottom w:val="single" w:color="808080" w:sz="4"/>
+              <w:right w:val="single" w:color="808080" w:sz="4"/>
+            </w:tcBorders>
+            <w:tcMar>
+              <w:top w:type="dxa" w:w="60"/>
+              <w:left w:type="dxa" w:w="100"/>
+              <w:bottom w:type="dxa" w:w="60"/>
+              <w:right w:type="dxa" w:w="100"/>
+            </w:tcMar>
+          </w:tcPr>
+          <w:p>
+            <w:pPr>
+              <w:keepNext/>
+              <w:keepLines/>
+              <w:spacing w:line="276"/>
+              <w:jc w:val="center"/>
+            </w:pPr>
+            <w:r>
+              <w:rPr>
+                <w:sz w:val="19"/>
+                <w:szCs w:val="19"/>
+              </w:rPr>
+              <w:t xml:space="preserve">0,6309</w:t>
+            </w:r>
+          </w:p>
+        </w:tc>
+        <w:tc>
+          <w:tcPr>
+            <w:tcW w:type="dxa" w:w="1032"/>
+            <w:tcBorders>
+              <w:top w:val="single" w:color="808080" w:sz="4"/>
+              <w:left w:val="single" w:color="808080" w:sz="4"/>
+              <w:bottom w:val="single" w:color="808080" w:sz="4"/>
+              <w:right w:val="single" w:color="808080" w:sz="4"/>
+            </w:tcBorders>
+            <w:tcMar>
+              <w:top w:type="dxa" w:w="60"/>
+              <w:left w:type="dxa" w:w="100"/>
+              <w:bottom w:type="dxa" w:w="60"/>
+              <w:right w:type="dxa" w:w="100"/>
+            </w:tcMar>
+          </w:tcPr>
+          <w:p>
+            <w:pPr>
+              <w:keepNext/>
+              <w:keepLines/>
+              <w:spacing w:line="276"/>
+              <w:jc w:val="center"/>
+            </w:pPr>
+            <w:r>
+              <w:rPr>
+                <w:sz w:val="19"/>
+                <w:szCs w:val="19"/>
+              </w:rPr>
+              <w:t xml:space="preserve">0,8323</w:t>
+            </w:r>
+          </w:p>
+        </w:tc>
+        <w:tc>
+          <w:tcPr>
+            <w:tcW w:type="dxa" w:w="1031"/>
+            <w:tcBorders>
+              <w:top w:val="single" w:color="808080" w:sz="4"/>
+              <w:left w:val="single" w:color="808080" w:sz="4"/>
+              <w:bottom w:val="single" w:color="808080" w:sz="4"/>
+              <w:right w:val="single" w:color="808080" w:sz="4"/>
+            </w:tcBorders>
+            <w:tcMar>
+              <w:top w:type="dxa" w:w="60"/>
+              <w:left w:type="dxa" w:w="100"/>
+              <w:bottom w:type="dxa" w:w="60"/>
+              <w:right w:type="dxa" w:w="100"/>
+            </w:tcMar>
+          </w:tcPr>
+          <w:p>
+            <w:pPr>
+              <w:keepNext/>
+              <w:keepLines/>
+              <w:spacing w:line="276"/>
+              <w:jc w:val="center"/>
+            </w:pPr>
+            <w:r>
+              <w:rPr>
+                <w:sz w:val="19"/>
+                <w:szCs w:val="19"/>
+              </w:rPr>
+              <w:t xml:space="preserve">0,3904</w:t>
             </w:r>
           </w:p>
         </w:tc>
@@ -17135,7 +17135,7 @@
                 <w:sz w:val="19"/>
                 <w:szCs w:val="19"/>
               </w:rPr>
-              <w:t xml:space="preserve">0,9233 ± 0,0362</w:t>
+              <w:t xml:space="preserve">0,8970 ± 0,0656</w:t>
             </w:r>
           </w:p>
         </w:tc>
@@ -17167,7 +17167,7 @@
                 <w:sz w:val="19"/>
                 <w:szCs w:val="19"/>
               </w:rPr>
-              <w:t xml:space="preserve">0,7725</w:t>
+              <w:t xml:space="preserve">0,7395</w:t>
             </w:r>
           </w:p>
         </w:tc>
@@ -17199,7 +17199,7 @@
                 <w:sz w:val="19"/>
                 <w:szCs w:val="19"/>
               </w:rPr>
-              <w:t xml:space="preserve">0,6471</w:t>
+              <w:t xml:space="preserve">0,5958</w:t>
             </w:r>
           </w:p>
         </w:tc>
@@ -17231,7 +17231,7 @@
                 <w:sz w:val="19"/>
                 <w:szCs w:val="19"/>
               </w:rPr>
-              <w:t xml:space="preserve">0,9171</w:t>
+              <w:t xml:space="preserve">0,7900</w:t>
             </w:r>
           </w:p>
         </w:tc>
@@ -17263,7 +17263,7 @@
                 <w:sz w:val="19"/>
                 <w:szCs w:val="19"/>
               </w:rPr>
-              <w:t xml:space="preserve">0,2561</w:t>
+              <w:t xml:space="preserve">0,3969</w:t>
             </w:r>
           </w:p>
         </w:tc>
@@ -17516,7 +17516,7 @@
                 <w:sz w:val="18"/>
                 <w:szCs w:val="18"/>
               </w:rPr>
-              <w:t xml:space="preserve">0,8788</w:t>
+              <w:t xml:space="preserve">0,8654</w:t>
             </w:r>
           </w:p>
         </w:tc>
@@ -17548,7 +17548,7 @@
                 <w:sz w:val="18"/>
                 <w:szCs w:val="18"/>
               </w:rPr>
-              <w:t xml:space="preserve">0,9147</w:t>
+              <w:t xml:space="preserve">0,9073</w:t>
             </w:r>
           </w:p>
         </w:tc>
@@ -17580,7 +17580,7 @@
                 <w:sz w:val="18"/>
                 <w:szCs w:val="18"/>
               </w:rPr>
-              <w:t xml:space="preserve">var_smoothing = 0,1 (4 fold); var_smoothing = 0,01 (1 fold)</w:t>
+              <w:t xml:space="preserve">var_smoothing = 0,1 (4 fold); var_smoothing = 10⁻³ (1 fold)</w:t>
             </w:r>
           </w:p>
         </w:tc>
@@ -17649,7 +17649,7 @@
                 <w:sz w:val="18"/>
                 <w:szCs w:val="18"/>
               </w:rPr>
-              <w:t xml:space="preserve">0,8742</w:t>
+              <w:t xml:space="preserve">0,8837</w:t>
             </w:r>
           </w:p>
         </w:tc>
@@ -17681,7 +17681,7 @@
                 <w:sz w:val="18"/>
                 <w:szCs w:val="18"/>
               </w:rPr>
-              <w:t xml:space="preserve">0,9095</w:t>
+              <w:t xml:space="preserve">0,8529</w:t>
             </w:r>
           </w:p>
         </w:tc>
@@ -17713,7 +17713,7 @@
                 <w:sz w:val="18"/>
                 <w:szCs w:val="18"/>
               </w:rPr>
-              <w:t xml:space="preserve">k = 31 (2 fold); k = 15 (2 fold); k = 5 (1 fold)</w:t>
+              <w:t xml:space="preserve">k = 51 (4 fold); k = 15 (1 fold)</w:t>
             </w:r>
           </w:p>
         </w:tc>
@@ -17782,7 +17782,7 @@
                 <w:sz w:val="18"/>
                 <w:szCs w:val="18"/>
               </w:rPr>
-              <w:t xml:space="preserve">0,9069</w:t>
+              <w:t xml:space="preserve">0,9201</w:t>
             </w:r>
           </w:p>
         </w:tc>
@@ -17814,7 +17814,7 @@
                 <w:sz w:val="18"/>
                 <w:szCs w:val="18"/>
               </w:rPr>
-              <w:t xml:space="preserve">0,9134</w:t>
+              <w:t xml:space="preserve">0,9138</w:t>
             </w:r>
           </w:p>
         </w:tc>
@@ -17846,7 +17846,7 @@
                 <w:sz w:val="18"/>
                 <w:szCs w:val="18"/>
               </w:rPr>
-              <w:t xml:space="preserve">C = 0,1 (4 fold); C = 10 (1 fold)</w:t>
+              <w:t xml:space="preserve">C = 0,1 (3 fold); C = 10 (1 fold); C = 1 (1 fold)</w:t>
             </w:r>
           </w:p>
         </w:tc>
@@ -17915,7 +17915,7 @@
                 <w:sz w:val="18"/>
                 <w:szCs w:val="18"/>
               </w:rPr>
-              <w:t xml:space="preserve">0,9310</w:t>
+              <w:t xml:space="preserve">0,9229</w:t>
             </w:r>
           </w:p>
         </w:tc>
@@ -17947,7 +17947,7 @@
                 <w:sz w:val="18"/>
                 <w:szCs w:val="18"/>
               </w:rPr>
-              <w:t xml:space="preserve">0,9310</w:t>
+              <w:t xml:space="preserve">0,9229</w:t>
             </w:r>
           </w:p>
         </w:tc>
@@ -18048,7 +18048,7 @@
                 <w:sz w:val="18"/>
                 <w:szCs w:val="18"/>
               </w:rPr>
-              <w:t xml:space="preserve">0,9299</w:t>
+              <w:t xml:space="preserve">0,9221</w:t>
             </w:r>
           </w:p>
         </w:tc>
@@ -18080,7 +18080,7 @@
                 <w:sz w:val="18"/>
                 <w:szCs w:val="18"/>
               </w:rPr>
-              <w:t xml:space="preserve">0,9290</w:t>
+              <w:t xml:space="preserve">0,9235</w:t>
             </w:r>
           </w:p>
         </w:tc>
@@ -18112,7 +18112,7 @@
                 <w:sz w:val="18"/>
                 <w:szCs w:val="18"/>
               </w:rPr>
-              <w:t xml:space="preserve">max_depth = 8, min_samples_leaf = 20 (3 fold); max_depth = 8, min_samples_leaf = 10 (1 fold); max_depth = 6, min_samples_leaf = 10 (1 fold)</w:t>
+              <w:t xml:space="preserve">max_depth = 8, min_samples_leaf = 20 (2 fold); max_depth = 12, min_samples_leaf = 10 (1 fold); max_depth = 6, min_samples_leaf = 10 (1 fold); max_depth = 8, min_samples_leaf = 10 (1 fold)</w:t>
             </w:r>
           </w:p>
         </w:tc>
@@ -18181,7 +18181,7 @@
                 <w:sz w:val="18"/>
                 <w:szCs w:val="18"/>
               </w:rPr>
-              <w:t xml:space="preserve">0,9222</w:t>
+              <w:t xml:space="preserve">0,8970</w:t>
             </w:r>
           </w:p>
         </w:tc>
@@ -18213,7 +18213,7 @@
                 <w:sz w:val="18"/>
                 <w:szCs w:val="18"/>
               </w:rPr>
-              <w:t xml:space="preserve">0,9233</w:t>
+              <w:t xml:space="preserve">0,8970</w:t>
             </w:r>
           </w:p>
         </w:tc>
@@ -18245,7 +18245,7 @@
                 <w:sz w:val="18"/>
                 <w:szCs w:val="18"/>
               </w:rPr>
-              <w:t xml:space="preserve">learning_rate = 0,05, max_depth = 4 (2 fold); learning_rate = 0,1, max_depth = 4 (1 fold); learning_rate = 0,1, max_depth = 6 (1 fold); learning_rate = 0,05, max_depth = 6 (1 fold)</w:t>
+              <w:t xml:space="preserve">learning_rate = 0,1, max_depth = 6 (3 fold); learning_rate = 0,1, max_depth = 4 (1 fold); learning_rate = 0,05, max_depth = 3 (1 fold)</w:t>
             </w:r>
           </w:p>
         </w:tc>
@@ -18330,10 +18330,10 @@
           <w:b/>
           <w:bCs/>
         </w:rPr>
-        <w:t xml:space="preserve">Model berbasis pohon tetap teratas:</w:t>
-      </w:r>
-      <w:r>
-        <w:t xml:space="preserve"> Decision Tree 93,10%, Random Forest 92,90%, dan XGBoost 92,33%. Selisih Decision Tree dengan acuan teori Markov Chain (93,68%) kurang dari 1 poin.</w:t>
+        <w:t xml:space="preserve">Random Forest dan Decision Tree teratas:</w:t>
+      </w:r>
+      <w:r>
+        <w:t xml:space="preserve"> Random Forest 92,35% dan Decision Tree 92,29%. Selisih Random Forest dengan acuan teori Markov Chain (92,64%) hanya 0,28 poin.</w:t>
       </w:r>
     </w:p>
     <w:p>
@@ -18351,10 +18351,10 @@
           <w:b/>
           <w:bCs/>
         </w:rPr>
-        <w:t xml:space="preserve">Grid search memperkecil jarak antaralgoritma.</w:t>
-      </w:r>
-      <w:r>
-        <w:t xml:space="preserve"> Dengan pengaturan awal, Naive Bayes (87,88%) dan KNN (87,42%) hampir sama dengan baseline (86,57%). Setelah hyperparameter dipilih ulang di setiap fold, akurasinya naik menjadi 91,47% dan 90,95%, sedangkan Logistic Regression naik dari 90,69% menjadi 91,34%.</w:t>
+        <w:t xml:space="preserve">Grid search tidak selalu membantu.</w:t>
+      </w:r>
+      <w:r>
+        <w:t xml:space="preserve"> Naive Bayes naik dari 86,54% menjadi 90,73%, tetapi KNN turun dari 88,37% menjadi 85,29% dan Logistic Regression turun dari 92,01% menjadi 91,38%. Pengaturan dipilih hanya dari data latih setiap fold; dengan data sekecil ini, pengaturan yang terbaik di data latih belum tentu terbaik di data uji.</w:t>
       </w:r>
     </w:p>
     <w:p>
@@ -18372,20 +18372,30 @@
           <w:b/>
           <w:bCs/>
         </w:rPr>
-        <w:t xml:space="preserve">KNN membutuhkan k yang jauh lebih kecil.</w:t>
-      </w:r>
-      <w:r>
-        <w:t xml:space="preserve"> Grid search memilih k = 5, 15, 31 sebagai pengganti k = 101. Data latih setiap fold hanya ±970 baris dengan ±130 kelas positif, sehingga 101 tetangga terdekat hampir selalu didominasi kelas mayoritas. Hal ini menunjukkan bahwa </w:t>
+        <w:t xml:space="preserve">KNN dan XGBoost tidak stabil.</w:t>
+      </w:r>
+      <w:r>
+        <w:t xml:space="preserve"> Pada fold ke-4, akurasi KNN hanya 64,9% dan XGBoost hanya 77,1%, sedangkan Decision Tree dan Random Forest pada fold yang sama 92,1% dan 92,1%. Data latih fold tersebut hanya memuat satu siklus Agent berstatus </w:t>
       </w:r>
       <w:r>
         <w:rPr>
           <w:i/>
           <w:iCs/>
         </w:rPr>
-        <w:t xml:space="preserve">hyperparameter</w:t>
-      </w:r>
-      <w:r>
-        <w:t xml:space="preserve"> perlu disesuaikan dengan ukuran data.</w:t>
+        <w:t xml:space="preserve">guaranteed</w:t>
+      </w:r>
+      <w:r>
+        <w:t xml:space="preserve">, yaitu siklus yang kebetulan mendapat S-Rank di pull ke-38. Dari satu siklus itu, KNN dan XGBoost mempelajari pola keliru "guaranteed berarti S-Rank segera keluar", lalu salah menebak "dapat S-Rank" pada dua siklus guaranteed lain di data uji yang ternyata panjang. Decision Tree dan Random Forest tidak terpengaruh karena aturan min_samples_leaf mencegah cabang yang hanya didukung sedikit data. Ini contoh </w:t>
+      </w:r>
+      <w:r>
+        <w:rPr>
+          <w:i/>
+          <w:iCs/>
+        </w:rPr>
+        <w:t xml:space="preserve">overfitting</w:t>
+      </w:r>
+      <w:r>
+        <w:t xml:space="preserve"> pada fitur yang tidak relevan ketika data sedikit.</w:t>
       </w:r>
     </w:p>
     <w:p>
@@ -18406,7 +18416,7 @@
         <w:t xml:space="preserve">Model pohon hampir tidak berubah.</w:t>
       </w:r>
       <w:r>
-        <w:t xml:space="preserve"> Pengaturan awal Decision Tree terpilih di kelima fold, sedangkan akurasi Random Forest dan XGBoost berubah kurang dari 0,2 poin. Artinya pengaturan awal model pohon sudah sesuai.</w:t>
+        <w:t xml:space="preserve"> Pengaturan awal Decision Tree terpilih di 5 dari 5 fold, dan akurasi Random Forest serta XGBoost berubah paling banyak 0,14 poin.</w:t>
       </w:r>
     </w:p>
     <w:p>
@@ -18427,7 +18437,7 @@
         <w:t xml:space="preserve">Akurasi naik, recall turun pada Naive Bayes.</w:t>
       </w:r>
       <w:r>
-        <w:t xml:space="preserve"> Grid search memilih var_smoothing yang besar sehingga Naive Bayes lebih jarang menebak "dapat S-Rank": akurasinya naik, tetapi recall turun dari 0,76 menjadi 0,42 dan Balanced Accuracy dari 0,8317 menjadi 0,7081. Hal ini terjadi karena grid search mengoptimalkan accuracy. Jika yang diutamakan adalah menangkap kelas minoritas, metrik pemilihan perlu diganti, misalnya dengan Balanced Accuracy.</w:t>
+        <w:t xml:space="preserve"> Grid search memilih var_smoothing yang besar sehingga Naive Bayes lebih jarang menebak "dapat S-Rank": akurasinya naik, tetapi recall turun dari 0,65 menjadi 0,36 dan Balanced Accuracy dari 0,7762 menjadi 0,6765. Hal ini terjadi karena grid search mengoptimalkan accuracy. Jika yang diutamakan adalah menangkap kelas minoritas, metrik pemilihan perlu diganti, misalnya dengan Balanced Accuracy.</w:t>
       </w:r>
     </w:p>
     <w:p>
@@ -18441,7 +18451,7 @@
         <w:jc w:val="both"/>
       </w:pPr>
       <w:r>
-        <w:t xml:space="preserve">Simpangan baku (±2,7–4,6%) jauh lebih besar daripada pada data simulasi (±0,1–0,2%) karena jumlah data asli jauh lebih sedikit.</w:t>
+        <w:t xml:space="preserve">Simpangan baku (±1,0–10,2%) jauh lebih besar daripada pada data simulasi (±0,1–0,2%) karena jumlah data asli jauh lebih sedikit.</w:t>
       </w:r>
     </w:p>
     <w:p>
@@ -18461,7 +18471,7 @@
         <w:jc w:val="both"/>
       </w:pPr>
       <w:r>
-        <w:t xml:space="preserve">Tabel 4.7 menunjukkan hasil uji t berpasangan terkoreksi (Subbab 2.7) pada tugas B. Setiap model dibandingkan dengan algoritma berakurasi rata-rata tertinggi sebelum dibulatkan, yaitu XGBoost pada data simulasi dan Decision Tree pada data asli. Selisih bernilai negatif berarti model tersebut lebih rendah daripada acuan, dan p-value bercetak tebal menandakan selisih yang signifikan (p &lt; 0,05).</w:t>
+        <w:t xml:space="preserve">Tabel 4.7 menunjukkan hasil uji t berpasangan terkoreksi (Subbab 2.7) pada tugas B. Setiap model dibandingkan dengan algoritma berakurasi rata-rata tertinggi sebelum dibulatkan, yaitu XGBoost pada data simulasi dan Random Forest pada data asli. Selisih bernilai negatif berarti model tersebut lebih rendah daripada acuan, dan p-value bercetak tebal menandakan selisih yang signifikan (p &lt; 0,05).</w:t>
       </w:r>
     </w:p>
     <w:p>
@@ -18642,7 +18652,7 @@
                 <w:sz w:val="19"/>
                 <w:szCs w:val="19"/>
               </w:rPr>
-              <w:t xml:space="preserve">Selisih dari Decision Tree (data asli)</w:t>
+              <w:t xml:space="preserve">Selisih dari Random Forest (data asli)</w:t>
             </w:r>
           </w:p>
         </w:tc>
@@ -18812,7 +18822,7 @@
                 <w:sz w:val="19"/>
                 <w:szCs w:val="19"/>
               </w:rPr>
-              <w:t xml:space="preserve">−6,53 poin</w:t>
+              <w:t xml:space="preserve">−5,90 poin</w:t>
             </w:r>
           </w:p>
         </w:tc>
@@ -18846,7 +18856,7 @@
                 <w:sz w:val="19"/>
                 <w:szCs w:val="19"/>
               </w:rPr>
-              <w:t xml:space="preserve">0,042</w:t>
+              <w:t xml:space="preserve">0,003</w:t>
             </w:r>
           </w:p>
         </w:tc>
@@ -18979,7 +18989,7 @@
                 <w:sz w:val="19"/>
                 <w:szCs w:val="19"/>
               </w:rPr>
-              <w:t xml:space="preserve">+0,58 poin</w:t>
+              <w:t xml:space="preserve">+0,28 poin</w:t>
             </w:r>
           </w:p>
         </w:tc>
@@ -19011,7 +19021,7 @@
                 <w:sz w:val="19"/>
                 <w:szCs w:val="19"/>
               </w:rPr>
-              <w:t xml:space="preserve">0,210</w:t>
+              <w:t xml:space="preserve">0,541</w:t>
             </w:r>
           </w:p>
         </w:tc>
@@ -19146,7 +19156,7 @@
                 <w:sz w:val="19"/>
                 <w:szCs w:val="19"/>
               </w:rPr>
-              <w:t xml:space="preserve">−1,63 poin</w:t>
+              <w:t xml:space="preserve">−1,62 poin</w:t>
             </w:r>
           </w:p>
         </w:tc>
@@ -19178,7 +19188,7 @@
                 <w:sz w:val="19"/>
                 <w:szCs w:val="19"/>
               </w:rPr>
-              <w:t xml:space="preserve">0,471</w:t>
+              <w:t xml:space="preserve">0,297</w:t>
             </w:r>
           </w:p>
         </w:tc>
@@ -19311,7 +19321,7 @@
                 <w:sz w:val="19"/>
                 <w:szCs w:val="19"/>
               </w:rPr>
-              <w:t xml:space="preserve">−2,15 poin</w:t>
+              <w:t xml:space="preserve">−7,06 poin</w:t>
             </w:r>
           </w:p>
         </w:tc>
@@ -19343,7 +19353,7 @@
                 <w:sz w:val="19"/>
                 <w:szCs w:val="19"/>
               </w:rPr>
-              <w:t xml:space="preserve">0,306</w:t>
+              <w:t xml:space="preserve">0,409</w:t>
             </w:r>
           </w:p>
         </w:tc>
@@ -19478,7 +19488,7 @@
                 <w:sz w:val="19"/>
                 <w:szCs w:val="19"/>
               </w:rPr>
-              <w:t xml:space="preserve">−1,76 poin</w:t>
+              <w:t xml:space="preserve">−0,98 poin</w:t>
             </w:r>
           </w:p>
         </w:tc>
@@ -19510,7 +19520,7 @@
                 <w:sz w:val="19"/>
                 <w:szCs w:val="19"/>
               </w:rPr>
-              <w:t xml:space="preserve">0,497</w:t>
+              <w:t xml:space="preserve">0,193</w:t>
             </w:r>
           </w:p>
         </w:tc>
@@ -19643,7 +19653,7 @@
                 <w:sz w:val="19"/>
                 <w:szCs w:val="19"/>
               </w:rPr>
-              <w:t xml:space="preserve">acuan</w:t>
+              <w:t xml:space="preserve">−0,07 poin</w:t>
             </w:r>
           </w:p>
         </w:tc>
@@ -19675,7 +19685,7 @@
                 <w:sz w:val="19"/>
                 <w:szCs w:val="19"/>
               </w:rPr>
-              <w:t xml:space="preserve">–</w:t>
+              <w:t xml:space="preserve">0,802</w:t>
             </w:r>
           </w:p>
         </w:tc>
@@ -19808,7 +19818,7 @@
                 <w:sz w:val="19"/>
                 <w:szCs w:val="19"/>
               </w:rPr>
-              <w:t xml:space="preserve">−0,21 poin</w:t>
+              <w:t xml:space="preserve">acuan</w:t>
             </w:r>
           </w:p>
         </w:tc>
@@ -19840,7 +19850,7 @@
                 <w:sz w:val="19"/>
                 <w:szCs w:val="19"/>
               </w:rPr>
-              <w:t xml:space="preserve">0,745</w:t>
+              <w:t xml:space="preserve">–</w:t>
             </w:r>
           </w:p>
         </w:tc>
@@ -19973,7 +19983,7 @@
                 <w:sz w:val="19"/>
                 <w:szCs w:val="19"/>
               </w:rPr>
-              <w:t xml:space="preserve">−0,77 poin</w:t>
+              <w:t xml:space="preserve">−2,66 poin</w:t>
             </w:r>
           </w:p>
         </w:tc>
@@ -20005,7 +20015,7 @@
                 <w:sz w:val="19"/>
                 <w:szCs w:val="19"/>
               </w:rPr>
-              <w:t xml:space="preserve">0,616</w:t>
+              <w:t xml:space="preserve">0,601</w:t>
             </w:r>
           </w:p>
         </w:tc>
@@ -20051,7 +20061,7 @@
         <w:t xml:space="preserve">Data asli:</w:t>
       </w:r>
       <w:r>
-        <w:t xml:space="preserve"> hanya baseline yang nyata lebih rendah daripada Decision Tree (p = 0,042). Selisih Decision Tree dengan kelima algoritma lain (0,21–2,15 poin) tidak signifikan (p = 0,31–0,75).</w:t>
+        <w:t xml:space="preserve"> hanya baseline yang nyata lebih rendah daripada Random Forest (p = 0,003). Selisih Random Forest dengan kelima algoritma lain (0,07–7,06 poin) tidak signifikan (p = 0,19–0,80).</w:t>
       </w:r>
     </w:p>
     <w:p>
@@ -20065,7 +20075,7 @@
         <w:jc w:val="both"/>
       </w:pPr>
       <w:r>
-        <w:t xml:space="preserve">Dengan 20 siklus pity yang dibagi menjadi 5 fold, data asli belum cukup untuk membuktikan bahwa satu algoritma benar-benar lebih unggul daripada yang lain. Yang dapat disimpulkan dengan yakin adalah Decision Tree lebih baik daripada baseline, sedangkan urutan keenam algoritma pada data asli masih mungkin berubah jika data bertambah.</w:t>
+        <w:t xml:space="preserve">Dengan 25 siklus pity yang dibagi menjadi 5 fold, data asli belum cukup untuk membuktikan bahwa satu algoritma benar-benar lebih unggul daripada yang lain. Yang dapat disimpulkan dengan yakin adalah Random Forest lebih baik daripada baseline, sedangkan urutan keenam algoritma pada data asli masih mungkin berubah jika data bertambah.</w:t>
       </w:r>
     </w:p>
     <w:p>
@@ -20438,7 +20448,7 @@
                 <w:sz w:val="20"/>
                 <w:szCs w:val="20"/>
               </w:rPr>
-              <w:t xml:space="preserve">788</w:t>
+              <w:t xml:space="preserve">916</w:t>
             </w:r>
           </w:p>
         </w:tc>
@@ -20470,7 +20480,7 @@
                 <w:sz w:val="20"/>
                 <w:szCs w:val="20"/>
               </w:rPr>
-              <w:t xml:space="preserve">4</w:t>
+              <w:t xml:space="preserve">5</w:t>
             </w:r>
           </w:p>
         </w:tc>
@@ -20635,7 +20645,7 @@
                 <w:sz w:val="20"/>
                 <w:szCs w:val="20"/>
               </w:rPr>
-              <w:t xml:space="preserve">107</w:t>
+              <w:t xml:space="preserve">119</w:t>
             </w:r>
           </w:p>
         </w:tc>
@@ -20667,7 +20677,7 @@
                 <w:sz w:val="20"/>
                 <w:szCs w:val="20"/>
               </w:rPr>
-              <w:t xml:space="preserve">1</w:t>
+              <w:t xml:space="preserve">2</w:t>
             </w:r>
           </w:p>
         </w:tc>
@@ -20699,7 +20709,7 @@
                 <w:sz w:val="20"/>
                 <w:szCs w:val="20"/>
               </w:rPr>
-              <w:t xml:space="preserve">0,9%</w:t>
+              <w:t xml:space="preserve">1,7%</w:t>
             </w:r>
           </w:p>
         </w:tc>
@@ -21230,7 +21240,7 @@
                 <w:sz w:val="20"/>
                 <w:szCs w:val="20"/>
               </w:rPr>
-              <w:t xml:space="preserve">260</w:t>
+              <w:t xml:space="preserve">354</w:t>
             </w:r>
           </w:p>
         </w:tc>
@@ -21262,7 +21272,7 @@
                 <w:sz w:val="20"/>
                 <w:szCs w:val="20"/>
               </w:rPr>
-              <w:t xml:space="preserve">1</w:t>
+              <w:t xml:space="preserve">3</w:t>
             </w:r>
           </w:p>
         </w:tc>
@@ -21294,7 +21304,7 @@
                 <w:sz w:val="20"/>
                 <w:szCs w:val="20"/>
               </w:rPr>
-              <w:t xml:space="preserve">0,4%</w:t>
+              <w:t xml:space="preserve">0,8%</w:t>
             </w:r>
           </w:p>
         </w:tc>
@@ -21810,7 +21820,7 @@
         <w:t xml:space="preserve">Agent:</w:t>
       </w:r>
       <w:r>
-        <w:t xml:space="preserve"> laju S-Rank hampir nol sampai pull ke-73 (5 S-Rank dari 895 pull), lalu melonjak menjadi 14,3% pada pull ke-74–78 dan 37,5% pada pull ke-79–90. Pola ini sangat dekat dengan model Markov yang memakai estimasi soft pity pull ke-74.</w:t>
+        <w:t xml:space="preserve"> laju S-Rank hampir nol sampai pull ke-73 (7 S-Rank dari 1.035 pull), lalu melonjak menjadi 14,3% pada pull ke-74–78 dan 37,5% pada pull ke-79–90. Pola ini sangat dekat dengan model Markov yang memakai estimasi soft pity pull ke-74.</w:t>
       </w:r>
     </w:p>
     <w:p>
@@ -21831,7 +21841,7 @@
         <w:t xml:space="preserve">W-Engine:</w:t>
       </w:r>
       <w:r>
-        <w:t xml:space="preserve"> tidak ada S-Rank antara pull ke-21 dan ke-65, lalu 4 dari 11 pull pada pull ke-65 ke atas menghasilkan S-Rank (36,4%), lebih tinggi daripada model (12,0%). Hal ini mengisyaratkan bahwa peluang W-Engine setelah soft pity mungkin naik lebih cepat daripada asumsi, tetapi datanya masih terlalu sedikit untuk disimpulkan.</w:t>
+        <w:t xml:space="preserve"> sebelum pull ke-65 hanya 3 S-Rank dari 390 pull (0,8%), lalu 4 dari 11 pull pada pull ke-65 ke atas menghasilkan S-Rank (36,4%), lebih tinggi daripada model (12,0%). Hal ini mengisyaratkan bahwa peluang W-Engine setelah soft pity mungkin naik lebih cepat daripada asumsi, tetapi datanya masih terlalu sedikit untuk disimpulkan.</w:t>
       </w:r>
     </w:p>
     <w:p>
@@ -21855,7 +21865,7 @@
         <w:t xml:space="preserve">hanya dengan data asli</w:t>
       </w:r>
       <w:r>
-        <w:t xml:space="preserve"> (max_depth 6, min_samples_leaf 50, pengaturan yang terpilih di setiap fold nested CV) memisahkan data pertama kali (akar pohon) pada pity_ratio 0,735, yaitu pity ±66 untuk Agent dan ±59 untuk W-Engine. Titik ini sekitar 8–10 pull sebelum soft pity, sama seperti Decision Tree yang dilatih dengan data simulasi (pity_ratio 0,71–0,74).</w:t>
+        <w:t xml:space="preserve"> (max_depth 6, min_samples_leaf 50, pengaturan yang terpilih di setiap fold nested CV) memisahkan data pertama kali (akar pohon) pada pity_ratio 0,724, yaitu pity ±65 untuk Agent dan ±58 untuk W-Engine. Titik ini sekitar 8–10 pull sebelum soft pity, sama seperti Decision Tree yang dilatih dengan data simulasi (pity_ratio 0,71–0,74).</w:t>
       </w:r>
     </w:p>
     <w:p>
@@ -21931,7 +21941,7 @@
         <w:t xml:space="preserve">Algoritma terbaik.</w:t>
       </w:r>
       <w:r>
-        <w:t xml:space="preserve"> Pada tugas B, Decision Tree, Random Forest, XGBoost, dan KNN mencapai akurasi ±91,1% di simulasi dan ±93,1–93,4% di data asli. Pada data simulasi, nilai ini sama dengan batas atas teori (Markov Chain) dan perbedaan di antara keempatnya tidak signifikan, sehingga keempat algoritma tersebut sudah bekerja maksimal.</w:t>
+        <w:t xml:space="preserve"> Pada tugas B, Decision Tree, Random Forest, XGBoost, dan KNN mencapai akurasi ±91,1% di simulasi dan ±92,3–92,5% di data asli. Pada data simulasi, nilai ini sama dengan batas atas teori (Markov Chain) dan perbedaan di antara keempatnya tidak signifikan, sehingga keempat algoritma tersebut sudah bekerja maksimal.</w:t>
       </w:r>
     </w:p>
     <w:p>
@@ -21952,7 +21962,7 @@
         <w:t xml:space="preserve">Model pohon menemukan soft pity sendiri.</w:t>
       </w:r>
       <w:r>
-        <w:t xml:space="preserve"> Aturan Decision Tree memisahkan data di sekitar pity_ratio 0,71–0,74 pada data simulasi dan 0,735 pada data asli, yaitu sekitar 10 pull sebelum soft pity, tepat saat jendela 10 pull ke depan mulai menyentuh soft pity. Model tidak pernah diberi tahu tentang soft pity (Gambar 4.10).</w:t>
+        <w:t xml:space="preserve"> Aturan Decision Tree memisahkan data di sekitar pity_ratio 0,71–0,74 pada data simulasi dan 0,724 pada data asli, yaitu sekitar 10 pull sebelum soft pity, tepat saat jendela 10 pull ke depan mulai menyentuh soft pity. Model tidak pernah diberi tahu tentang soft pity (Gambar 4.10).</w:t>
       </w:r>
     </w:p>
     <w:p>
@@ -21991,10 +22001,10 @@
           <w:b/>
           <w:bCs/>
         </w:rPr>
-        <w:t xml:space="preserve">KNN setara model pohon</w:t>
-      </w:r>
-      <w:r>
-        <w:t xml:space="preserve"> karena fiturnya sedikit dan nilainya berulang, sehingga tetangga terdekat praktis adalah pull dengan pity yang sama. Kelemahannya, KNN menyimpan seluruh data latih, paling lambat saat prediksi, dan nilai k harus disesuaikan dengan ukuran data (Subbab 4.6).</w:t>
+        <w:t xml:space="preserve">KNN setara model pohon pada data simulasi</w:t>
+      </w:r>
+      <w:r>
+        <w:t xml:space="preserve"> karena fiturnya sedikit dan nilainya berulang, sehingga tetangga terdekat praktis adalah pull dengan pity yang sama. Kelemahannya, KNN menyimpan seluruh data latih, paling lambat saat prediksi, dan tidak stabil pada data asli yang kecil (Subbab 4.6).</w:t>
       </w:r>
     </w:p>
     <w:p>
@@ -22015,7 +22025,7 @@
         <w:t xml:space="preserve">Fitur guaranteed hampir tidak berpengaruh</w:t>
       </w:r>
       <w:r>
-        <w:t xml:space="preserve"> (Gambar 4.11). Hal ini sesuai aturan permainan: guaranteed hanya menentukan S-Rank mana yang keluar, bukan kapan S-Rank keluar.</w:t>
+        <w:t xml:space="preserve"> pada model yang dilatih dengan data simulasi (Gambar 4.11). Hal ini sesuai aturan permainan: guaranteed hanya menentukan S-Rank mana yang keluar, bukan kapan S-Rank keluar. Namun pada data asli yang kecil, fitur ini justru dapat menyesatkan KNN dan XGBoost ketika siklus guaranteed di data latih hanya sedikit (Subbab 4.6).</w:t>
       </w:r>
     </w:p>
     <w:p>
@@ -22036,7 +22046,7 @@
         <w:t xml:space="preserve">Konsisten pada data asli.</w:t>
       </w:r>
       <w:r>
-        <w:t xml:space="preserve"> Urutan kinerja algoritma pada data asli sama dengan pada simulasi, dan laju S-Rank per pull pada data asli mengikuti model Markov (Subbab 4.8). Artinya, asumsi soft pity yang dipakai simulasi tidak bertentangan dengan perilaku gacha sungguhan, dengan catatan data asli baru berasal dari 2 akun.</w:t>
+        <w:t xml:space="preserve"> Urutan kinerja algoritma pada data asli sama dengan pada simulasi, dan laju S-Rank per pull pada data asli mengikuti model Markov (Subbab 4.8). Artinya, asumsi soft pity yang dipakai simulasi tidak bertentangan dengan perilaku gacha sungguhan, dengan catatan data asli baru berasal dari 3 akun.</w:t>
       </w:r>
     </w:p>
     <w:p>
@@ -22057,7 +22067,7 @@
         <w:t xml:space="preserve">Tidak bergantung pada simulasi.</w:t>
       </w:r>
       <w:r>
-        <w:t xml:space="preserve"> Ketika dilatih dan diuji dengan data asli saja (1.209 baris), model berbasis pohon tetap tertinggi (92,3–93,1%), walaupun selisihnya dengan algoritma lain belum signifikan. Kesimpulan penelitian tidak berubah walaupun data simulasi tidak dipakai sama sekali.</w:t>
+        <w:t xml:space="preserve"> Ketika dilatih dan diuji dengan data asli saja (1.425 baris), Random Forest dan Decision Tree tetap tertinggi (92,3–92,4%), walaupun selisihnya dengan algoritma lain belum signifikan. Kesimpulan penelitian tidak berubah walaupun data simulasi tidak dipakai sama sekali.</w:t>
       </w:r>
     </w:p>
     <w:p>
@@ -22078,7 +22088,7 @@
         <w:t xml:space="preserve">Pengaruh grid search.</w:t>
       </w:r>
       <w:r>
-        <w:t xml:space="preserve"> Grid search paling berpengaruh pada algoritma yang pengaturan awalnya tidak cocok dengan data, yaitu Naive Bayes dan KNN pada data asli, sedangkan model berbasis pohon hampir tidak berubah. Kesimpulan tentang algoritma terbaik tidak berubah setelah grid search.</w:t>
+        <w:t xml:space="preserve"> Grid search paling berpengaruh pada Naive Bayes, yang pengaturan awalnya tidak cocok dengan data, sedangkan model berbasis pohon hampir tidak berubah. Pada data asli yang kecil, grid search di dalam setiap fold tidak selalu memilih pengaturan yang lebih baik, sehingga hasilnya perlu dibaca bersama simpangan bakunya. Kesimpulan tentang algoritma terbaik tidak berubah setelah grid search.</w:t>
       </w:r>
     </w:p>
     <w:p>
@@ -22292,7 +22302,7 @@
         <w:jc w:val="both"/>
       </w:pPr>
       <w:r>
-        <w:t xml:space="preserve">Untuk memprediksi S-Rank dalam 10 pull berikutnya, Decision Tree, Random Forest, XGBoost, dan KNN memberikan akurasi tertinggi dan tidak berbeda nyata satu sama lain (±91,1% pada simulasi, ±93,1–93,4% pada data asli), hampir menyamai acuan teori. Naive Bayes (89,2%) dan Logistic Regression (88,9%) nyata lebih rendah pada data simulasi walaupun hyperparameter-nya sudah dipilih dengan grid search. Saat dilatih dan diuji hanya dengan data asli (1.209 baris), Decision Tree memperoleh akurasi tertinggi (93,10%), tetapi selisihnya dengan kelima algoritma lain belum signifikan karena data asli baru 20 siklus pity.</w:t>
+        <w:t xml:space="preserve">Untuk memprediksi S-Rank dalam 10 pull berikutnya, Decision Tree, Random Forest, XGBoost, dan KNN memberikan akurasi tertinggi dan tidak berbeda nyata satu sama lain (±91,1% pada simulasi, ±92,3–92,5% pada data asli), hampir menyamai acuan teori. Naive Bayes (89,2%) dan Logistic Regression (88,9%) nyata lebih rendah pada data simulasi walaupun hyperparameter-nya sudah dipilih dengan grid search. Saat dilatih dan diuji hanya dengan data asli (1.425 baris), Random Forest memperoleh akurasi tertinggi (92,35%), tetapi selisihnya dengan kelima algoritma lain belum signifikan karena data asli baru 25 siklus pity.</w:t>
       </w:r>
     </w:p>
     <w:p>
@@ -22306,7 +22316,7 @@
         <w:jc w:val="both"/>
       </w:pPr>
       <w:r>
-        <w:t xml:space="preserve">Grid search terutama memperbaiki algoritma yang pengaturan awalnya tidak cocok dengan data (Naive Bayes, dan KNN pada data asli yang kecil), tetapi tidak mengubah kesimpulan tentang algoritma terbaik.</w:t>
+        <w:t xml:space="preserve">Grid search terutama memperbaiki Naive Bayes. Pada data asli yang kecil, hasil grid search tidak selalu lebih baik, dan algoritma yang fleksibel seperti KNN dapat mempelajari pola keliru dari fitur guaranteed; kesimpulan tentang algoritma terbaik tidak berubah.</w:t>
       </w:r>
     </w:p>
     <w:p>
@@ -22372,7 +22382,21 @@
         <w:jc w:val="both"/>
       </w:pPr>
       <w:r>
-        <w:t xml:space="preserve">Data asli baru berasal dari 2 akun (22 S-Rank, 20 siklus pity). Baris-baris dalam satu siklus saling berkaitan, sehingga informasi yang sebenarnya lebih sedikit daripada jumlah baris, dan simpangan baku hasilnya masih ±2,7–4,6%. Akibatnya, uji signifikansi pada data asli memiliki daya uji yang rendah: selisih kecil antaralgoritma sulit dibuktikan walaupun mungkin ada.</w:t>
+        <w:t xml:space="preserve">Data asli baru berasal dari 3 akun (28 S-Rank, 25 siklus pity). Baris-baris dalam satu siklus saling berkaitan, sehingga informasi yang sebenarnya lebih sedikit daripada jumlah baris, dan simpangan baku hasilnya masih ±1,0–10,2%. Akibatnya, uji signifikansi pada data asli memiliki daya uji yang rendah: selisih kecil antaralgoritma sulit dibuktikan walaupun mungkin ada.</w:t>
+      </w:r>
+    </w:p>
+    <w:p>
+      <w:pPr>
+        <w:pStyle w:val="ListParagraph"/>
+        <w:numPr>
+          <w:ilvl w:val="0"/>
+          <w:numId w:val="3"/>
+        </w:numPr>
+        <w:spacing w:after="60" w:line="360"/>
+        <w:jc w:val="both"/>
+      </w:pPr>
+      <w:r>
+        <w:t xml:space="preserve">Siklus berstatus guaranteed pada data asli masih sangat sedikit, sehingga algoritma yang fleksibel seperti KNN dan XGBoost dapat mempelajari pola keliru dari fitur guaranteed (Subbab 4.6).</w:t>
       </w:r>
     </w:p>
     <w:p>

</xml_diff>

<commit_message>
Rapatkan sampul agar muat satu halaman dan tambah versi PDF
- Sampul proposal dan laporan memakai spasi 1,15 dan jarak antarblok yang
  lebih hemat, menyisakan ±22% ruang kosong, sehingga tidak terpotong ke
  halaman kedua saat dibuka di Word, WPS, atau Google Docs.
- build.sh menyimpan PDF hasil render terakhir di docs/tugas/, jadi PDF selalu
  sama dengan .docx-nya.
</commit_message>
<xml_diff>
--- a/docs/tugas/UAS_Laporan_Akhir_Kelompok6_A11.4502.docx
+++ b/docs/tugas/UAS_Laporan_Akhir_Kelompok6_A11.4502.docx
@@ -4,7 +4,7 @@
   <w:body>
     <w:p>
       <w:pPr>
-        <w:spacing w:after="120" w:before="600" w:line="360"/>
+        <w:spacing w:after="120" w:before="0" w:line="276"/>
         <w:jc w:val="center"/>
       </w:pPr>
       <w:r>
@@ -19,7 +19,7 @@
     </w:p>
     <w:p>
       <w:pPr>
-        <w:spacing w:after="240" w:before="360" w:line="360"/>
+        <w:spacing w:after="240" w:before="240" w:line="276"/>
         <w:jc w:val="center"/>
       </w:pPr>
       <w:r>
@@ -40,7 +40,7 @@
       <w:r>
         <w:drawing>
           <wp:inline distT="0" distB="0" distL="0" distR="0">
-            <wp:extent cx="1428750" cy="1428750"/>
+            <wp:extent cx="1285875" cy="1285875"/>
             <wp:effectExtent t="0" r="0" b="0" l="0"/>
             <wp:docPr id="1" name="logo_udinus" descr="Logo Universitas Dian Nuswantoro" title="Logo Universitas Dian Nuswantoro"/>
             <wp:cNvGraphicFramePr>
@@ -65,7 +65,7 @@
                   <pic:spPr bwMode="auto">
                     <a:xfrm>
                       <a:off x="0" y="0"/>
-                      <a:ext cx="1428750" cy="1428750"/>
+                      <a:ext cx="1285875" cy="1285875"/>
                     </a:xfrm>
                     <a:prstGeom prst="rect">
                       <a:avLst/>
@@ -80,7 +80,7 @@
     </w:p>
     <w:p>
       <w:pPr>
-        <w:spacing w:after="120" w:before="0" w:line="360"/>
+        <w:spacing w:after="0" w:before="0" w:line="276"/>
         <w:jc w:val="center"/>
       </w:pPr>
       <w:r>
@@ -89,7 +89,7 @@
     </w:p>
     <w:p>
       <w:pPr>
-        <w:spacing w:after="360" w:before="0" w:line="360"/>
+        <w:spacing w:after="240" w:before="0" w:line="276"/>
         <w:jc w:val="center"/>
       </w:pPr>
       <w:r>
@@ -105,7 +105,7 @@
     </w:p>
     <w:p>
       <w:pPr>
-        <w:spacing w:after="240" w:before="0" w:line="360"/>
+        <w:spacing w:after="160" w:before="0" w:line="276"/>
         <w:jc w:val="center"/>
       </w:pPr>
       <w:r>
@@ -765,7 +765,7 @@
     </w:tbl>
     <w:p>
       <w:pPr>
-        <w:spacing w:after="0" w:before="480" w:line="360"/>
+        <w:spacing w:after="0" w:before="360" w:line="276"/>
         <w:jc w:val="center"/>
       </w:pPr>
       <w:r>
@@ -774,7 +774,7 @@
     </w:p>
     <w:p>
       <w:pPr>
-        <w:spacing w:after="720" w:before="0" w:line="360"/>
+        <w:spacing w:after="480" w:before="0" w:line="276"/>
         <w:jc w:val="center"/>
       </w:pPr>
       <w:r>
@@ -787,7 +787,7 @@
     </w:p>
     <w:p>
       <w:pPr>
-        <w:spacing w:after="0" w:before="0" w:line="360"/>
+        <w:spacing w:after="0" w:before="0" w:line="276"/>
         <w:jc w:val="center"/>
       </w:pPr>
       <w:r>
@@ -800,7 +800,7 @@
     </w:p>
     <w:p>
       <w:pPr>
-        <w:spacing w:after="0" w:before="0" w:line="360"/>
+        <w:spacing w:after="0" w:before="0" w:line="276"/>
         <w:jc w:val="center"/>
       </w:pPr>
       <w:r>
@@ -813,7 +813,7 @@
     </w:p>
     <w:p>
       <w:pPr>
-        <w:spacing w:after="0" w:before="0" w:line="360"/>
+        <w:spacing w:after="0" w:before="0" w:line="276"/>
         <w:jc w:val="center"/>
       </w:pPr>
       <w:r>
@@ -826,7 +826,7 @@
     </w:p>
     <w:p>
       <w:pPr>
-        <w:spacing w:after="0" w:before="0" w:line="360"/>
+        <w:spacing w:after="0" w:before="0" w:line="276"/>
         <w:jc w:val="center"/>
       </w:pPr>
       <w:r>
@@ -839,7 +839,7 @@
     </w:p>
     <w:p>
       <w:pPr>
-        <w:spacing w:after="0" w:before="0" w:line="360"/>
+        <w:spacing w:after="0" w:before="0" w:line="276"/>
         <w:jc w:val="center"/>
       </w:pPr>
       <w:r>

</xml_diff>

<commit_message>
Ubah proposal UTS mengikuti format contoh proposal dari dosen
Proposal kini dibuat oleh proposal.js: kertas Letter, margin 3 cm, sampul
PENYUSUN, Ringkasan dan Kata Kunci, Bab I 1.1-1.5 (termasuk Pembaruan dan
Peta Jalan), Bab II 2.1-2.7 (Telaah Studi Pustaka, Target Capaian, Anggota
Tim), jadwal 14 minggu, dan pustaka bernomor. gen.js kini khusus laporan UAS.

Slide UTS ikut disesuaikan: slide kebaruan, penelitian terdahulu, dan peta
jalan 14 minggu. Judul sampul tidak lagi saling menimpa di LibreOffice.
</commit_message>
<xml_diff>
--- a/docs/tugas/UAS_Laporan_Akhir_Kelompok6_A11.4502.docx
+++ b/docs/tugas/UAS_Laporan_Akhir_Kelompok6_A11.4502.docx
@@ -4,8 +4,12 @@
   <w:body>
     <w:p>
       <w:pPr>
-        <w:spacing w:after="120" w:before="0" w:line="276"/>
+        <w:spacing w:after="120" w:before="0" w:line="276" w:lineRule="auto"/>
         <w:jc w:val="center"/>
+        <w:rPr>
+          <w:sz w:val="32"/>
+          <w:szCs w:val="32"/>
+        </w:rPr>
       </w:pPr>
       <w:r>
         <w:rPr>
@@ -19,8 +23,12 @@
     </w:p>
     <w:p>
       <w:pPr>
-        <w:spacing w:after="240" w:before="240" w:line="276"/>
+        <w:spacing w:after="240" w:before="240" w:line="276" w:lineRule="auto"/>
         <w:jc w:val="center"/>
+        <w:rPr>
+          <w:sz w:val="28"/>
+          <w:szCs w:val="28"/>
+        </w:rPr>
       </w:pPr>
       <w:r>
         <w:rPr>
@@ -80,7 +88,7 @@
     </w:p>
     <w:p>
       <w:pPr>
-        <w:spacing w:after="0" w:before="0" w:line="276"/>
+        <w:spacing w:after="0" w:before="0" w:line="276" w:lineRule="auto"/>
         <w:jc w:val="center"/>
       </w:pPr>
       <w:r>
@@ -89,7 +97,7 @@
     </w:p>
     <w:p>
       <w:pPr>
-        <w:spacing w:after="240" w:before="0" w:line="276"/>
+        <w:spacing w:after="240" w:before="0" w:line="276" w:lineRule="auto"/>
         <w:jc w:val="center"/>
       </w:pPr>
       <w:r>
@@ -105,7 +113,7 @@
     </w:p>
     <w:p>
       <w:pPr>
-        <w:spacing w:after="160" w:before="0" w:line="276"/>
+        <w:spacing w:after="160" w:before="0" w:line="276" w:lineRule="auto"/>
         <w:jc w:val="center"/>
       </w:pPr>
       <w:r>
@@ -765,7 +773,7 @@
     </w:tbl>
     <w:p>
       <w:pPr>
-        <w:spacing w:after="0" w:before="360" w:line="276"/>
+        <w:spacing w:after="0" w:before="360" w:line="276" w:lineRule="auto"/>
         <w:jc w:val="center"/>
       </w:pPr>
       <w:r>
@@ -774,7 +782,7 @@
     </w:p>
     <w:p>
       <w:pPr>
-        <w:spacing w:after="480" w:before="0" w:line="276"/>
+        <w:spacing w:after="480" w:before="0" w:line="276" w:lineRule="auto"/>
         <w:jc w:val="center"/>
       </w:pPr>
       <w:r>
@@ -787,7 +795,7 @@
     </w:p>
     <w:p>
       <w:pPr>
-        <w:spacing w:after="0" w:before="0" w:line="276"/>
+        <w:spacing w:after="0" w:before="0" w:line="276" w:lineRule="auto"/>
         <w:jc w:val="center"/>
       </w:pPr>
       <w:r>
@@ -800,7 +808,7 @@
     </w:p>
     <w:p>
       <w:pPr>
-        <w:spacing w:after="0" w:before="0" w:line="276"/>
+        <w:spacing w:after="0" w:before="0" w:line="276" w:lineRule="auto"/>
         <w:jc w:val="center"/>
       </w:pPr>
       <w:r>
@@ -813,7 +821,7 @@
     </w:p>
     <w:p>
       <w:pPr>
-        <w:spacing w:after="0" w:before="0" w:line="276"/>
+        <w:spacing w:after="0" w:before="0" w:line="276" w:lineRule="auto"/>
         <w:jc w:val="center"/>
       </w:pPr>
       <w:r>
@@ -826,7 +834,7 @@
     </w:p>
     <w:p>
       <w:pPr>
-        <w:spacing w:after="0" w:before="0" w:line="276"/>
+        <w:spacing w:after="0" w:before="0" w:line="276" w:lineRule="auto"/>
         <w:jc w:val="center"/>
       </w:pPr>
       <w:r>
@@ -839,7 +847,7 @@
     </w:p>
     <w:p>
       <w:pPr>
-        <w:spacing w:after="0" w:before="0" w:line="276"/>
+        <w:spacing w:after="0" w:before="0" w:line="276" w:lineRule="auto"/>
         <w:jc w:val="center"/>
       </w:pPr>
       <w:r>

</xml_diff>

<commit_message>
Pakai nama lengkap anggota di semua dokumen
Nama lengkap dipakai di proposal, laporan, kedua slide, README, LAPORAN.md,
LICENSE, dan NOTICE. Kolom nama di sampul, tabel anggota, dan slide tim
dilebarkan supaya nama tidak terpotong, dan kolom kegiatan di jadwal
dilebarkan supaya setiap kegiatan muat satu baris.
</commit_message>
<xml_diff>
--- a/docs/tugas/UAS_Laporan_Akhir_Kelompok6_A11.4502.docx
+++ b/docs/tugas/UAS_Laporan_Akhir_Kelompok6_A11.4502.docx
@@ -139,7 +139,7 @@
     </w:p>
     <w:tbl>
       <w:tblPr>
-        <w:tblW w:type="dxa" w:w="7600"/>
+        <w:tblW w:type="dxa" w:w="7938"/>
         <w:tblBorders>
           <w:top w:val="single" w:color="auto" w:sz="4"/>
           <w:left w:val="single" w:color="auto" w:sz="4"/>
@@ -150,9 +150,9 @@
         </w:tblBorders>
       </w:tblPr>
       <w:tblGrid>
-        <w:gridCol w:w="1976"/>
-        <w:gridCol w:w="2432"/>
-        <w:gridCol w:w="3192"/>
+        <w:gridCol w:w="1746"/>
+        <w:gridCol w:w="3016"/>
+        <w:gridCol w:w="3176"/>
       </w:tblGrid>
       <w:tr>
         <w:trPr>
@@ -161,7 +161,7 @@
         </w:trPr>
         <w:tc>
           <w:tcPr>
-            <w:tcW w:type="dxa" w:w="1976"/>
+            <w:tcW w:type="dxa" w:w="1746"/>
             <w:tcBorders>
               <w:top w:val="single" w:color="808080" w:sz="4"/>
               <w:left w:val="single" w:color="808080" w:sz="4"/>
@@ -187,8 +187,8 @@
               <w:rPr>
                 <w:b/>
                 <w:bCs/>
-                <w:sz w:val="22"/>
-                <w:szCs w:val="22"/>
+                <w:sz w:val="21"/>
+                <w:szCs w:val="21"/>
               </w:rPr>
               <w:t xml:space="preserve">NIM</w:t>
             </w:r>
@@ -196,7 +196,7 @@
         </w:tc>
         <w:tc>
           <w:tcPr>
-            <w:tcW w:type="dxa" w:w="2432"/>
+            <w:tcW w:type="dxa" w:w="3016"/>
             <w:tcBorders>
               <w:top w:val="single" w:color="808080" w:sz="4"/>
               <w:left w:val="single" w:color="808080" w:sz="4"/>
@@ -222,8 +222,8 @@
               <w:rPr>
                 <w:b/>
                 <w:bCs/>
-                <w:sz w:val="22"/>
-                <w:szCs w:val="22"/>
+                <w:sz w:val="21"/>
+                <w:szCs w:val="21"/>
               </w:rPr>
               <w:t xml:space="preserve">Nama</w:t>
             </w:r>
@@ -231,7 +231,7 @@
         </w:tc>
         <w:tc>
           <w:tcPr>
-            <w:tcW w:type="dxa" w:w="3192"/>
+            <w:tcW w:type="dxa" w:w="3176"/>
             <w:tcBorders>
               <w:top w:val="single" w:color="808080" w:sz="4"/>
               <w:left w:val="single" w:color="808080" w:sz="4"/>
@@ -257,8 +257,8 @@
               <w:rPr>
                 <w:b/>
                 <w:bCs/>
-                <w:sz w:val="22"/>
-                <w:szCs w:val="22"/>
+                <w:sz w:val="21"/>
+                <w:szCs w:val="21"/>
               </w:rPr>
               <w:t xml:space="preserve">Peran</w:t>
             </w:r>
@@ -271,7 +271,7 @@
         </w:trPr>
         <w:tc>
           <w:tcPr>
-            <w:tcW w:type="dxa" w:w="1976"/>
+            <w:tcW w:type="dxa" w:w="1746"/>
             <w:tcBorders>
               <w:top w:val="single" w:color="808080" w:sz="4"/>
               <w:left w:val="single" w:color="808080" w:sz="4"/>
@@ -294,8 +294,8 @@
             </w:pPr>
             <w:r>
               <w:rPr>
-                <w:sz w:val="22"/>
-                <w:szCs w:val="22"/>
+                <w:sz w:val="21"/>
+                <w:szCs w:val="21"/>
               </w:rPr>
               <w:t xml:space="preserve">A11.2024.16004</w:t>
             </w:r>
@@ -303,7 +303,7 @@
         </w:tc>
         <w:tc>
           <w:tcPr>
-            <w:tcW w:type="dxa" w:w="2432"/>
+            <w:tcW w:type="dxa" w:w="3016"/>
             <w:tcBorders>
               <w:top w:val="single" w:color="808080" w:sz="4"/>
               <w:left w:val="single" w:color="808080" w:sz="4"/>
@@ -326,8 +326,8 @@
             </w:pPr>
             <w:r>
               <w:rPr>
-                <w:sz w:val="22"/>
-                <w:szCs w:val="22"/>
+                <w:sz w:val="21"/>
+                <w:szCs w:val="21"/>
               </w:rPr>
               <w:t xml:space="preserve">Syafiq Yahya</w:t>
             </w:r>
@@ -335,7 +335,7 @@
         </w:tc>
         <w:tc>
           <w:tcPr>
-            <w:tcW w:type="dxa" w:w="3192"/>
+            <w:tcW w:type="dxa" w:w="3176"/>
             <w:tcBorders>
               <w:top w:val="single" w:color="808080" w:sz="4"/>
               <w:left w:val="single" w:color="808080" w:sz="4"/>
@@ -358,8 +358,8 @@
             </w:pPr>
             <w:r>
               <w:rPr>
-                <w:sz w:val="22"/>
-                <w:szCs w:val="22"/>
+                <w:sz w:val="21"/>
+                <w:szCs w:val="21"/>
               </w:rPr>
               <w:t xml:space="preserve">Ketua kelompok, presentasi hasil</w:t>
             </w:r>
@@ -372,7 +372,7 @@
         </w:trPr>
         <w:tc>
           <w:tcPr>
-            <w:tcW w:type="dxa" w:w="1976"/>
+            <w:tcW w:type="dxa" w:w="1746"/>
             <w:tcBorders>
               <w:top w:val="single" w:color="808080" w:sz="4"/>
               <w:left w:val="single" w:color="808080" w:sz="4"/>
@@ -395,8 +395,8 @@
             </w:pPr>
             <w:r>
               <w:rPr>
-                <w:sz w:val="22"/>
-                <w:szCs w:val="22"/>
+                <w:sz w:val="21"/>
+                <w:szCs w:val="21"/>
               </w:rPr>
               <w:t xml:space="preserve">A11.2024.15851</w:t>
             </w:r>
@@ -404,7 +404,7 @@
         </w:tc>
         <w:tc>
           <w:tcPr>
-            <w:tcW w:type="dxa" w:w="2432"/>
+            <w:tcW w:type="dxa" w:w="3016"/>
             <w:tcBorders>
               <w:top w:val="single" w:color="808080" w:sz="4"/>
               <w:left w:val="single" w:color="808080" w:sz="4"/>
@@ -427,16 +427,16 @@
             </w:pPr>
             <w:r>
               <w:rPr>
-                <w:sz w:val="22"/>
-                <w:szCs w:val="22"/>
-              </w:rPr>
-              <w:t xml:space="preserve">Dafi Hauzan A.H</w:t>
-            </w:r>
-          </w:p>
-        </w:tc>
-        <w:tc>
-          <w:tcPr>
-            <w:tcW w:type="dxa" w:w="3192"/>
+                <w:sz w:val="21"/>
+                <w:szCs w:val="21"/>
+              </w:rPr>
+              <w:t xml:space="preserve">Dafi Hauzan Atsillah Hoenarko</w:t>
+            </w:r>
+          </w:p>
+        </w:tc>
+        <w:tc>
+          <w:tcPr>
+            <w:tcW w:type="dxa" w:w="3176"/>
             <w:tcBorders>
               <w:top w:val="single" w:color="808080" w:sz="4"/>
               <w:left w:val="single" w:color="808080" w:sz="4"/>
@@ -459,8 +459,8 @@
             </w:pPr>
             <w:r>
               <w:rPr>
-                <w:sz w:val="22"/>
-                <w:szCs w:val="22"/>
+                <w:sz w:val="21"/>
+                <w:szCs w:val="21"/>
               </w:rPr>
               <w:t xml:space="preserve">Pengembang aplikasi, pengumpulan dan pengujian data</w:t>
             </w:r>
@@ -473,7 +473,7 @@
         </w:trPr>
         <w:tc>
           <w:tcPr>
-            <w:tcW w:type="dxa" w:w="1976"/>
+            <w:tcW w:type="dxa" w:w="1746"/>
             <w:tcBorders>
               <w:top w:val="single" w:color="808080" w:sz="4"/>
               <w:left w:val="single" w:color="808080" w:sz="4"/>
@@ -496,8 +496,8 @@
             </w:pPr>
             <w:r>
               <w:rPr>
-                <w:sz w:val="22"/>
-                <w:szCs w:val="22"/>
+                <w:sz w:val="21"/>
+                <w:szCs w:val="21"/>
               </w:rPr>
               <w:t xml:space="preserve">A11.2024.15842</w:t>
             </w:r>
@@ -505,7 +505,7 @@
         </w:tc>
         <w:tc>
           <w:tcPr>
-            <w:tcW w:type="dxa" w:w="2432"/>
+            <w:tcW w:type="dxa" w:w="3016"/>
             <w:tcBorders>
               <w:top w:val="single" w:color="808080" w:sz="4"/>
               <w:left w:val="single" w:color="808080" w:sz="4"/>
@@ -528,16 +528,16 @@
             </w:pPr>
             <w:r>
               <w:rPr>
-                <w:sz w:val="22"/>
-                <w:szCs w:val="22"/>
-              </w:rPr>
-              <w:t xml:space="preserve">Gastiadirrijal Rafi M</w:t>
-            </w:r>
-          </w:p>
-        </w:tc>
-        <w:tc>
-          <w:tcPr>
-            <w:tcW w:type="dxa" w:w="3192"/>
+                <w:sz w:val="21"/>
+                <w:szCs w:val="21"/>
+              </w:rPr>
+              <w:t xml:space="preserve">Gastiadirrijal Rafi Maulana</w:t>
+            </w:r>
+          </w:p>
+        </w:tc>
+        <w:tc>
+          <w:tcPr>
+            <w:tcW w:type="dxa" w:w="3176"/>
             <w:tcBorders>
               <w:top w:val="single" w:color="808080" w:sz="4"/>
               <w:left w:val="single" w:color="808080" w:sz="4"/>
@@ -560,8 +560,8 @@
             </w:pPr>
             <w:r>
               <w:rPr>
-                <w:sz w:val="22"/>
-                <w:szCs w:val="22"/>
+                <w:sz w:val="21"/>
+                <w:szCs w:val="21"/>
               </w:rPr>
               <w:t xml:space="preserve">Penyusun slide presentasi</w:t>
             </w:r>
@@ -574,7 +574,7 @@
         </w:trPr>
         <w:tc>
           <w:tcPr>
-            <w:tcW w:type="dxa" w:w="1976"/>
+            <w:tcW w:type="dxa" w:w="1746"/>
             <w:tcBorders>
               <w:top w:val="single" w:color="808080" w:sz="4"/>
               <w:left w:val="single" w:color="808080" w:sz="4"/>
@@ -597,8 +597,8 @@
             </w:pPr>
             <w:r>
               <w:rPr>
-                <w:sz w:val="22"/>
-                <w:szCs w:val="22"/>
+                <w:sz w:val="21"/>
+                <w:szCs w:val="21"/>
               </w:rPr>
               <w:t xml:space="preserve">A11.2024.15826</w:t>
             </w:r>
@@ -606,7 +606,7 @@
         </w:tc>
         <w:tc>
           <w:tcPr>
-            <w:tcW w:type="dxa" w:w="2432"/>
+            <w:tcW w:type="dxa" w:w="3016"/>
             <w:tcBorders>
               <w:top w:val="single" w:color="808080" w:sz="4"/>
               <w:left w:val="single" w:color="808080" w:sz="4"/>
@@ -629,16 +629,16 @@
             </w:pPr>
             <w:r>
               <w:rPr>
-                <w:sz w:val="22"/>
-                <w:szCs w:val="22"/>
-              </w:rPr>
-              <w:t xml:space="preserve">Zabrina Miftah Z</w:t>
-            </w:r>
-          </w:p>
-        </w:tc>
-        <w:tc>
-          <w:tcPr>
-            <w:tcW w:type="dxa" w:w="3192"/>
+                <w:sz w:val="21"/>
+                <w:szCs w:val="21"/>
+              </w:rPr>
+              <w:t xml:space="preserve">Zabrina Miftah Zulaikha</w:t>
+            </w:r>
+          </w:p>
+        </w:tc>
+        <w:tc>
+          <w:tcPr>
+            <w:tcW w:type="dxa" w:w="3176"/>
             <w:tcBorders>
               <w:top w:val="single" w:color="808080" w:sz="4"/>
               <w:left w:val="single" w:color="808080" w:sz="4"/>
@@ -661,8 +661,8 @@
             </w:pPr>
             <w:r>
               <w:rPr>
-                <w:sz w:val="22"/>
-                <w:szCs w:val="22"/>
+                <w:sz w:val="21"/>
+                <w:szCs w:val="21"/>
               </w:rPr>
               <w:t xml:space="preserve">Penyusun proposal dan laporan</w:t>
             </w:r>
@@ -675,7 +675,7 @@
         </w:trPr>
         <w:tc>
           <w:tcPr>
-            <w:tcW w:type="dxa" w:w="1976"/>
+            <w:tcW w:type="dxa" w:w="1746"/>
             <w:tcBorders>
               <w:top w:val="single" w:color="808080" w:sz="4"/>
               <w:left w:val="single" w:color="808080" w:sz="4"/>
@@ -698,8 +698,8 @@
             </w:pPr>
             <w:r>
               <w:rPr>
-                <w:sz w:val="22"/>
-                <w:szCs w:val="22"/>
+                <w:sz w:val="21"/>
+                <w:szCs w:val="21"/>
               </w:rPr>
               <w:t xml:space="preserve">A11.2024.15804</w:t>
             </w:r>
@@ -707,7 +707,7 @@
         </w:tc>
         <w:tc>
           <w:tcPr>
-            <w:tcW w:type="dxa" w:w="2432"/>
+            <w:tcW w:type="dxa" w:w="3016"/>
             <w:tcBorders>
               <w:top w:val="single" w:color="808080" w:sz="4"/>
               <w:left w:val="single" w:color="808080" w:sz="4"/>
@@ -730,8 +730,8 @@
             </w:pPr>
             <w:r>
               <w:rPr>
-                <w:sz w:val="22"/>
-                <w:szCs w:val="22"/>
+                <w:sz w:val="21"/>
+                <w:szCs w:val="21"/>
               </w:rPr>
               <w:t xml:space="preserve">Rayya Hasya Tamimi</w:t>
             </w:r>
@@ -739,7 +739,7 @@
         </w:tc>
         <w:tc>
           <w:tcPr>
-            <w:tcW w:type="dxa" w:w="3192"/>
+            <w:tcW w:type="dxa" w:w="3176"/>
             <w:tcBorders>
               <w:top w:val="single" w:color="808080" w:sz="4"/>
               <w:left w:val="single" w:color="808080" w:sz="4"/>
@@ -762,8 +762,8 @@
             </w:pPr>
             <w:r>
               <w:rPr>
-                <w:sz w:val="22"/>
-                <w:szCs w:val="22"/>
+                <w:sz w:val="21"/>
+                <w:szCs w:val="21"/>
               </w:rPr>
               <w:t xml:space="preserve">Penyusun proposal dan laporan</w:t>
             </w:r>

</xml_diff>